<commit_message>
Swagger, VS Code, Visual Studio, phpMyAdmin felvitel
</commit_message>
<xml_diff>
--- a/Lakberendezés_Dokumentum.docx
+++ b/Lakberendezés_Dokumentum.docx
@@ -4314,6 +4314,2991 @@
           <w:szCs w:val="20"/>
         </w:rPr>
       </w:pPr>
+      <w:r>
+        <w:rPr>
+          <w:rFonts w:ascii="Times New Roman" w:hAnsi="Times New Roman" w:cs="Times New Roman"/>
+          <w:sz w:val="20"/>
+          <w:szCs w:val="20"/>
+        </w:rPr>
+        <w:lastRenderedPageBreak/>
+        <w:t>Visual Studio Code fejlesztőeszköz összefoglaló</w:t>
+      </w:r>
+    </w:p>
+    <w:p>
+      <w:pPr>
+        <w:rPr>
+          <w:rFonts w:ascii="Times New Roman" w:hAnsi="Times New Roman" w:cs="Times New Roman"/>
+          <w:sz w:val="20"/>
+          <w:szCs w:val="20"/>
+        </w:rPr>
+      </w:pPr>
+    </w:p>
+    <w:p>
+      <w:pPr>
+        <w:rPr>
+          <w:rFonts w:ascii="Times New Roman" w:hAnsi="Times New Roman" w:cs="Times New Roman"/>
+          <w:sz w:val="20"/>
+          <w:szCs w:val="20"/>
+        </w:rPr>
+      </w:pPr>
+      <w:r>
+        <w:rPr>
+          <w:rFonts w:ascii="Times New Roman" w:hAnsi="Times New Roman" w:cs="Times New Roman"/>
+          <w:sz w:val="20"/>
+          <w:szCs w:val="20"/>
+        </w:rPr>
+        <w:t xml:space="preserve"> Bevezetés</w:t>
+      </w:r>
+    </w:p>
+    <w:p>
+      <w:pPr>
+        <w:rPr>
+          <w:rFonts w:ascii="Times New Roman" w:hAnsi="Times New Roman" w:cs="Times New Roman"/>
+          <w:sz w:val="20"/>
+          <w:szCs w:val="20"/>
+        </w:rPr>
+      </w:pPr>
+    </w:p>
+    <w:p>
+      <w:pPr>
+        <w:rPr>
+          <w:rFonts w:ascii="Times New Roman" w:hAnsi="Times New Roman" w:cs="Times New Roman"/>
+          <w:sz w:val="20"/>
+          <w:szCs w:val="20"/>
+        </w:rPr>
+      </w:pPr>
+      <w:r>
+        <w:rPr>
+          <w:rFonts w:ascii="Times New Roman" w:hAnsi="Times New Roman" w:cs="Times New Roman"/>
+          <w:sz w:val="20"/>
+          <w:szCs w:val="20"/>
+        </w:rPr>
+        <w:t>A Visual Studio Code egy nyílt forráskódú, platformfüggetlen kódszerkesztő, amely kiterjedt bővítmény-rendszerrel és integrált fejlesztői eszközökkel rendelkezik.</w:t>
+      </w:r>
+    </w:p>
+    <w:p>
+      <w:pPr>
+        <w:rPr>
+          <w:rFonts w:ascii="Times New Roman" w:hAnsi="Times New Roman" w:cs="Times New Roman"/>
+          <w:sz w:val="20"/>
+          <w:szCs w:val="20"/>
+        </w:rPr>
+      </w:pPr>
+    </w:p>
+    <w:p>
+      <w:pPr>
+        <w:rPr>
+          <w:rFonts w:ascii="Times New Roman" w:hAnsi="Times New Roman" w:cs="Times New Roman"/>
+          <w:sz w:val="20"/>
+          <w:szCs w:val="20"/>
+        </w:rPr>
+      </w:pPr>
+      <w:r>
+        <w:rPr>
+          <w:rFonts w:ascii="Times New Roman" w:hAnsi="Times New Roman" w:cs="Times New Roman"/>
+          <w:sz w:val="20"/>
+          <w:szCs w:val="20"/>
+        </w:rPr>
+        <w:t>Működési alapelvek</w:t>
+      </w:r>
+    </w:p>
+    <w:p>
+      <w:pPr>
+        <w:rPr>
+          <w:rFonts w:ascii="Times New Roman" w:hAnsi="Times New Roman" w:cs="Times New Roman"/>
+          <w:sz w:val="20"/>
+          <w:szCs w:val="20"/>
+        </w:rPr>
+      </w:pPr>
+    </w:p>
+    <w:p>
+      <w:pPr>
+        <w:rPr>
+          <w:rFonts w:ascii="Times New Roman" w:hAnsi="Times New Roman" w:cs="Times New Roman"/>
+          <w:sz w:val="20"/>
+          <w:szCs w:val="20"/>
+        </w:rPr>
+      </w:pPr>
+      <w:proofErr w:type="spellStart"/>
+      <w:r>
+        <w:rPr>
+          <w:rFonts w:ascii="Times New Roman" w:hAnsi="Times New Roman" w:cs="Times New Roman"/>
+          <w:sz w:val="20"/>
+          <w:szCs w:val="20"/>
+        </w:rPr>
+        <w:t>Electron</w:t>
+      </w:r>
+      <w:proofErr w:type="spellEnd"/>
+      <w:r>
+        <w:rPr>
+          <w:rFonts w:ascii="Times New Roman" w:hAnsi="Times New Roman" w:cs="Times New Roman"/>
+          <w:sz w:val="20"/>
+          <w:szCs w:val="20"/>
+        </w:rPr>
+        <w:t>-alapú alkalmazásként fut, amely kombinál egy hatékony szövegszerkesztőt fejlett fejlesztői eszközökkel és bővítmény-rendszerrel.</w:t>
+      </w:r>
+    </w:p>
+    <w:p>
+      <w:pPr>
+        <w:rPr>
+          <w:rFonts w:ascii="Times New Roman" w:hAnsi="Times New Roman" w:cs="Times New Roman"/>
+          <w:sz w:val="20"/>
+          <w:szCs w:val="20"/>
+        </w:rPr>
+      </w:pPr>
+    </w:p>
+    <w:p>
+      <w:pPr>
+        <w:rPr>
+          <w:rFonts w:ascii="Times New Roman" w:hAnsi="Times New Roman" w:cs="Times New Roman"/>
+          <w:sz w:val="20"/>
+          <w:szCs w:val="20"/>
+        </w:rPr>
+      </w:pPr>
+      <w:r>
+        <w:rPr>
+          <w:rFonts w:ascii="Times New Roman" w:hAnsi="Times New Roman" w:cs="Times New Roman"/>
+          <w:sz w:val="20"/>
+          <w:szCs w:val="20"/>
+        </w:rPr>
+        <w:t xml:space="preserve"> Technológiai háttér</w:t>
+      </w:r>
+    </w:p>
+    <w:p>
+      <w:pPr>
+        <w:rPr>
+          <w:rFonts w:ascii="Times New Roman" w:hAnsi="Times New Roman" w:cs="Times New Roman"/>
+          <w:sz w:val="20"/>
+          <w:szCs w:val="20"/>
+        </w:rPr>
+      </w:pPr>
+    </w:p>
+    <w:p>
+      <w:pPr>
+        <w:rPr>
+          <w:rFonts w:ascii="Times New Roman" w:hAnsi="Times New Roman" w:cs="Times New Roman"/>
+          <w:sz w:val="20"/>
+          <w:szCs w:val="20"/>
+        </w:rPr>
+      </w:pPr>
+      <w:r>
+        <w:rPr>
+          <w:rFonts w:ascii="Times New Roman" w:hAnsi="Times New Roman" w:cs="Times New Roman"/>
+          <w:sz w:val="20"/>
+          <w:szCs w:val="20"/>
+        </w:rPr>
+        <w:t>Működési elemek:</w:t>
+      </w:r>
+    </w:p>
+    <w:p>
+      <w:pPr>
+        <w:rPr>
+          <w:rFonts w:ascii="Times New Roman" w:hAnsi="Times New Roman" w:cs="Times New Roman"/>
+          <w:sz w:val="20"/>
+          <w:szCs w:val="20"/>
+        </w:rPr>
+      </w:pPr>
+      <w:r>
+        <w:rPr>
+          <w:rFonts w:ascii="Times New Roman" w:hAnsi="Times New Roman" w:cs="Times New Roman"/>
+          <w:sz w:val="20"/>
+          <w:szCs w:val="20"/>
+        </w:rPr>
+        <w:t>1. Beépített nyelvi támogatás</w:t>
+      </w:r>
+    </w:p>
+    <w:p>
+      <w:pPr>
+        <w:rPr>
+          <w:rFonts w:ascii="Times New Roman" w:hAnsi="Times New Roman" w:cs="Times New Roman"/>
+          <w:sz w:val="20"/>
+          <w:szCs w:val="20"/>
+        </w:rPr>
+      </w:pPr>
+      <w:r>
+        <w:rPr>
+          <w:rFonts w:ascii="Times New Roman" w:hAnsi="Times New Roman" w:cs="Times New Roman"/>
+          <w:sz w:val="20"/>
+          <w:szCs w:val="20"/>
+        </w:rPr>
+        <w:t xml:space="preserve">2. </w:t>
+      </w:r>
+      <w:proofErr w:type="spellStart"/>
+      <w:r>
+        <w:rPr>
+          <w:rFonts w:ascii="Times New Roman" w:hAnsi="Times New Roman" w:cs="Times New Roman"/>
+          <w:sz w:val="20"/>
+          <w:szCs w:val="20"/>
+        </w:rPr>
+        <w:t>IntelliSense</w:t>
+      </w:r>
+      <w:proofErr w:type="spellEnd"/>
+      <w:r>
+        <w:rPr>
+          <w:rFonts w:ascii="Times New Roman" w:hAnsi="Times New Roman" w:cs="Times New Roman"/>
+          <w:sz w:val="20"/>
+          <w:szCs w:val="20"/>
+        </w:rPr>
+        <w:t xml:space="preserve"> kódkiegészítés</w:t>
+      </w:r>
+    </w:p>
+    <w:p>
+      <w:pPr>
+        <w:rPr>
+          <w:rFonts w:ascii="Times New Roman" w:hAnsi="Times New Roman" w:cs="Times New Roman"/>
+          <w:sz w:val="20"/>
+          <w:szCs w:val="20"/>
+        </w:rPr>
+      </w:pPr>
+      <w:r>
+        <w:rPr>
+          <w:rFonts w:ascii="Times New Roman" w:hAnsi="Times New Roman" w:cs="Times New Roman"/>
+          <w:sz w:val="20"/>
+          <w:szCs w:val="20"/>
+        </w:rPr>
+        <w:t xml:space="preserve">3. Beépített </w:t>
+      </w:r>
+      <w:proofErr w:type="spellStart"/>
+      <w:r>
+        <w:rPr>
+          <w:rFonts w:ascii="Times New Roman" w:hAnsi="Times New Roman" w:cs="Times New Roman"/>
+          <w:sz w:val="20"/>
+          <w:szCs w:val="20"/>
+        </w:rPr>
+        <w:t>Git</w:t>
+      </w:r>
+      <w:proofErr w:type="spellEnd"/>
+      <w:r>
+        <w:rPr>
+          <w:rFonts w:ascii="Times New Roman" w:hAnsi="Times New Roman" w:cs="Times New Roman"/>
+          <w:sz w:val="20"/>
+          <w:szCs w:val="20"/>
+        </w:rPr>
+        <w:t xml:space="preserve"> integráció</w:t>
+      </w:r>
+    </w:p>
+    <w:p>
+      <w:pPr>
+        <w:rPr>
+          <w:rFonts w:ascii="Times New Roman" w:hAnsi="Times New Roman" w:cs="Times New Roman"/>
+          <w:sz w:val="20"/>
+          <w:szCs w:val="20"/>
+        </w:rPr>
+      </w:pPr>
+      <w:r>
+        <w:rPr>
+          <w:rFonts w:ascii="Times New Roman" w:hAnsi="Times New Roman" w:cs="Times New Roman"/>
+          <w:sz w:val="20"/>
+          <w:szCs w:val="20"/>
+        </w:rPr>
+        <w:t>4. Integrált terminál</w:t>
+      </w:r>
+    </w:p>
+    <w:p>
+      <w:pPr>
+        <w:rPr>
+          <w:rFonts w:ascii="Times New Roman" w:hAnsi="Times New Roman" w:cs="Times New Roman"/>
+          <w:sz w:val="20"/>
+          <w:szCs w:val="20"/>
+        </w:rPr>
+      </w:pPr>
+      <w:r>
+        <w:rPr>
+          <w:rFonts w:ascii="Times New Roman" w:hAnsi="Times New Roman" w:cs="Times New Roman"/>
+          <w:sz w:val="20"/>
+          <w:szCs w:val="20"/>
+        </w:rPr>
+        <w:t xml:space="preserve">5. </w:t>
+      </w:r>
+      <w:proofErr w:type="spellStart"/>
+      <w:r>
+        <w:rPr>
+          <w:rFonts w:ascii="Times New Roman" w:hAnsi="Times New Roman" w:cs="Times New Roman"/>
+          <w:sz w:val="20"/>
+          <w:szCs w:val="20"/>
+        </w:rPr>
+        <w:t>Debug</w:t>
+      </w:r>
+      <w:proofErr w:type="spellEnd"/>
+      <w:r>
+        <w:rPr>
+          <w:rFonts w:ascii="Times New Roman" w:hAnsi="Times New Roman" w:cs="Times New Roman"/>
+          <w:sz w:val="20"/>
+          <w:szCs w:val="20"/>
+        </w:rPr>
+        <w:t xml:space="preserve"> funkcionalitás</w:t>
+      </w:r>
+    </w:p>
+    <w:p>
+      <w:pPr>
+        <w:rPr>
+          <w:rFonts w:ascii="Times New Roman" w:hAnsi="Times New Roman" w:cs="Times New Roman"/>
+          <w:sz w:val="20"/>
+          <w:szCs w:val="20"/>
+        </w:rPr>
+      </w:pPr>
+    </w:p>
+    <w:p>
+      <w:pPr>
+        <w:rPr>
+          <w:rFonts w:ascii="Times New Roman" w:hAnsi="Times New Roman" w:cs="Times New Roman"/>
+          <w:sz w:val="20"/>
+          <w:szCs w:val="20"/>
+        </w:rPr>
+      </w:pPr>
+      <w:r>
+        <w:rPr>
+          <w:rFonts w:ascii="Times New Roman" w:hAnsi="Times New Roman" w:cs="Times New Roman"/>
+          <w:sz w:val="20"/>
+          <w:szCs w:val="20"/>
+        </w:rPr>
+        <w:t>Alapvető funkcionalitás</w:t>
+      </w:r>
+    </w:p>
+    <w:p>
+      <w:pPr>
+        <w:rPr>
+          <w:rFonts w:ascii="Times New Roman" w:hAnsi="Times New Roman" w:cs="Times New Roman"/>
+          <w:sz w:val="20"/>
+          <w:szCs w:val="20"/>
+        </w:rPr>
+      </w:pPr>
+    </w:p>
+    <w:p>
+      <w:pPr>
+        <w:rPr>
+          <w:rFonts w:ascii="Times New Roman" w:hAnsi="Times New Roman" w:cs="Times New Roman"/>
+          <w:sz w:val="20"/>
+          <w:szCs w:val="20"/>
+        </w:rPr>
+      </w:pPr>
+      <w:r>
+        <w:rPr>
+          <w:rFonts w:ascii="Times New Roman" w:hAnsi="Times New Roman" w:cs="Times New Roman"/>
+          <w:sz w:val="20"/>
+          <w:szCs w:val="20"/>
+        </w:rPr>
+        <w:t>Fő jellemzők:</w:t>
+      </w:r>
+    </w:p>
+    <w:p>
+      <w:pPr>
+        <w:rPr>
+          <w:rFonts w:ascii="Times New Roman" w:hAnsi="Times New Roman" w:cs="Times New Roman"/>
+          <w:sz w:val="20"/>
+          <w:szCs w:val="20"/>
+        </w:rPr>
+      </w:pPr>
+      <w:r>
+        <w:rPr>
+          <w:rFonts w:ascii="Times New Roman" w:hAnsi="Times New Roman" w:cs="Times New Roman"/>
+          <w:sz w:val="20"/>
+          <w:szCs w:val="20"/>
+        </w:rPr>
+        <w:t>- Többnyelvű kódszerkesztés</w:t>
+      </w:r>
+    </w:p>
+    <w:p>
+      <w:pPr>
+        <w:rPr>
+          <w:rFonts w:ascii="Times New Roman" w:hAnsi="Times New Roman" w:cs="Times New Roman"/>
+          <w:sz w:val="20"/>
+          <w:szCs w:val="20"/>
+        </w:rPr>
+      </w:pPr>
+      <w:r>
+        <w:rPr>
+          <w:rFonts w:ascii="Times New Roman" w:hAnsi="Times New Roman" w:cs="Times New Roman"/>
+          <w:sz w:val="20"/>
+          <w:szCs w:val="20"/>
+        </w:rPr>
+        <w:t>- Bővítmény rendszer</w:t>
+      </w:r>
+    </w:p>
+    <w:p>
+      <w:pPr>
+        <w:rPr>
+          <w:rFonts w:ascii="Times New Roman" w:hAnsi="Times New Roman" w:cs="Times New Roman"/>
+          <w:sz w:val="20"/>
+          <w:szCs w:val="20"/>
+        </w:rPr>
+      </w:pPr>
+      <w:r>
+        <w:rPr>
+          <w:rFonts w:ascii="Times New Roman" w:hAnsi="Times New Roman" w:cs="Times New Roman"/>
+          <w:sz w:val="20"/>
+          <w:szCs w:val="20"/>
+        </w:rPr>
+        <w:t xml:space="preserve">- </w:t>
+      </w:r>
+      <w:proofErr w:type="spellStart"/>
+      <w:r>
+        <w:rPr>
+          <w:rFonts w:ascii="Times New Roman" w:hAnsi="Times New Roman" w:cs="Times New Roman"/>
+          <w:sz w:val="20"/>
+          <w:szCs w:val="20"/>
+        </w:rPr>
+        <w:t>Testreszabható</w:t>
+      </w:r>
+      <w:proofErr w:type="spellEnd"/>
+      <w:r>
+        <w:rPr>
+          <w:rFonts w:ascii="Times New Roman" w:hAnsi="Times New Roman" w:cs="Times New Roman"/>
+          <w:sz w:val="20"/>
+          <w:szCs w:val="20"/>
+        </w:rPr>
+        <w:t xml:space="preserve"> felület</w:t>
+      </w:r>
+    </w:p>
+    <w:p>
+      <w:pPr>
+        <w:rPr>
+          <w:rFonts w:ascii="Times New Roman" w:hAnsi="Times New Roman" w:cs="Times New Roman"/>
+          <w:sz w:val="20"/>
+          <w:szCs w:val="20"/>
+        </w:rPr>
+      </w:pPr>
+      <w:r>
+        <w:rPr>
+          <w:rFonts w:ascii="Times New Roman" w:hAnsi="Times New Roman" w:cs="Times New Roman"/>
+          <w:sz w:val="20"/>
+          <w:szCs w:val="20"/>
+        </w:rPr>
+        <w:t>- Integrált verziókezelés</w:t>
+      </w:r>
+    </w:p>
+    <w:p>
+      <w:pPr>
+        <w:rPr>
+          <w:rFonts w:ascii="Times New Roman" w:hAnsi="Times New Roman" w:cs="Times New Roman"/>
+          <w:sz w:val="20"/>
+          <w:szCs w:val="20"/>
+        </w:rPr>
+      </w:pPr>
+      <w:r>
+        <w:rPr>
+          <w:rFonts w:ascii="Times New Roman" w:hAnsi="Times New Roman" w:cs="Times New Roman"/>
+          <w:sz w:val="20"/>
+          <w:szCs w:val="20"/>
+        </w:rPr>
+        <w:t xml:space="preserve">- </w:t>
+      </w:r>
+      <w:proofErr w:type="spellStart"/>
+      <w:r>
+        <w:rPr>
+          <w:rFonts w:ascii="Times New Roman" w:hAnsi="Times New Roman" w:cs="Times New Roman"/>
+          <w:sz w:val="20"/>
+          <w:szCs w:val="20"/>
+        </w:rPr>
+        <w:t>Live</w:t>
+      </w:r>
+      <w:proofErr w:type="spellEnd"/>
+      <w:r>
+        <w:rPr>
+          <w:rFonts w:ascii="Times New Roman" w:hAnsi="Times New Roman" w:cs="Times New Roman"/>
+          <w:sz w:val="20"/>
+          <w:szCs w:val="20"/>
+        </w:rPr>
+        <w:t xml:space="preserve"> </w:t>
+      </w:r>
+      <w:proofErr w:type="spellStart"/>
+      <w:r>
+        <w:rPr>
+          <w:rFonts w:ascii="Times New Roman" w:hAnsi="Times New Roman" w:cs="Times New Roman"/>
+          <w:sz w:val="20"/>
+          <w:szCs w:val="20"/>
+        </w:rPr>
+        <w:t>Share</w:t>
+      </w:r>
+      <w:proofErr w:type="spellEnd"/>
+      <w:r>
+        <w:rPr>
+          <w:rFonts w:ascii="Times New Roman" w:hAnsi="Times New Roman" w:cs="Times New Roman"/>
+          <w:sz w:val="20"/>
+          <w:szCs w:val="20"/>
+        </w:rPr>
+        <w:t xml:space="preserve"> együttműködés</w:t>
+      </w:r>
+    </w:p>
+    <w:p>
+      <w:pPr>
+        <w:rPr>
+          <w:rFonts w:ascii="Times New Roman" w:hAnsi="Times New Roman" w:cs="Times New Roman"/>
+          <w:sz w:val="20"/>
+          <w:szCs w:val="20"/>
+        </w:rPr>
+      </w:pPr>
+    </w:p>
+    <w:p>
+      <w:pPr>
+        <w:rPr>
+          <w:rFonts w:ascii="Times New Roman" w:hAnsi="Times New Roman" w:cs="Times New Roman"/>
+          <w:sz w:val="20"/>
+          <w:szCs w:val="20"/>
+        </w:rPr>
+      </w:pPr>
+      <w:r>
+        <w:rPr>
+          <w:rFonts w:ascii="Times New Roman" w:hAnsi="Times New Roman" w:cs="Times New Roman"/>
+          <w:sz w:val="20"/>
+          <w:szCs w:val="20"/>
+        </w:rPr>
+        <w:t>Integráció más technológiákkal</w:t>
+      </w:r>
+    </w:p>
+    <w:p>
+      <w:pPr>
+        <w:rPr>
+          <w:rFonts w:ascii="Times New Roman" w:hAnsi="Times New Roman" w:cs="Times New Roman"/>
+          <w:sz w:val="20"/>
+          <w:szCs w:val="20"/>
+        </w:rPr>
+      </w:pPr>
+    </w:p>
+    <w:p>
+      <w:pPr>
+        <w:rPr>
+          <w:rFonts w:ascii="Times New Roman" w:hAnsi="Times New Roman" w:cs="Times New Roman"/>
+          <w:sz w:val="20"/>
+          <w:szCs w:val="20"/>
+        </w:rPr>
+      </w:pPr>
+      <w:r>
+        <w:rPr>
+          <w:rFonts w:ascii="Times New Roman" w:hAnsi="Times New Roman" w:cs="Times New Roman"/>
+          <w:sz w:val="20"/>
+          <w:szCs w:val="20"/>
+        </w:rPr>
+        <w:t>Támogatott területek:</w:t>
+      </w:r>
+    </w:p>
+    <w:p>
+      <w:pPr>
+        <w:rPr>
+          <w:rFonts w:ascii="Times New Roman" w:hAnsi="Times New Roman" w:cs="Times New Roman"/>
+          <w:sz w:val="20"/>
+          <w:szCs w:val="20"/>
+        </w:rPr>
+      </w:pPr>
+      <w:r>
+        <w:rPr>
+          <w:rFonts w:ascii="Times New Roman" w:hAnsi="Times New Roman" w:cs="Times New Roman"/>
+          <w:sz w:val="20"/>
+          <w:szCs w:val="20"/>
+        </w:rPr>
+        <w:t>- Web fejlesztés (HTML, CSS, JS)</w:t>
+      </w:r>
+    </w:p>
+    <w:p>
+      <w:pPr>
+        <w:rPr>
+          <w:rFonts w:ascii="Times New Roman" w:hAnsi="Times New Roman" w:cs="Times New Roman"/>
+          <w:sz w:val="20"/>
+          <w:szCs w:val="20"/>
+        </w:rPr>
+      </w:pPr>
+      <w:r>
+        <w:rPr>
+          <w:rFonts w:ascii="Times New Roman" w:hAnsi="Times New Roman" w:cs="Times New Roman"/>
+          <w:sz w:val="20"/>
+          <w:szCs w:val="20"/>
+        </w:rPr>
+        <w:lastRenderedPageBreak/>
+        <w:t>- Backend fejlesztés</w:t>
+      </w:r>
+    </w:p>
+    <w:p>
+      <w:pPr>
+        <w:rPr>
+          <w:rFonts w:ascii="Times New Roman" w:hAnsi="Times New Roman" w:cs="Times New Roman"/>
+          <w:sz w:val="20"/>
+          <w:szCs w:val="20"/>
+        </w:rPr>
+      </w:pPr>
+      <w:r>
+        <w:rPr>
+          <w:rFonts w:ascii="Times New Roman" w:hAnsi="Times New Roman" w:cs="Times New Roman"/>
+          <w:sz w:val="20"/>
+          <w:szCs w:val="20"/>
+        </w:rPr>
+        <w:t xml:space="preserve">- </w:t>
+      </w:r>
+      <w:proofErr w:type="spellStart"/>
+      <w:r>
+        <w:rPr>
+          <w:rFonts w:ascii="Times New Roman" w:hAnsi="Times New Roman" w:cs="Times New Roman"/>
+          <w:sz w:val="20"/>
+          <w:szCs w:val="20"/>
+        </w:rPr>
+        <w:t>Konténerizáció</w:t>
+      </w:r>
+      <w:proofErr w:type="spellEnd"/>
+      <w:r>
+        <w:rPr>
+          <w:rFonts w:ascii="Times New Roman" w:hAnsi="Times New Roman" w:cs="Times New Roman"/>
+          <w:sz w:val="20"/>
+          <w:szCs w:val="20"/>
+        </w:rPr>
+        <w:t xml:space="preserve"> (Docker)</w:t>
+      </w:r>
+    </w:p>
+    <w:p>
+      <w:pPr>
+        <w:rPr>
+          <w:rFonts w:ascii="Times New Roman" w:hAnsi="Times New Roman" w:cs="Times New Roman"/>
+          <w:sz w:val="20"/>
+          <w:szCs w:val="20"/>
+        </w:rPr>
+      </w:pPr>
+      <w:r>
+        <w:rPr>
+          <w:rFonts w:ascii="Times New Roman" w:hAnsi="Times New Roman" w:cs="Times New Roman"/>
+          <w:sz w:val="20"/>
+          <w:szCs w:val="20"/>
+        </w:rPr>
+        <w:t>- Cloud fejlesztés</w:t>
+      </w:r>
+    </w:p>
+    <w:p>
+      <w:pPr>
+        <w:rPr>
+          <w:rFonts w:ascii="Times New Roman" w:hAnsi="Times New Roman" w:cs="Times New Roman"/>
+          <w:sz w:val="20"/>
+          <w:szCs w:val="20"/>
+        </w:rPr>
+      </w:pPr>
+      <w:r>
+        <w:rPr>
+          <w:rFonts w:ascii="Times New Roman" w:hAnsi="Times New Roman" w:cs="Times New Roman"/>
+          <w:sz w:val="20"/>
+          <w:szCs w:val="20"/>
+        </w:rPr>
+        <w:t xml:space="preserve">- </w:t>
+      </w:r>
+      <w:proofErr w:type="spellStart"/>
+      <w:r>
+        <w:rPr>
+          <w:rFonts w:ascii="Times New Roman" w:hAnsi="Times New Roman" w:cs="Times New Roman"/>
+          <w:sz w:val="20"/>
+          <w:szCs w:val="20"/>
+        </w:rPr>
+        <w:t>Remote</w:t>
+      </w:r>
+      <w:proofErr w:type="spellEnd"/>
+      <w:r>
+        <w:rPr>
+          <w:rFonts w:ascii="Times New Roman" w:hAnsi="Times New Roman" w:cs="Times New Roman"/>
+          <w:sz w:val="20"/>
+          <w:szCs w:val="20"/>
+        </w:rPr>
+        <w:t xml:space="preserve"> </w:t>
+      </w:r>
+      <w:proofErr w:type="spellStart"/>
+      <w:r>
+        <w:rPr>
+          <w:rFonts w:ascii="Times New Roman" w:hAnsi="Times New Roman" w:cs="Times New Roman"/>
+          <w:sz w:val="20"/>
+          <w:szCs w:val="20"/>
+        </w:rPr>
+        <w:t>Development</w:t>
+      </w:r>
+      <w:proofErr w:type="spellEnd"/>
+    </w:p>
+    <w:p>
+      <w:pPr>
+        <w:rPr>
+          <w:rFonts w:ascii="Times New Roman" w:hAnsi="Times New Roman" w:cs="Times New Roman"/>
+          <w:sz w:val="20"/>
+          <w:szCs w:val="20"/>
+        </w:rPr>
+      </w:pPr>
+    </w:p>
+    <w:p>
+      <w:pPr>
+        <w:rPr>
+          <w:rFonts w:ascii="Times New Roman" w:hAnsi="Times New Roman" w:cs="Times New Roman"/>
+          <w:sz w:val="20"/>
+          <w:szCs w:val="20"/>
+        </w:rPr>
+      </w:pPr>
+    </w:p>
+    <w:p>
+      <w:pPr>
+        <w:rPr>
+          <w:rFonts w:ascii="Times New Roman" w:hAnsi="Times New Roman" w:cs="Times New Roman"/>
+          <w:sz w:val="20"/>
+          <w:szCs w:val="20"/>
+        </w:rPr>
+      </w:pPr>
+      <w:r>
+        <w:rPr>
+          <w:rFonts w:ascii="Times New Roman" w:hAnsi="Times New Roman" w:cs="Times New Roman"/>
+          <w:sz w:val="20"/>
+          <w:szCs w:val="20"/>
+        </w:rPr>
+        <w:br w:type="page"/>
+      </w:r>
+    </w:p>
+    <w:p>
+      <w:pPr>
+        <w:rPr>
+          <w:rFonts w:ascii="Times New Roman" w:hAnsi="Times New Roman" w:cs="Times New Roman"/>
+          <w:sz w:val="20"/>
+          <w:szCs w:val="20"/>
+        </w:rPr>
+      </w:pPr>
+      <w:r>
+        <w:rPr>
+          <w:rFonts w:ascii="Times New Roman" w:hAnsi="Times New Roman" w:cs="Times New Roman"/>
+          <w:sz w:val="20"/>
+          <w:szCs w:val="20"/>
+        </w:rPr>
+        <w:lastRenderedPageBreak/>
+        <w:t># Visual Studio 2022 fejlesztőeszköz összefoglaló</w:t>
+      </w:r>
+    </w:p>
+    <w:p>
+      <w:pPr>
+        <w:rPr>
+          <w:rFonts w:ascii="Times New Roman" w:hAnsi="Times New Roman" w:cs="Times New Roman"/>
+          <w:sz w:val="20"/>
+          <w:szCs w:val="20"/>
+        </w:rPr>
+      </w:pPr>
+    </w:p>
+    <w:p>
+      <w:pPr>
+        <w:rPr>
+          <w:rFonts w:ascii="Times New Roman" w:hAnsi="Times New Roman" w:cs="Times New Roman"/>
+          <w:sz w:val="20"/>
+          <w:szCs w:val="20"/>
+        </w:rPr>
+      </w:pPr>
+      <w:r>
+        <w:rPr>
+          <w:rFonts w:ascii="Times New Roman" w:hAnsi="Times New Roman" w:cs="Times New Roman"/>
+          <w:sz w:val="20"/>
+          <w:szCs w:val="20"/>
+        </w:rPr>
+        <w:t>## Bevezetés</w:t>
+      </w:r>
+    </w:p>
+    <w:p>
+      <w:pPr>
+        <w:rPr>
+          <w:rFonts w:ascii="Times New Roman" w:hAnsi="Times New Roman" w:cs="Times New Roman"/>
+          <w:sz w:val="20"/>
+          <w:szCs w:val="20"/>
+        </w:rPr>
+      </w:pPr>
+    </w:p>
+    <w:p>
+      <w:pPr>
+        <w:rPr>
+          <w:rFonts w:ascii="Times New Roman" w:hAnsi="Times New Roman" w:cs="Times New Roman"/>
+          <w:sz w:val="20"/>
+          <w:szCs w:val="20"/>
+        </w:rPr>
+      </w:pPr>
+      <w:r>
+        <w:rPr>
+          <w:rFonts w:ascii="Times New Roman" w:hAnsi="Times New Roman" w:cs="Times New Roman"/>
+          <w:sz w:val="20"/>
+          <w:szCs w:val="20"/>
+        </w:rPr>
+        <w:t>A Visual Studio 2022 a Microsoft integrált fejlesztőkörnyezete (IDE), amely átfogó eszközkészletet biztosít professzionális alkalmazásfejlesztéshez.</w:t>
+      </w:r>
+    </w:p>
+    <w:p>
+      <w:pPr>
+        <w:rPr>
+          <w:rFonts w:ascii="Times New Roman" w:hAnsi="Times New Roman" w:cs="Times New Roman"/>
+          <w:sz w:val="20"/>
+          <w:szCs w:val="20"/>
+        </w:rPr>
+      </w:pPr>
+    </w:p>
+    <w:p>
+      <w:pPr>
+        <w:rPr>
+          <w:rFonts w:ascii="Times New Roman" w:hAnsi="Times New Roman" w:cs="Times New Roman"/>
+          <w:sz w:val="20"/>
+          <w:szCs w:val="20"/>
+        </w:rPr>
+      </w:pPr>
+      <w:r>
+        <w:rPr>
+          <w:rFonts w:ascii="Times New Roman" w:hAnsi="Times New Roman" w:cs="Times New Roman"/>
+          <w:sz w:val="20"/>
+          <w:szCs w:val="20"/>
+        </w:rPr>
+        <w:t>## Működési alapelvek</w:t>
+      </w:r>
+    </w:p>
+    <w:p>
+      <w:pPr>
+        <w:rPr>
+          <w:rFonts w:ascii="Times New Roman" w:hAnsi="Times New Roman" w:cs="Times New Roman"/>
+          <w:sz w:val="20"/>
+          <w:szCs w:val="20"/>
+        </w:rPr>
+      </w:pPr>
+    </w:p>
+    <w:p>
+      <w:pPr>
+        <w:rPr>
+          <w:rFonts w:ascii="Times New Roman" w:hAnsi="Times New Roman" w:cs="Times New Roman"/>
+          <w:sz w:val="20"/>
+          <w:szCs w:val="20"/>
+        </w:rPr>
+      </w:pPr>
+      <w:r>
+        <w:rPr>
+          <w:rFonts w:ascii="Times New Roman" w:hAnsi="Times New Roman" w:cs="Times New Roman"/>
+          <w:sz w:val="20"/>
+          <w:szCs w:val="20"/>
+        </w:rPr>
+        <w:t xml:space="preserve">64 bites alkalmazásként fut, támogatva a nagy méretű projektek hatékony kezelését, beépített fordítóval és </w:t>
+      </w:r>
+      <w:proofErr w:type="spellStart"/>
+      <w:r>
+        <w:rPr>
+          <w:rFonts w:ascii="Times New Roman" w:hAnsi="Times New Roman" w:cs="Times New Roman"/>
+          <w:sz w:val="20"/>
+          <w:szCs w:val="20"/>
+        </w:rPr>
+        <w:t>debuggerrel</w:t>
+      </w:r>
+      <w:proofErr w:type="spellEnd"/>
+      <w:r>
+        <w:rPr>
+          <w:rFonts w:ascii="Times New Roman" w:hAnsi="Times New Roman" w:cs="Times New Roman"/>
+          <w:sz w:val="20"/>
+          <w:szCs w:val="20"/>
+        </w:rPr>
+        <w:t>.</w:t>
+      </w:r>
+    </w:p>
+    <w:p>
+      <w:pPr>
+        <w:rPr>
+          <w:rFonts w:ascii="Times New Roman" w:hAnsi="Times New Roman" w:cs="Times New Roman"/>
+          <w:sz w:val="20"/>
+          <w:szCs w:val="20"/>
+        </w:rPr>
+      </w:pPr>
+    </w:p>
+    <w:p>
+      <w:pPr>
+        <w:rPr>
+          <w:rFonts w:ascii="Times New Roman" w:hAnsi="Times New Roman" w:cs="Times New Roman"/>
+          <w:sz w:val="20"/>
+          <w:szCs w:val="20"/>
+        </w:rPr>
+      </w:pPr>
+      <w:r>
+        <w:rPr>
+          <w:rFonts w:ascii="Times New Roman" w:hAnsi="Times New Roman" w:cs="Times New Roman"/>
+          <w:sz w:val="20"/>
+          <w:szCs w:val="20"/>
+        </w:rPr>
+        <w:t>## Technológiai háttér</w:t>
+      </w:r>
+    </w:p>
+    <w:p>
+      <w:pPr>
+        <w:rPr>
+          <w:rFonts w:ascii="Times New Roman" w:hAnsi="Times New Roman" w:cs="Times New Roman"/>
+          <w:sz w:val="20"/>
+          <w:szCs w:val="20"/>
+        </w:rPr>
+      </w:pPr>
+    </w:p>
+    <w:p>
+      <w:pPr>
+        <w:rPr>
+          <w:rFonts w:ascii="Times New Roman" w:hAnsi="Times New Roman" w:cs="Times New Roman"/>
+          <w:sz w:val="20"/>
+          <w:szCs w:val="20"/>
+        </w:rPr>
+      </w:pPr>
+      <w:r>
+        <w:rPr>
+          <w:rFonts w:ascii="Times New Roman" w:hAnsi="Times New Roman" w:cs="Times New Roman"/>
+          <w:sz w:val="20"/>
+          <w:szCs w:val="20"/>
+        </w:rPr>
+        <w:t>Fő komponensek:</w:t>
+      </w:r>
+    </w:p>
+    <w:p>
+      <w:pPr>
+        <w:rPr>
+          <w:rFonts w:ascii="Times New Roman" w:hAnsi="Times New Roman" w:cs="Times New Roman"/>
+          <w:sz w:val="20"/>
+          <w:szCs w:val="20"/>
+        </w:rPr>
+      </w:pPr>
+      <w:r>
+        <w:rPr>
+          <w:rFonts w:ascii="Times New Roman" w:hAnsi="Times New Roman" w:cs="Times New Roman"/>
+          <w:sz w:val="20"/>
+          <w:szCs w:val="20"/>
+        </w:rPr>
+        <w:t>1. .NET fejlesztési környezet</w:t>
+      </w:r>
+    </w:p>
+    <w:p>
+      <w:pPr>
+        <w:rPr>
+          <w:rFonts w:ascii="Times New Roman" w:hAnsi="Times New Roman" w:cs="Times New Roman"/>
+          <w:sz w:val="20"/>
+          <w:szCs w:val="20"/>
+        </w:rPr>
+      </w:pPr>
+      <w:r>
+        <w:rPr>
+          <w:rFonts w:ascii="Times New Roman" w:hAnsi="Times New Roman" w:cs="Times New Roman"/>
+          <w:sz w:val="20"/>
+          <w:szCs w:val="20"/>
+        </w:rPr>
+        <w:t xml:space="preserve">2. Beépített </w:t>
+      </w:r>
+      <w:proofErr w:type="spellStart"/>
+      <w:r>
+        <w:rPr>
+          <w:rFonts w:ascii="Times New Roman" w:hAnsi="Times New Roman" w:cs="Times New Roman"/>
+          <w:sz w:val="20"/>
+          <w:szCs w:val="20"/>
+        </w:rPr>
+        <w:t>debugging</w:t>
+      </w:r>
+      <w:proofErr w:type="spellEnd"/>
+      <w:r>
+        <w:rPr>
+          <w:rFonts w:ascii="Times New Roman" w:hAnsi="Times New Roman" w:cs="Times New Roman"/>
+          <w:sz w:val="20"/>
+          <w:szCs w:val="20"/>
+        </w:rPr>
+        <w:t xml:space="preserve"> rendszer</w:t>
+      </w:r>
+    </w:p>
+    <w:p>
+      <w:pPr>
+        <w:rPr>
+          <w:rFonts w:ascii="Times New Roman" w:hAnsi="Times New Roman" w:cs="Times New Roman"/>
+          <w:sz w:val="20"/>
+          <w:szCs w:val="20"/>
+        </w:rPr>
+      </w:pPr>
+      <w:r>
+        <w:rPr>
+          <w:rFonts w:ascii="Times New Roman" w:hAnsi="Times New Roman" w:cs="Times New Roman"/>
+          <w:sz w:val="20"/>
+          <w:szCs w:val="20"/>
+        </w:rPr>
+        <w:t>3. Vizuális tervezőeszközök</w:t>
+      </w:r>
+    </w:p>
+    <w:p>
+      <w:pPr>
+        <w:rPr>
+          <w:rFonts w:ascii="Times New Roman" w:hAnsi="Times New Roman" w:cs="Times New Roman"/>
+          <w:sz w:val="20"/>
+          <w:szCs w:val="20"/>
+        </w:rPr>
+      </w:pPr>
+      <w:r>
+        <w:rPr>
+          <w:rFonts w:ascii="Times New Roman" w:hAnsi="Times New Roman" w:cs="Times New Roman"/>
+          <w:sz w:val="20"/>
+          <w:szCs w:val="20"/>
+        </w:rPr>
+        <w:t>4. Teljesítmény profilozás</w:t>
+      </w:r>
+    </w:p>
+    <w:p>
+      <w:pPr>
+        <w:rPr>
+          <w:rFonts w:ascii="Times New Roman" w:hAnsi="Times New Roman" w:cs="Times New Roman"/>
+          <w:sz w:val="20"/>
+          <w:szCs w:val="20"/>
+        </w:rPr>
+      </w:pPr>
+      <w:r>
+        <w:rPr>
+          <w:rFonts w:ascii="Times New Roman" w:hAnsi="Times New Roman" w:cs="Times New Roman"/>
+          <w:sz w:val="20"/>
+          <w:szCs w:val="20"/>
+        </w:rPr>
+        <w:t>5. Tesztelési keretrendszer</w:t>
+      </w:r>
+    </w:p>
+    <w:p>
+      <w:pPr>
+        <w:rPr>
+          <w:rFonts w:ascii="Times New Roman" w:hAnsi="Times New Roman" w:cs="Times New Roman"/>
+          <w:sz w:val="20"/>
+          <w:szCs w:val="20"/>
+        </w:rPr>
+      </w:pPr>
+    </w:p>
+    <w:p>
+      <w:pPr>
+        <w:rPr>
+          <w:rFonts w:ascii="Times New Roman" w:hAnsi="Times New Roman" w:cs="Times New Roman"/>
+          <w:sz w:val="20"/>
+          <w:szCs w:val="20"/>
+        </w:rPr>
+      </w:pPr>
+      <w:r>
+        <w:rPr>
+          <w:rFonts w:ascii="Times New Roman" w:hAnsi="Times New Roman" w:cs="Times New Roman"/>
+          <w:sz w:val="20"/>
+          <w:szCs w:val="20"/>
+        </w:rPr>
+        <w:t>## Alapvető funkcionalitás</w:t>
+      </w:r>
+    </w:p>
+    <w:p>
+      <w:pPr>
+        <w:rPr>
+          <w:rFonts w:ascii="Times New Roman" w:hAnsi="Times New Roman" w:cs="Times New Roman"/>
+          <w:sz w:val="20"/>
+          <w:szCs w:val="20"/>
+        </w:rPr>
+      </w:pPr>
+    </w:p>
+    <w:p>
+      <w:pPr>
+        <w:rPr>
+          <w:rFonts w:ascii="Times New Roman" w:hAnsi="Times New Roman" w:cs="Times New Roman"/>
+          <w:sz w:val="20"/>
+          <w:szCs w:val="20"/>
+        </w:rPr>
+      </w:pPr>
+      <w:r>
+        <w:rPr>
+          <w:rFonts w:ascii="Times New Roman" w:hAnsi="Times New Roman" w:cs="Times New Roman"/>
+          <w:sz w:val="20"/>
+          <w:szCs w:val="20"/>
+        </w:rPr>
+        <w:t>Főbb jellemzők:</w:t>
+      </w:r>
+    </w:p>
+    <w:p>
+      <w:pPr>
+        <w:rPr>
+          <w:rFonts w:ascii="Times New Roman" w:hAnsi="Times New Roman" w:cs="Times New Roman"/>
+          <w:sz w:val="20"/>
+          <w:szCs w:val="20"/>
+        </w:rPr>
+      </w:pPr>
+      <w:r>
+        <w:rPr>
+          <w:rFonts w:ascii="Times New Roman" w:hAnsi="Times New Roman" w:cs="Times New Roman"/>
+          <w:sz w:val="20"/>
+          <w:szCs w:val="20"/>
+        </w:rPr>
+        <w:t>- Intelligens kódszerkesztés</w:t>
+      </w:r>
+    </w:p>
+    <w:p>
+      <w:pPr>
+        <w:rPr>
+          <w:rFonts w:ascii="Times New Roman" w:hAnsi="Times New Roman" w:cs="Times New Roman"/>
+          <w:sz w:val="20"/>
+          <w:szCs w:val="20"/>
+        </w:rPr>
+      </w:pPr>
+      <w:r>
+        <w:rPr>
+          <w:rFonts w:ascii="Times New Roman" w:hAnsi="Times New Roman" w:cs="Times New Roman"/>
+          <w:sz w:val="20"/>
+          <w:szCs w:val="20"/>
+        </w:rPr>
+        <w:t>- Vizuális tervezőeszközök</w:t>
+      </w:r>
+    </w:p>
+    <w:p>
+      <w:pPr>
+        <w:rPr>
+          <w:rFonts w:ascii="Times New Roman" w:hAnsi="Times New Roman" w:cs="Times New Roman"/>
+          <w:sz w:val="20"/>
+          <w:szCs w:val="20"/>
+        </w:rPr>
+      </w:pPr>
+      <w:r>
+        <w:rPr>
+          <w:rFonts w:ascii="Times New Roman" w:hAnsi="Times New Roman" w:cs="Times New Roman"/>
+          <w:sz w:val="20"/>
+          <w:szCs w:val="20"/>
+        </w:rPr>
+        <w:t>- Beépített tesztelési eszközök</w:t>
+      </w:r>
+    </w:p>
+    <w:p>
+      <w:pPr>
+        <w:rPr>
+          <w:rFonts w:ascii="Times New Roman" w:hAnsi="Times New Roman" w:cs="Times New Roman"/>
+          <w:sz w:val="20"/>
+          <w:szCs w:val="20"/>
+        </w:rPr>
+      </w:pPr>
+      <w:r>
+        <w:rPr>
+          <w:rFonts w:ascii="Times New Roman" w:hAnsi="Times New Roman" w:cs="Times New Roman"/>
+          <w:sz w:val="20"/>
+          <w:szCs w:val="20"/>
+        </w:rPr>
+        <w:t>- Forráskód verziókezelés</w:t>
+      </w:r>
+    </w:p>
+    <w:p>
+      <w:pPr>
+        <w:rPr>
+          <w:rFonts w:ascii="Times New Roman" w:hAnsi="Times New Roman" w:cs="Times New Roman"/>
+          <w:sz w:val="20"/>
+          <w:szCs w:val="20"/>
+        </w:rPr>
+      </w:pPr>
+      <w:r>
+        <w:rPr>
+          <w:rFonts w:ascii="Times New Roman" w:hAnsi="Times New Roman" w:cs="Times New Roman"/>
+          <w:sz w:val="20"/>
+          <w:szCs w:val="20"/>
+        </w:rPr>
+        <w:t>- Azure integráció</w:t>
+      </w:r>
+    </w:p>
+    <w:p>
+      <w:pPr>
+        <w:rPr>
+          <w:rFonts w:ascii="Times New Roman" w:hAnsi="Times New Roman" w:cs="Times New Roman"/>
+          <w:sz w:val="20"/>
+          <w:szCs w:val="20"/>
+        </w:rPr>
+      </w:pPr>
+    </w:p>
+    <w:p>
+      <w:pPr>
+        <w:rPr>
+          <w:rFonts w:ascii="Times New Roman" w:hAnsi="Times New Roman" w:cs="Times New Roman"/>
+          <w:sz w:val="20"/>
+          <w:szCs w:val="20"/>
+        </w:rPr>
+      </w:pPr>
+      <w:r>
+        <w:rPr>
+          <w:rFonts w:ascii="Times New Roman" w:hAnsi="Times New Roman" w:cs="Times New Roman"/>
+          <w:sz w:val="20"/>
+          <w:szCs w:val="20"/>
+        </w:rPr>
+        <w:t>## Integráció más technológiákkal</w:t>
+      </w:r>
+    </w:p>
+    <w:p>
+      <w:pPr>
+        <w:rPr>
+          <w:rFonts w:ascii="Times New Roman" w:hAnsi="Times New Roman" w:cs="Times New Roman"/>
+          <w:sz w:val="20"/>
+          <w:szCs w:val="20"/>
+        </w:rPr>
+      </w:pPr>
+    </w:p>
+    <w:p>
+      <w:pPr>
+        <w:rPr>
+          <w:rFonts w:ascii="Times New Roman" w:hAnsi="Times New Roman" w:cs="Times New Roman"/>
+          <w:sz w:val="20"/>
+          <w:szCs w:val="20"/>
+        </w:rPr>
+      </w:pPr>
+      <w:r>
+        <w:rPr>
+          <w:rFonts w:ascii="Times New Roman" w:hAnsi="Times New Roman" w:cs="Times New Roman"/>
+          <w:sz w:val="20"/>
+          <w:szCs w:val="20"/>
+        </w:rPr>
+        <w:t>Támogatott területek:</w:t>
+      </w:r>
+    </w:p>
+    <w:p>
+      <w:pPr>
+        <w:rPr>
+          <w:rFonts w:ascii="Times New Roman" w:hAnsi="Times New Roman" w:cs="Times New Roman"/>
+          <w:sz w:val="20"/>
+          <w:szCs w:val="20"/>
+        </w:rPr>
+      </w:pPr>
+      <w:r>
+        <w:rPr>
+          <w:rFonts w:ascii="Times New Roman" w:hAnsi="Times New Roman" w:cs="Times New Roman"/>
+          <w:sz w:val="20"/>
+          <w:szCs w:val="20"/>
+        </w:rPr>
+        <w:t>- .NET Framework/</w:t>
+      </w:r>
+      <w:proofErr w:type="spellStart"/>
+      <w:r>
+        <w:rPr>
+          <w:rFonts w:ascii="Times New Roman" w:hAnsi="Times New Roman" w:cs="Times New Roman"/>
+          <w:sz w:val="20"/>
+          <w:szCs w:val="20"/>
+        </w:rPr>
+        <w:t>Core</w:t>
+      </w:r>
+      <w:proofErr w:type="spellEnd"/>
+      <w:r>
+        <w:rPr>
+          <w:rFonts w:ascii="Times New Roman" w:hAnsi="Times New Roman" w:cs="Times New Roman"/>
+          <w:sz w:val="20"/>
+          <w:szCs w:val="20"/>
+        </w:rPr>
+        <w:t xml:space="preserve"> fejlesztés</w:t>
+      </w:r>
+    </w:p>
+    <w:p>
+      <w:pPr>
+        <w:rPr>
+          <w:rFonts w:ascii="Times New Roman" w:hAnsi="Times New Roman" w:cs="Times New Roman"/>
+          <w:sz w:val="20"/>
+          <w:szCs w:val="20"/>
+        </w:rPr>
+      </w:pPr>
+      <w:r>
+        <w:rPr>
+          <w:rFonts w:ascii="Times New Roman" w:hAnsi="Times New Roman" w:cs="Times New Roman"/>
+          <w:sz w:val="20"/>
+          <w:szCs w:val="20"/>
+        </w:rPr>
+        <w:lastRenderedPageBreak/>
+        <w:t>- C++ fejlesztés</w:t>
+      </w:r>
+    </w:p>
+    <w:p>
+      <w:pPr>
+        <w:rPr>
+          <w:rFonts w:ascii="Times New Roman" w:hAnsi="Times New Roman" w:cs="Times New Roman"/>
+          <w:sz w:val="20"/>
+          <w:szCs w:val="20"/>
+        </w:rPr>
+      </w:pPr>
+      <w:r>
+        <w:rPr>
+          <w:rFonts w:ascii="Times New Roman" w:hAnsi="Times New Roman" w:cs="Times New Roman"/>
+          <w:sz w:val="20"/>
+          <w:szCs w:val="20"/>
+        </w:rPr>
+        <w:t>- Web fejlesztés</w:t>
+      </w:r>
+    </w:p>
+    <w:p>
+      <w:pPr>
+        <w:rPr>
+          <w:rFonts w:ascii="Times New Roman" w:hAnsi="Times New Roman" w:cs="Times New Roman"/>
+          <w:sz w:val="20"/>
+          <w:szCs w:val="20"/>
+        </w:rPr>
+      </w:pPr>
+      <w:r>
+        <w:rPr>
+          <w:rFonts w:ascii="Times New Roman" w:hAnsi="Times New Roman" w:cs="Times New Roman"/>
+          <w:sz w:val="20"/>
+          <w:szCs w:val="20"/>
+        </w:rPr>
+        <w:t>- Mobil fejlesztés</w:t>
+      </w:r>
+    </w:p>
+    <w:p>
+      <w:pPr>
+        <w:rPr>
+          <w:rFonts w:ascii="Times New Roman" w:hAnsi="Times New Roman" w:cs="Times New Roman"/>
+          <w:sz w:val="20"/>
+          <w:szCs w:val="20"/>
+        </w:rPr>
+      </w:pPr>
+      <w:r>
+        <w:rPr>
+          <w:rFonts w:ascii="Times New Roman" w:hAnsi="Times New Roman" w:cs="Times New Roman"/>
+          <w:sz w:val="20"/>
+          <w:szCs w:val="20"/>
+        </w:rPr>
+        <w:t>- Cloud szolgáltatások</w:t>
+      </w:r>
+    </w:p>
+    <w:p>
+      <w:pPr>
+        <w:rPr>
+          <w:rFonts w:ascii="Times New Roman" w:hAnsi="Times New Roman" w:cs="Times New Roman"/>
+          <w:sz w:val="20"/>
+          <w:szCs w:val="20"/>
+        </w:rPr>
+      </w:pPr>
+    </w:p>
+    <w:p>
+      <w:pPr>
+        <w:rPr>
+          <w:rFonts w:ascii="Times New Roman" w:hAnsi="Times New Roman" w:cs="Times New Roman"/>
+          <w:sz w:val="20"/>
+          <w:szCs w:val="20"/>
+        </w:rPr>
+      </w:pPr>
+      <w:r>
+        <w:rPr>
+          <w:rFonts w:ascii="Times New Roman" w:hAnsi="Times New Roman" w:cs="Times New Roman"/>
+          <w:sz w:val="20"/>
+          <w:szCs w:val="20"/>
+        </w:rPr>
+        <w:t>## Következtetés</w:t>
+      </w:r>
+    </w:p>
+    <w:p>
+      <w:pPr>
+        <w:rPr>
+          <w:rFonts w:ascii="Times New Roman" w:hAnsi="Times New Roman" w:cs="Times New Roman"/>
+          <w:sz w:val="20"/>
+          <w:szCs w:val="20"/>
+        </w:rPr>
+      </w:pPr>
+    </w:p>
+    <w:p>
+      <w:pPr>
+        <w:rPr>
+          <w:rFonts w:ascii="Times New Roman" w:hAnsi="Times New Roman" w:cs="Times New Roman"/>
+          <w:sz w:val="20"/>
+          <w:szCs w:val="20"/>
+        </w:rPr>
+      </w:pPr>
+      <w:r>
+        <w:rPr>
+          <w:rFonts w:ascii="Times New Roman" w:hAnsi="Times New Roman" w:cs="Times New Roman"/>
+          <w:sz w:val="20"/>
+          <w:szCs w:val="20"/>
+        </w:rPr>
+        <w:t xml:space="preserve">A Visual Studio 2022 egy komplett, </w:t>
+      </w:r>
+      <w:proofErr w:type="spellStart"/>
+      <w:r>
+        <w:rPr>
+          <w:rFonts w:ascii="Times New Roman" w:hAnsi="Times New Roman" w:cs="Times New Roman"/>
+          <w:sz w:val="20"/>
+          <w:szCs w:val="20"/>
+        </w:rPr>
+        <w:t>enterprise</w:t>
+      </w:r>
+      <w:proofErr w:type="spellEnd"/>
+      <w:r>
+        <w:rPr>
+          <w:rFonts w:ascii="Times New Roman" w:hAnsi="Times New Roman" w:cs="Times New Roman"/>
+          <w:sz w:val="20"/>
+          <w:szCs w:val="20"/>
+        </w:rPr>
+        <w:t xml:space="preserve"> szintű fejlesztőkörnyezet, amely különösen alkalmas nagyméretű, komplex alkalmazások fejlesztésére.</w:t>
+      </w:r>
+    </w:p>
+    <w:p>
+      <w:pPr>
+        <w:rPr>
+          <w:rFonts w:ascii="Times New Roman" w:hAnsi="Times New Roman" w:cs="Times New Roman"/>
+          <w:sz w:val="20"/>
+          <w:szCs w:val="20"/>
+        </w:rPr>
+      </w:pPr>
+      <w:r>
+        <w:rPr>
+          <w:rFonts w:ascii="Times New Roman" w:hAnsi="Times New Roman" w:cs="Times New Roman"/>
+          <w:sz w:val="20"/>
+          <w:szCs w:val="20"/>
+        </w:rPr>
+        <w:br w:type="page"/>
+      </w:r>
+    </w:p>
+    <w:p>
+      <w:pPr>
+        <w:rPr>
+          <w:rFonts w:ascii="Times New Roman" w:hAnsi="Times New Roman" w:cs="Times New Roman"/>
+          <w:sz w:val="20"/>
+          <w:szCs w:val="20"/>
+        </w:rPr>
+      </w:pPr>
+      <w:r>
+        <w:rPr>
+          <w:rFonts w:ascii="Times New Roman" w:hAnsi="Times New Roman" w:cs="Times New Roman"/>
+          <w:sz w:val="20"/>
+          <w:szCs w:val="20"/>
+        </w:rPr>
+        <w:lastRenderedPageBreak/>
+        <w:t># Swagger (</w:t>
+      </w:r>
+      <w:proofErr w:type="spellStart"/>
+      <w:r>
+        <w:rPr>
+          <w:rFonts w:ascii="Times New Roman" w:hAnsi="Times New Roman" w:cs="Times New Roman"/>
+          <w:sz w:val="20"/>
+          <w:szCs w:val="20"/>
+        </w:rPr>
+        <w:t>OpenAPI</w:t>
+      </w:r>
+      <w:proofErr w:type="spellEnd"/>
+      <w:r>
+        <w:rPr>
+          <w:rFonts w:ascii="Times New Roman" w:hAnsi="Times New Roman" w:cs="Times New Roman"/>
+          <w:sz w:val="20"/>
+          <w:szCs w:val="20"/>
+        </w:rPr>
+        <w:t>) fejlesztőeszköz összefoglaló</w:t>
+      </w:r>
+    </w:p>
+    <w:p>
+      <w:pPr>
+        <w:rPr>
+          <w:rFonts w:ascii="Times New Roman" w:hAnsi="Times New Roman" w:cs="Times New Roman"/>
+          <w:sz w:val="20"/>
+          <w:szCs w:val="20"/>
+        </w:rPr>
+      </w:pPr>
+    </w:p>
+    <w:p>
+      <w:pPr>
+        <w:rPr>
+          <w:rFonts w:ascii="Times New Roman" w:hAnsi="Times New Roman" w:cs="Times New Roman"/>
+          <w:sz w:val="20"/>
+          <w:szCs w:val="20"/>
+        </w:rPr>
+      </w:pPr>
+      <w:r>
+        <w:rPr>
+          <w:rFonts w:ascii="Times New Roman" w:hAnsi="Times New Roman" w:cs="Times New Roman"/>
+          <w:sz w:val="20"/>
+          <w:szCs w:val="20"/>
+        </w:rPr>
+        <w:t>## Bevezetés</w:t>
+      </w:r>
+    </w:p>
+    <w:p>
+      <w:pPr>
+        <w:rPr>
+          <w:rFonts w:ascii="Times New Roman" w:hAnsi="Times New Roman" w:cs="Times New Roman"/>
+          <w:sz w:val="20"/>
+          <w:szCs w:val="20"/>
+        </w:rPr>
+      </w:pPr>
+    </w:p>
+    <w:p>
+      <w:pPr>
+        <w:rPr>
+          <w:rFonts w:ascii="Times New Roman" w:hAnsi="Times New Roman" w:cs="Times New Roman"/>
+          <w:sz w:val="20"/>
+          <w:szCs w:val="20"/>
+        </w:rPr>
+      </w:pPr>
+      <w:r>
+        <w:rPr>
+          <w:rFonts w:ascii="Times New Roman" w:hAnsi="Times New Roman" w:cs="Times New Roman"/>
+          <w:sz w:val="20"/>
+          <w:szCs w:val="20"/>
+        </w:rPr>
+        <w:t>A Swagger (</w:t>
+      </w:r>
+      <w:proofErr w:type="spellStart"/>
+      <w:r>
+        <w:rPr>
+          <w:rFonts w:ascii="Times New Roman" w:hAnsi="Times New Roman" w:cs="Times New Roman"/>
+          <w:sz w:val="20"/>
+          <w:szCs w:val="20"/>
+        </w:rPr>
+        <w:t>OpenAPI</w:t>
+      </w:r>
+      <w:proofErr w:type="spellEnd"/>
+      <w:r>
+        <w:rPr>
+          <w:rFonts w:ascii="Times New Roman" w:hAnsi="Times New Roman" w:cs="Times New Roman"/>
+          <w:sz w:val="20"/>
+          <w:szCs w:val="20"/>
+        </w:rPr>
+        <w:t xml:space="preserve">) egy API dokumentációs és tervezési keretrendszer, amely lehetővé teszi </w:t>
+      </w:r>
+      <w:proofErr w:type="spellStart"/>
+      <w:r>
+        <w:rPr>
+          <w:rFonts w:ascii="Times New Roman" w:hAnsi="Times New Roman" w:cs="Times New Roman"/>
+          <w:sz w:val="20"/>
+          <w:szCs w:val="20"/>
+        </w:rPr>
+        <w:t>RESTful</w:t>
+      </w:r>
+      <w:proofErr w:type="spellEnd"/>
+      <w:r>
+        <w:rPr>
+          <w:rFonts w:ascii="Times New Roman" w:hAnsi="Times New Roman" w:cs="Times New Roman"/>
+          <w:sz w:val="20"/>
+          <w:szCs w:val="20"/>
+        </w:rPr>
+        <w:t xml:space="preserve"> API-k szabványos leírását és tesztelését.</w:t>
+      </w:r>
+    </w:p>
+    <w:p>
+      <w:pPr>
+        <w:rPr>
+          <w:rFonts w:ascii="Times New Roman" w:hAnsi="Times New Roman" w:cs="Times New Roman"/>
+          <w:sz w:val="20"/>
+          <w:szCs w:val="20"/>
+        </w:rPr>
+      </w:pPr>
+    </w:p>
+    <w:p>
+      <w:pPr>
+        <w:rPr>
+          <w:rFonts w:ascii="Times New Roman" w:hAnsi="Times New Roman" w:cs="Times New Roman"/>
+          <w:sz w:val="20"/>
+          <w:szCs w:val="20"/>
+        </w:rPr>
+      </w:pPr>
+      <w:r>
+        <w:rPr>
+          <w:rFonts w:ascii="Times New Roman" w:hAnsi="Times New Roman" w:cs="Times New Roman"/>
+          <w:sz w:val="20"/>
+          <w:szCs w:val="20"/>
+        </w:rPr>
+        <w:t>## Működési alapelvek</w:t>
+      </w:r>
+    </w:p>
+    <w:p>
+      <w:pPr>
+        <w:rPr>
+          <w:rFonts w:ascii="Times New Roman" w:hAnsi="Times New Roman" w:cs="Times New Roman"/>
+          <w:sz w:val="20"/>
+          <w:szCs w:val="20"/>
+        </w:rPr>
+      </w:pPr>
+    </w:p>
+    <w:p>
+      <w:pPr>
+        <w:rPr>
+          <w:rFonts w:ascii="Times New Roman" w:hAnsi="Times New Roman" w:cs="Times New Roman"/>
+          <w:sz w:val="20"/>
+          <w:szCs w:val="20"/>
+        </w:rPr>
+      </w:pPr>
+      <w:r>
+        <w:rPr>
+          <w:rFonts w:ascii="Times New Roman" w:hAnsi="Times New Roman" w:cs="Times New Roman"/>
+          <w:sz w:val="20"/>
+          <w:szCs w:val="20"/>
+        </w:rPr>
+        <w:t>Az eszköz JSON vagy YAML formátumban definiált API specifikációkon alapul, amelyekből automatikusan generál interaktív dokumentációt és kliens könyvtárakat.</w:t>
+      </w:r>
+    </w:p>
+    <w:p>
+      <w:pPr>
+        <w:rPr>
+          <w:rFonts w:ascii="Times New Roman" w:hAnsi="Times New Roman" w:cs="Times New Roman"/>
+          <w:sz w:val="20"/>
+          <w:szCs w:val="20"/>
+        </w:rPr>
+      </w:pPr>
+    </w:p>
+    <w:p>
+      <w:pPr>
+        <w:rPr>
+          <w:rFonts w:ascii="Times New Roman" w:hAnsi="Times New Roman" w:cs="Times New Roman"/>
+          <w:sz w:val="20"/>
+          <w:szCs w:val="20"/>
+        </w:rPr>
+      </w:pPr>
+      <w:r>
+        <w:rPr>
+          <w:rFonts w:ascii="Times New Roman" w:hAnsi="Times New Roman" w:cs="Times New Roman"/>
+          <w:sz w:val="20"/>
+          <w:szCs w:val="20"/>
+        </w:rPr>
+        <w:t>## Technológiai háttér</w:t>
+      </w:r>
+    </w:p>
+    <w:p>
+      <w:pPr>
+        <w:rPr>
+          <w:rFonts w:ascii="Times New Roman" w:hAnsi="Times New Roman" w:cs="Times New Roman"/>
+          <w:sz w:val="20"/>
+          <w:szCs w:val="20"/>
+        </w:rPr>
+      </w:pPr>
+    </w:p>
+    <w:p>
+      <w:pPr>
+        <w:rPr>
+          <w:rFonts w:ascii="Times New Roman" w:hAnsi="Times New Roman" w:cs="Times New Roman"/>
+          <w:sz w:val="20"/>
+          <w:szCs w:val="20"/>
+        </w:rPr>
+      </w:pPr>
+      <w:r>
+        <w:rPr>
+          <w:rFonts w:ascii="Times New Roman" w:hAnsi="Times New Roman" w:cs="Times New Roman"/>
+          <w:sz w:val="20"/>
+          <w:szCs w:val="20"/>
+        </w:rPr>
+        <w:t>Működési folyamat:</w:t>
+      </w:r>
+    </w:p>
+    <w:p>
+      <w:pPr>
+        <w:rPr>
+          <w:rFonts w:ascii="Times New Roman" w:hAnsi="Times New Roman" w:cs="Times New Roman"/>
+          <w:sz w:val="20"/>
+          <w:szCs w:val="20"/>
+        </w:rPr>
+      </w:pPr>
+      <w:r>
+        <w:rPr>
+          <w:rFonts w:ascii="Times New Roman" w:hAnsi="Times New Roman" w:cs="Times New Roman"/>
+          <w:sz w:val="20"/>
+          <w:szCs w:val="20"/>
+        </w:rPr>
+        <w:t>1. API specifikáció definiálása</w:t>
+      </w:r>
+    </w:p>
+    <w:p>
+      <w:pPr>
+        <w:rPr>
+          <w:rFonts w:ascii="Times New Roman" w:hAnsi="Times New Roman" w:cs="Times New Roman"/>
+          <w:sz w:val="20"/>
+          <w:szCs w:val="20"/>
+        </w:rPr>
+      </w:pPr>
+      <w:r>
+        <w:rPr>
+          <w:rFonts w:ascii="Times New Roman" w:hAnsi="Times New Roman" w:cs="Times New Roman"/>
+          <w:sz w:val="20"/>
+          <w:szCs w:val="20"/>
+        </w:rPr>
+        <w:t>2. Dokumentáció automatikus generálása</w:t>
+      </w:r>
+    </w:p>
+    <w:p>
+      <w:pPr>
+        <w:rPr>
+          <w:rFonts w:ascii="Times New Roman" w:hAnsi="Times New Roman" w:cs="Times New Roman"/>
+          <w:sz w:val="20"/>
+          <w:szCs w:val="20"/>
+        </w:rPr>
+      </w:pPr>
+      <w:r>
+        <w:rPr>
+          <w:rFonts w:ascii="Times New Roman" w:hAnsi="Times New Roman" w:cs="Times New Roman"/>
+          <w:sz w:val="20"/>
+          <w:szCs w:val="20"/>
+        </w:rPr>
+        <w:t>3. Interaktív API felület létrehozása</w:t>
+      </w:r>
+    </w:p>
+    <w:p>
+      <w:pPr>
+        <w:rPr>
+          <w:rFonts w:ascii="Times New Roman" w:hAnsi="Times New Roman" w:cs="Times New Roman"/>
+          <w:sz w:val="20"/>
+          <w:szCs w:val="20"/>
+        </w:rPr>
+      </w:pPr>
+      <w:r>
+        <w:rPr>
+          <w:rFonts w:ascii="Times New Roman" w:hAnsi="Times New Roman" w:cs="Times New Roman"/>
+          <w:sz w:val="20"/>
+          <w:szCs w:val="20"/>
+        </w:rPr>
+        <w:t>4. Kliens kód generálása különböző nyelvekhez</w:t>
+      </w:r>
+    </w:p>
+    <w:p>
+      <w:pPr>
+        <w:rPr>
+          <w:rFonts w:ascii="Times New Roman" w:hAnsi="Times New Roman" w:cs="Times New Roman"/>
+          <w:sz w:val="20"/>
+          <w:szCs w:val="20"/>
+        </w:rPr>
+      </w:pPr>
+      <w:r>
+        <w:rPr>
+          <w:rFonts w:ascii="Times New Roman" w:hAnsi="Times New Roman" w:cs="Times New Roman"/>
+          <w:sz w:val="20"/>
+          <w:szCs w:val="20"/>
+        </w:rPr>
+        <w:t>5. API tesztelési környezet biztosítása</w:t>
+      </w:r>
+    </w:p>
+    <w:p>
+      <w:pPr>
+        <w:rPr>
+          <w:rFonts w:ascii="Times New Roman" w:hAnsi="Times New Roman" w:cs="Times New Roman"/>
+          <w:sz w:val="20"/>
+          <w:szCs w:val="20"/>
+        </w:rPr>
+      </w:pPr>
+    </w:p>
+    <w:p>
+      <w:pPr>
+        <w:rPr>
+          <w:rFonts w:ascii="Times New Roman" w:hAnsi="Times New Roman" w:cs="Times New Roman"/>
+          <w:sz w:val="20"/>
+          <w:szCs w:val="20"/>
+        </w:rPr>
+      </w:pPr>
+      <w:r>
+        <w:rPr>
+          <w:rFonts w:ascii="Times New Roman" w:hAnsi="Times New Roman" w:cs="Times New Roman"/>
+          <w:sz w:val="20"/>
+          <w:szCs w:val="20"/>
+        </w:rPr>
+        <w:t>## Alapvető funkcionalitás</w:t>
+      </w:r>
+    </w:p>
+    <w:p>
+      <w:pPr>
+        <w:rPr>
+          <w:rFonts w:ascii="Times New Roman" w:hAnsi="Times New Roman" w:cs="Times New Roman"/>
+          <w:sz w:val="20"/>
+          <w:szCs w:val="20"/>
+        </w:rPr>
+      </w:pPr>
+    </w:p>
+    <w:p>
+      <w:pPr>
+        <w:rPr>
+          <w:rFonts w:ascii="Times New Roman" w:hAnsi="Times New Roman" w:cs="Times New Roman"/>
+          <w:sz w:val="20"/>
+          <w:szCs w:val="20"/>
+        </w:rPr>
+      </w:pPr>
+      <w:r>
+        <w:rPr>
+          <w:rFonts w:ascii="Times New Roman" w:hAnsi="Times New Roman" w:cs="Times New Roman"/>
+          <w:sz w:val="20"/>
+          <w:szCs w:val="20"/>
+        </w:rPr>
+        <w:t>Fő jellemzők:</w:t>
+      </w:r>
+    </w:p>
+    <w:p>
+      <w:pPr>
+        <w:rPr>
+          <w:rFonts w:ascii="Times New Roman" w:hAnsi="Times New Roman" w:cs="Times New Roman"/>
+          <w:sz w:val="20"/>
+          <w:szCs w:val="20"/>
+        </w:rPr>
+      </w:pPr>
+      <w:r>
+        <w:rPr>
+          <w:rFonts w:ascii="Times New Roman" w:hAnsi="Times New Roman" w:cs="Times New Roman"/>
+          <w:sz w:val="20"/>
+          <w:szCs w:val="20"/>
+        </w:rPr>
+        <w:t>- Interaktív API dokumentáció</w:t>
+      </w:r>
+    </w:p>
+    <w:p>
+      <w:pPr>
+        <w:rPr>
+          <w:rFonts w:ascii="Times New Roman" w:hAnsi="Times New Roman" w:cs="Times New Roman"/>
+          <w:sz w:val="20"/>
+          <w:szCs w:val="20"/>
+        </w:rPr>
+      </w:pPr>
+      <w:r>
+        <w:rPr>
+          <w:rFonts w:ascii="Times New Roman" w:hAnsi="Times New Roman" w:cs="Times New Roman"/>
+          <w:sz w:val="20"/>
+          <w:szCs w:val="20"/>
+        </w:rPr>
+        <w:t xml:space="preserve">- </w:t>
+      </w:r>
+      <w:proofErr w:type="spellStart"/>
+      <w:r>
+        <w:rPr>
+          <w:rFonts w:ascii="Times New Roman" w:hAnsi="Times New Roman" w:cs="Times New Roman"/>
+          <w:sz w:val="20"/>
+          <w:szCs w:val="20"/>
+        </w:rPr>
+        <w:t>Endpoint</w:t>
+      </w:r>
+      <w:proofErr w:type="spellEnd"/>
+      <w:r>
+        <w:rPr>
+          <w:rFonts w:ascii="Times New Roman" w:hAnsi="Times New Roman" w:cs="Times New Roman"/>
+          <w:sz w:val="20"/>
+          <w:szCs w:val="20"/>
+        </w:rPr>
+        <w:t xml:space="preserve"> tesztelési lehetőség</w:t>
+      </w:r>
+    </w:p>
+    <w:p>
+      <w:pPr>
+        <w:rPr>
+          <w:rFonts w:ascii="Times New Roman" w:hAnsi="Times New Roman" w:cs="Times New Roman"/>
+          <w:sz w:val="20"/>
+          <w:szCs w:val="20"/>
+        </w:rPr>
+      </w:pPr>
+      <w:r>
+        <w:rPr>
+          <w:rFonts w:ascii="Times New Roman" w:hAnsi="Times New Roman" w:cs="Times New Roman"/>
+          <w:sz w:val="20"/>
+          <w:szCs w:val="20"/>
+        </w:rPr>
+        <w:t>- Automatikus kódgenerálás</w:t>
+      </w:r>
+    </w:p>
+    <w:p>
+      <w:pPr>
+        <w:rPr>
+          <w:rFonts w:ascii="Times New Roman" w:hAnsi="Times New Roman" w:cs="Times New Roman"/>
+          <w:sz w:val="20"/>
+          <w:szCs w:val="20"/>
+        </w:rPr>
+      </w:pPr>
+      <w:r>
+        <w:rPr>
+          <w:rFonts w:ascii="Times New Roman" w:hAnsi="Times New Roman" w:cs="Times New Roman"/>
+          <w:sz w:val="20"/>
+          <w:szCs w:val="20"/>
+        </w:rPr>
+        <w:t xml:space="preserve">- </w:t>
+      </w:r>
+      <w:proofErr w:type="spellStart"/>
+      <w:r>
+        <w:rPr>
+          <w:rFonts w:ascii="Times New Roman" w:hAnsi="Times New Roman" w:cs="Times New Roman"/>
+          <w:sz w:val="20"/>
+          <w:szCs w:val="20"/>
+        </w:rPr>
+        <w:t>Schema</w:t>
+      </w:r>
+      <w:proofErr w:type="spellEnd"/>
+      <w:r>
+        <w:rPr>
+          <w:rFonts w:ascii="Times New Roman" w:hAnsi="Times New Roman" w:cs="Times New Roman"/>
+          <w:sz w:val="20"/>
+          <w:szCs w:val="20"/>
+        </w:rPr>
+        <w:t xml:space="preserve"> validáció</w:t>
+      </w:r>
+    </w:p>
+    <w:p>
+      <w:pPr>
+        <w:rPr>
+          <w:rFonts w:ascii="Times New Roman" w:hAnsi="Times New Roman" w:cs="Times New Roman"/>
+          <w:sz w:val="20"/>
+          <w:szCs w:val="20"/>
+        </w:rPr>
+      </w:pPr>
+      <w:r>
+        <w:rPr>
+          <w:rFonts w:ascii="Times New Roman" w:hAnsi="Times New Roman" w:cs="Times New Roman"/>
+          <w:sz w:val="20"/>
+          <w:szCs w:val="20"/>
+        </w:rPr>
+        <w:t xml:space="preserve">- </w:t>
+      </w:r>
+      <w:proofErr w:type="spellStart"/>
+      <w:r>
+        <w:rPr>
+          <w:rFonts w:ascii="Times New Roman" w:hAnsi="Times New Roman" w:cs="Times New Roman"/>
+          <w:sz w:val="20"/>
+          <w:szCs w:val="20"/>
+        </w:rPr>
+        <w:t>OAuth</w:t>
+      </w:r>
+      <w:proofErr w:type="spellEnd"/>
+      <w:r>
+        <w:rPr>
+          <w:rFonts w:ascii="Times New Roman" w:hAnsi="Times New Roman" w:cs="Times New Roman"/>
+          <w:sz w:val="20"/>
+          <w:szCs w:val="20"/>
+        </w:rPr>
+        <w:t xml:space="preserve"> és más </w:t>
+      </w:r>
+      <w:proofErr w:type="spellStart"/>
+      <w:r>
+        <w:rPr>
+          <w:rFonts w:ascii="Times New Roman" w:hAnsi="Times New Roman" w:cs="Times New Roman"/>
+          <w:sz w:val="20"/>
+          <w:szCs w:val="20"/>
+        </w:rPr>
+        <w:t>autentikációs</w:t>
+      </w:r>
+      <w:proofErr w:type="spellEnd"/>
+      <w:r>
+        <w:rPr>
+          <w:rFonts w:ascii="Times New Roman" w:hAnsi="Times New Roman" w:cs="Times New Roman"/>
+          <w:sz w:val="20"/>
+          <w:szCs w:val="20"/>
+        </w:rPr>
+        <w:t xml:space="preserve"> módszerek támogatása</w:t>
+      </w:r>
+    </w:p>
+    <w:p>
+      <w:pPr>
+        <w:rPr>
+          <w:rFonts w:ascii="Times New Roman" w:hAnsi="Times New Roman" w:cs="Times New Roman"/>
+          <w:sz w:val="20"/>
+          <w:szCs w:val="20"/>
+        </w:rPr>
+      </w:pPr>
+    </w:p>
+    <w:p>
+      <w:pPr>
+        <w:rPr>
+          <w:rFonts w:ascii="Times New Roman" w:hAnsi="Times New Roman" w:cs="Times New Roman"/>
+          <w:sz w:val="20"/>
+          <w:szCs w:val="20"/>
+        </w:rPr>
+      </w:pPr>
+      <w:r>
+        <w:rPr>
+          <w:rFonts w:ascii="Times New Roman" w:hAnsi="Times New Roman" w:cs="Times New Roman"/>
+          <w:sz w:val="20"/>
+          <w:szCs w:val="20"/>
+        </w:rPr>
+        <w:t>## Integráció más technológiákkal</w:t>
+      </w:r>
+    </w:p>
+    <w:p>
+      <w:pPr>
+        <w:rPr>
+          <w:rFonts w:ascii="Times New Roman" w:hAnsi="Times New Roman" w:cs="Times New Roman"/>
+          <w:sz w:val="20"/>
+          <w:szCs w:val="20"/>
+        </w:rPr>
+      </w:pPr>
+    </w:p>
+    <w:p>
+      <w:pPr>
+        <w:rPr>
+          <w:rFonts w:ascii="Times New Roman" w:hAnsi="Times New Roman" w:cs="Times New Roman"/>
+          <w:sz w:val="20"/>
+          <w:szCs w:val="20"/>
+        </w:rPr>
+      </w:pPr>
+      <w:r>
+        <w:rPr>
+          <w:rFonts w:ascii="Times New Roman" w:hAnsi="Times New Roman" w:cs="Times New Roman"/>
+          <w:sz w:val="20"/>
+          <w:szCs w:val="20"/>
+        </w:rPr>
+        <w:t>Kapcsolódási pontok:</w:t>
+      </w:r>
+    </w:p>
+    <w:p>
+      <w:pPr>
+        <w:rPr>
+          <w:rFonts w:ascii="Times New Roman" w:hAnsi="Times New Roman" w:cs="Times New Roman"/>
+          <w:sz w:val="20"/>
+          <w:szCs w:val="20"/>
+        </w:rPr>
+      </w:pPr>
+      <w:r>
+        <w:rPr>
+          <w:rFonts w:ascii="Times New Roman" w:hAnsi="Times New Roman" w:cs="Times New Roman"/>
+          <w:sz w:val="20"/>
+          <w:szCs w:val="20"/>
+        </w:rPr>
+        <w:t>- .NET Core/ASP.NET</w:t>
+      </w:r>
+    </w:p>
+    <w:p>
+      <w:pPr>
+        <w:rPr>
+          <w:rFonts w:ascii="Times New Roman" w:hAnsi="Times New Roman" w:cs="Times New Roman"/>
+          <w:sz w:val="20"/>
+          <w:szCs w:val="20"/>
+        </w:rPr>
+      </w:pPr>
+      <w:r>
+        <w:rPr>
+          <w:rFonts w:ascii="Times New Roman" w:hAnsi="Times New Roman" w:cs="Times New Roman"/>
+          <w:sz w:val="20"/>
+          <w:szCs w:val="20"/>
+        </w:rPr>
+        <w:lastRenderedPageBreak/>
+        <w:t>- Node.js</w:t>
+      </w:r>
+    </w:p>
+    <w:p>
+      <w:pPr>
+        <w:rPr>
+          <w:rFonts w:ascii="Times New Roman" w:hAnsi="Times New Roman" w:cs="Times New Roman"/>
+          <w:sz w:val="20"/>
+          <w:szCs w:val="20"/>
+        </w:rPr>
+      </w:pPr>
+      <w:r>
+        <w:rPr>
+          <w:rFonts w:ascii="Times New Roman" w:hAnsi="Times New Roman" w:cs="Times New Roman"/>
+          <w:sz w:val="20"/>
+          <w:szCs w:val="20"/>
+        </w:rPr>
+        <w:t>- Java Spring</w:t>
+      </w:r>
+    </w:p>
+    <w:p>
+      <w:pPr>
+        <w:rPr>
+          <w:rFonts w:ascii="Times New Roman" w:hAnsi="Times New Roman" w:cs="Times New Roman"/>
+          <w:sz w:val="20"/>
+          <w:szCs w:val="20"/>
+        </w:rPr>
+      </w:pPr>
+      <w:r>
+        <w:rPr>
+          <w:rFonts w:ascii="Times New Roman" w:hAnsi="Times New Roman" w:cs="Times New Roman"/>
+          <w:sz w:val="20"/>
+          <w:szCs w:val="20"/>
+        </w:rPr>
+        <w:t xml:space="preserve">- Python </w:t>
+      </w:r>
+      <w:proofErr w:type="spellStart"/>
+      <w:r>
+        <w:rPr>
+          <w:rFonts w:ascii="Times New Roman" w:hAnsi="Times New Roman" w:cs="Times New Roman"/>
+          <w:sz w:val="20"/>
+          <w:szCs w:val="20"/>
+        </w:rPr>
+        <w:t>Flask</w:t>
+      </w:r>
+      <w:proofErr w:type="spellEnd"/>
+      <w:r>
+        <w:rPr>
+          <w:rFonts w:ascii="Times New Roman" w:hAnsi="Times New Roman" w:cs="Times New Roman"/>
+          <w:sz w:val="20"/>
+          <w:szCs w:val="20"/>
+        </w:rPr>
+        <w:t>/</w:t>
+      </w:r>
+      <w:proofErr w:type="spellStart"/>
+      <w:r>
+        <w:rPr>
+          <w:rFonts w:ascii="Times New Roman" w:hAnsi="Times New Roman" w:cs="Times New Roman"/>
+          <w:sz w:val="20"/>
+          <w:szCs w:val="20"/>
+        </w:rPr>
+        <w:t>Django</w:t>
+      </w:r>
+      <w:proofErr w:type="spellEnd"/>
+    </w:p>
+    <w:p>
+      <w:pPr>
+        <w:rPr>
+          <w:rFonts w:ascii="Times New Roman" w:hAnsi="Times New Roman" w:cs="Times New Roman"/>
+          <w:sz w:val="20"/>
+          <w:szCs w:val="20"/>
+        </w:rPr>
+      </w:pPr>
+      <w:r>
+        <w:rPr>
+          <w:rFonts w:ascii="Times New Roman" w:hAnsi="Times New Roman" w:cs="Times New Roman"/>
+          <w:sz w:val="20"/>
+          <w:szCs w:val="20"/>
+        </w:rPr>
+        <w:t>- CI/CD rendszerek</w:t>
+      </w:r>
+    </w:p>
+    <w:p>
+      <w:pPr>
+        <w:rPr>
+          <w:rFonts w:ascii="Times New Roman" w:hAnsi="Times New Roman" w:cs="Times New Roman"/>
+          <w:sz w:val="20"/>
+          <w:szCs w:val="20"/>
+        </w:rPr>
+      </w:pPr>
+    </w:p>
+    <w:p>
+      <w:pPr>
+        <w:rPr>
+          <w:rFonts w:ascii="Times New Roman" w:hAnsi="Times New Roman" w:cs="Times New Roman"/>
+          <w:sz w:val="20"/>
+          <w:szCs w:val="20"/>
+        </w:rPr>
+      </w:pPr>
+      <w:r>
+        <w:rPr>
+          <w:rFonts w:ascii="Times New Roman" w:hAnsi="Times New Roman" w:cs="Times New Roman"/>
+          <w:sz w:val="20"/>
+          <w:szCs w:val="20"/>
+        </w:rPr>
+        <w:t>## Fejlesztési irányelvek</w:t>
+      </w:r>
+    </w:p>
+    <w:p>
+      <w:pPr>
+        <w:rPr>
+          <w:rFonts w:ascii="Times New Roman" w:hAnsi="Times New Roman" w:cs="Times New Roman"/>
+          <w:sz w:val="20"/>
+          <w:szCs w:val="20"/>
+        </w:rPr>
+      </w:pPr>
+    </w:p>
+    <w:p>
+      <w:pPr>
+        <w:rPr>
+          <w:rFonts w:ascii="Times New Roman" w:hAnsi="Times New Roman" w:cs="Times New Roman"/>
+          <w:sz w:val="20"/>
+          <w:szCs w:val="20"/>
+        </w:rPr>
+      </w:pPr>
+      <w:r>
+        <w:rPr>
+          <w:rFonts w:ascii="Times New Roman" w:hAnsi="Times New Roman" w:cs="Times New Roman"/>
+          <w:sz w:val="20"/>
+          <w:szCs w:val="20"/>
+        </w:rPr>
+        <w:t>Ajánlott gyakorlatok:</w:t>
+      </w:r>
+    </w:p>
+    <w:p>
+      <w:pPr>
+        <w:rPr>
+          <w:rFonts w:ascii="Times New Roman" w:hAnsi="Times New Roman" w:cs="Times New Roman"/>
+          <w:sz w:val="20"/>
+          <w:szCs w:val="20"/>
+        </w:rPr>
+      </w:pPr>
+      <w:r>
+        <w:rPr>
+          <w:rFonts w:ascii="Times New Roman" w:hAnsi="Times New Roman" w:cs="Times New Roman"/>
+          <w:sz w:val="20"/>
+          <w:szCs w:val="20"/>
+        </w:rPr>
+        <w:t>- API verziókezelés</w:t>
+      </w:r>
+    </w:p>
+    <w:p>
+      <w:pPr>
+        <w:rPr>
+          <w:rFonts w:ascii="Times New Roman" w:hAnsi="Times New Roman" w:cs="Times New Roman"/>
+          <w:sz w:val="20"/>
+          <w:szCs w:val="20"/>
+        </w:rPr>
+      </w:pPr>
+      <w:r>
+        <w:rPr>
+          <w:rFonts w:ascii="Times New Roman" w:hAnsi="Times New Roman" w:cs="Times New Roman"/>
+          <w:sz w:val="20"/>
+          <w:szCs w:val="20"/>
+        </w:rPr>
+        <w:t>- Részletes paraméter dokumentáció</w:t>
+      </w:r>
+    </w:p>
+    <w:p>
+      <w:pPr>
+        <w:rPr>
+          <w:rFonts w:ascii="Times New Roman" w:hAnsi="Times New Roman" w:cs="Times New Roman"/>
+          <w:sz w:val="20"/>
+          <w:szCs w:val="20"/>
+        </w:rPr>
+      </w:pPr>
+      <w:r>
+        <w:rPr>
+          <w:rFonts w:ascii="Times New Roman" w:hAnsi="Times New Roman" w:cs="Times New Roman"/>
+          <w:sz w:val="20"/>
+          <w:szCs w:val="20"/>
+        </w:rPr>
+        <w:t>- Példák és tesztesetek definiálása</w:t>
+      </w:r>
+    </w:p>
+    <w:p>
+      <w:pPr>
+        <w:rPr>
+          <w:rFonts w:ascii="Times New Roman" w:hAnsi="Times New Roman" w:cs="Times New Roman"/>
+          <w:sz w:val="20"/>
+          <w:szCs w:val="20"/>
+        </w:rPr>
+      </w:pPr>
+      <w:r>
+        <w:rPr>
+          <w:rFonts w:ascii="Times New Roman" w:hAnsi="Times New Roman" w:cs="Times New Roman"/>
+          <w:sz w:val="20"/>
+          <w:szCs w:val="20"/>
+        </w:rPr>
+        <w:t>- Biztonsági konfigurációk</w:t>
+      </w:r>
+    </w:p>
+    <w:p>
+      <w:pPr>
+        <w:rPr>
+          <w:rFonts w:ascii="Times New Roman" w:hAnsi="Times New Roman" w:cs="Times New Roman"/>
+          <w:sz w:val="20"/>
+          <w:szCs w:val="20"/>
+        </w:rPr>
+      </w:pPr>
+      <w:r>
+        <w:rPr>
+          <w:rFonts w:ascii="Times New Roman" w:hAnsi="Times New Roman" w:cs="Times New Roman"/>
+          <w:sz w:val="20"/>
+          <w:szCs w:val="20"/>
+        </w:rPr>
+        <w:t>- Szabványos hibakezelés</w:t>
+      </w:r>
+    </w:p>
+    <w:p>
+      <w:pPr>
+        <w:rPr>
+          <w:rFonts w:ascii="Times New Roman" w:hAnsi="Times New Roman" w:cs="Times New Roman"/>
+          <w:sz w:val="20"/>
+          <w:szCs w:val="20"/>
+        </w:rPr>
+      </w:pPr>
+    </w:p>
+    <w:p>
+      <w:pPr>
+        <w:rPr>
+          <w:rFonts w:ascii="Times New Roman" w:hAnsi="Times New Roman" w:cs="Times New Roman"/>
+          <w:sz w:val="20"/>
+          <w:szCs w:val="20"/>
+        </w:rPr>
+      </w:pPr>
+      <w:r>
+        <w:rPr>
+          <w:rFonts w:ascii="Times New Roman" w:hAnsi="Times New Roman" w:cs="Times New Roman"/>
+          <w:sz w:val="20"/>
+          <w:szCs w:val="20"/>
+        </w:rPr>
+        <w:t>## Következtetés</w:t>
+      </w:r>
+    </w:p>
+    <w:p>
+      <w:pPr>
+        <w:rPr>
+          <w:rFonts w:ascii="Times New Roman" w:hAnsi="Times New Roman" w:cs="Times New Roman"/>
+          <w:sz w:val="20"/>
+          <w:szCs w:val="20"/>
+        </w:rPr>
+      </w:pPr>
+    </w:p>
+    <w:p>
+      <w:pPr>
+        <w:rPr>
+          <w:rFonts w:ascii="Times New Roman" w:hAnsi="Times New Roman" w:cs="Times New Roman"/>
+          <w:sz w:val="20"/>
+          <w:szCs w:val="20"/>
+        </w:rPr>
+      </w:pPr>
+      <w:r>
+        <w:rPr>
+          <w:rFonts w:ascii="Times New Roman" w:hAnsi="Times New Roman" w:cs="Times New Roman"/>
+          <w:sz w:val="20"/>
+          <w:szCs w:val="20"/>
+        </w:rPr>
+        <w:t>A Swagger nélkülözhetetlen eszköz modern API fejlesztéshez, amely jelentősen megkönnyíti a dokumentációt és a fejlesztőcsapatok közötti együttműködést.</w:t>
+      </w:r>
+    </w:p>
+    <w:p>
+      <w:pPr>
+        <w:rPr>
+          <w:rFonts w:ascii="Times New Roman" w:hAnsi="Times New Roman" w:cs="Times New Roman"/>
+          <w:sz w:val="20"/>
+          <w:szCs w:val="20"/>
+        </w:rPr>
+      </w:pPr>
+      <w:r>
+        <w:rPr>
+          <w:rFonts w:ascii="Times New Roman" w:hAnsi="Times New Roman" w:cs="Times New Roman"/>
+          <w:sz w:val="20"/>
+          <w:szCs w:val="20"/>
+        </w:rPr>
+        <w:br w:type="page"/>
+      </w:r>
+    </w:p>
+    <w:p>
+      <w:pPr>
+        <w:rPr>
+          <w:rFonts w:ascii="Times New Roman" w:hAnsi="Times New Roman" w:cs="Times New Roman"/>
+          <w:sz w:val="20"/>
+          <w:szCs w:val="20"/>
+        </w:rPr>
+      </w:pPr>
+    </w:p>
+    <w:p>
+      <w:pPr>
+        <w:rPr>
+          <w:rFonts w:ascii="Times New Roman" w:hAnsi="Times New Roman" w:cs="Times New Roman"/>
+          <w:sz w:val="20"/>
+          <w:szCs w:val="20"/>
+        </w:rPr>
+      </w:pPr>
+      <w:r>
+        <w:rPr>
+          <w:rFonts w:ascii="Times New Roman" w:hAnsi="Times New Roman" w:cs="Times New Roman"/>
+          <w:sz w:val="20"/>
+          <w:szCs w:val="20"/>
+        </w:rPr>
+        <w:br w:type="page"/>
+      </w:r>
+      <w:r>
+        <w:rPr>
+          <w:rFonts w:ascii="Times New Roman" w:hAnsi="Times New Roman" w:cs="Times New Roman"/>
+          <w:sz w:val="20"/>
+          <w:szCs w:val="20"/>
+        </w:rPr>
+        <w:lastRenderedPageBreak/>
+        <w:t># phpMyAdmin fejlesztőeszköz összefoglaló</w:t>
+      </w:r>
+    </w:p>
+    <w:p>
+      <w:pPr>
+        <w:rPr>
+          <w:rFonts w:ascii="Times New Roman" w:hAnsi="Times New Roman" w:cs="Times New Roman"/>
+          <w:sz w:val="20"/>
+          <w:szCs w:val="20"/>
+        </w:rPr>
+      </w:pPr>
+    </w:p>
+    <w:p>
+      <w:pPr>
+        <w:rPr>
+          <w:rFonts w:ascii="Times New Roman" w:hAnsi="Times New Roman" w:cs="Times New Roman"/>
+          <w:sz w:val="20"/>
+          <w:szCs w:val="20"/>
+        </w:rPr>
+      </w:pPr>
+      <w:r>
+        <w:rPr>
+          <w:rFonts w:ascii="Times New Roman" w:hAnsi="Times New Roman" w:cs="Times New Roman"/>
+          <w:sz w:val="20"/>
+          <w:szCs w:val="20"/>
+        </w:rPr>
+        <w:t>## Bevezetés</w:t>
+      </w:r>
+    </w:p>
+    <w:p>
+      <w:pPr>
+        <w:rPr>
+          <w:rFonts w:ascii="Times New Roman" w:hAnsi="Times New Roman" w:cs="Times New Roman"/>
+          <w:sz w:val="20"/>
+          <w:szCs w:val="20"/>
+        </w:rPr>
+      </w:pPr>
+    </w:p>
+    <w:p>
+      <w:pPr>
+        <w:rPr>
+          <w:rFonts w:ascii="Times New Roman" w:hAnsi="Times New Roman" w:cs="Times New Roman"/>
+          <w:sz w:val="20"/>
+          <w:szCs w:val="20"/>
+        </w:rPr>
+      </w:pPr>
+      <w:r>
+        <w:rPr>
+          <w:rFonts w:ascii="Times New Roman" w:hAnsi="Times New Roman" w:cs="Times New Roman"/>
+          <w:sz w:val="20"/>
+          <w:szCs w:val="20"/>
+        </w:rPr>
+        <w:t>A phpMyAdmin egy nyílt forráskódú webes felülettel rendelkező MySQL/</w:t>
+      </w:r>
+      <w:proofErr w:type="spellStart"/>
+      <w:r>
+        <w:rPr>
+          <w:rFonts w:ascii="Times New Roman" w:hAnsi="Times New Roman" w:cs="Times New Roman"/>
+          <w:sz w:val="20"/>
+          <w:szCs w:val="20"/>
+        </w:rPr>
+        <w:t>MariaDB</w:t>
+      </w:r>
+      <w:proofErr w:type="spellEnd"/>
+      <w:r>
+        <w:rPr>
+          <w:rFonts w:ascii="Times New Roman" w:hAnsi="Times New Roman" w:cs="Times New Roman"/>
+          <w:sz w:val="20"/>
+          <w:szCs w:val="20"/>
+        </w:rPr>
+        <w:t xml:space="preserve"> adatbázis-kezelő eszköz, amely egyszerűsíti az adatbázisok adminisztrációját.</w:t>
+      </w:r>
+    </w:p>
+    <w:p>
+      <w:pPr>
+        <w:rPr>
+          <w:rFonts w:ascii="Times New Roman" w:hAnsi="Times New Roman" w:cs="Times New Roman"/>
+          <w:sz w:val="20"/>
+          <w:szCs w:val="20"/>
+        </w:rPr>
+      </w:pPr>
+    </w:p>
+    <w:p>
+      <w:pPr>
+        <w:rPr>
+          <w:rFonts w:ascii="Times New Roman" w:hAnsi="Times New Roman" w:cs="Times New Roman"/>
+          <w:sz w:val="20"/>
+          <w:szCs w:val="20"/>
+        </w:rPr>
+      </w:pPr>
+      <w:r>
+        <w:rPr>
+          <w:rFonts w:ascii="Times New Roman" w:hAnsi="Times New Roman" w:cs="Times New Roman"/>
+          <w:sz w:val="20"/>
+          <w:szCs w:val="20"/>
+        </w:rPr>
+        <w:t>## Működési alapelvek</w:t>
+      </w:r>
+    </w:p>
+    <w:p>
+      <w:pPr>
+        <w:rPr>
+          <w:rFonts w:ascii="Times New Roman" w:hAnsi="Times New Roman" w:cs="Times New Roman"/>
+          <w:sz w:val="20"/>
+          <w:szCs w:val="20"/>
+        </w:rPr>
+      </w:pPr>
+    </w:p>
+    <w:p>
+      <w:pPr>
+        <w:rPr>
+          <w:rFonts w:ascii="Times New Roman" w:hAnsi="Times New Roman" w:cs="Times New Roman"/>
+          <w:sz w:val="20"/>
+          <w:szCs w:val="20"/>
+        </w:rPr>
+      </w:pPr>
+      <w:r>
+        <w:rPr>
+          <w:rFonts w:ascii="Times New Roman" w:hAnsi="Times New Roman" w:cs="Times New Roman"/>
+          <w:sz w:val="20"/>
+          <w:szCs w:val="20"/>
+        </w:rPr>
+        <w:t>PHP-ban írt webalkalmazásként működik, amely grafikus felületet biztosít MySQL műveletek végrehajtásához.</w:t>
+      </w:r>
+    </w:p>
+    <w:p>
+      <w:pPr>
+        <w:rPr>
+          <w:rFonts w:ascii="Times New Roman" w:hAnsi="Times New Roman" w:cs="Times New Roman"/>
+          <w:sz w:val="20"/>
+          <w:szCs w:val="20"/>
+        </w:rPr>
+      </w:pPr>
+    </w:p>
+    <w:p>
+      <w:pPr>
+        <w:rPr>
+          <w:rFonts w:ascii="Times New Roman" w:hAnsi="Times New Roman" w:cs="Times New Roman"/>
+          <w:sz w:val="20"/>
+          <w:szCs w:val="20"/>
+        </w:rPr>
+      </w:pPr>
+      <w:r>
+        <w:rPr>
+          <w:rFonts w:ascii="Times New Roman" w:hAnsi="Times New Roman" w:cs="Times New Roman"/>
+          <w:sz w:val="20"/>
+          <w:szCs w:val="20"/>
+        </w:rPr>
+        <w:t>## Technológiai háttér</w:t>
+      </w:r>
+    </w:p>
+    <w:p>
+      <w:pPr>
+        <w:rPr>
+          <w:rFonts w:ascii="Times New Roman" w:hAnsi="Times New Roman" w:cs="Times New Roman"/>
+          <w:sz w:val="20"/>
+          <w:szCs w:val="20"/>
+        </w:rPr>
+      </w:pPr>
+    </w:p>
+    <w:p>
+      <w:pPr>
+        <w:rPr>
+          <w:rFonts w:ascii="Times New Roman" w:hAnsi="Times New Roman" w:cs="Times New Roman"/>
+          <w:sz w:val="20"/>
+          <w:szCs w:val="20"/>
+        </w:rPr>
+      </w:pPr>
+      <w:r>
+        <w:rPr>
+          <w:rFonts w:ascii="Times New Roman" w:hAnsi="Times New Roman" w:cs="Times New Roman"/>
+          <w:sz w:val="20"/>
+          <w:szCs w:val="20"/>
+        </w:rPr>
+        <w:t>Működési folyamat:</w:t>
+      </w:r>
+    </w:p>
+    <w:p>
+      <w:pPr>
+        <w:rPr>
+          <w:rFonts w:ascii="Times New Roman" w:hAnsi="Times New Roman" w:cs="Times New Roman"/>
+          <w:sz w:val="20"/>
+          <w:szCs w:val="20"/>
+        </w:rPr>
+      </w:pPr>
+      <w:r>
+        <w:rPr>
+          <w:rFonts w:ascii="Times New Roman" w:hAnsi="Times New Roman" w:cs="Times New Roman"/>
+          <w:sz w:val="20"/>
+          <w:szCs w:val="20"/>
+        </w:rPr>
+        <w:t>1. Web-alapú felület biztosítása</w:t>
+      </w:r>
+    </w:p>
+    <w:p>
+      <w:pPr>
+        <w:rPr>
+          <w:rFonts w:ascii="Times New Roman" w:hAnsi="Times New Roman" w:cs="Times New Roman"/>
+          <w:sz w:val="20"/>
+          <w:szCs w:val="20"/>
+        </w:rPr>
+      </w:pPr>
+      <w:r>
+        <w:rPr>
+          <w:rFonts w:ascii="Times New Roman" w:hAnsi="Times New Roman" w:cs="Times New Roman"/>
+          <w:sz w:val="20"/>
+          <w:szCs w:val="20"/>
+        </w:rPr>
+        <w:t>2. SQL lekérdezések végrehajtása</w:t>
+      </w:r>
+    </w:p>
+    <w:p>
+      <w:pPr>
+        <w:rPr>
+          <w:rFonts w:ascii="Times New Roman" w:hAnsi="Times New Roman" w:cs="Times New Roman"/>
+          <w:sz w:val="20"/>
+          <w:szCs w:val="20"/>
+        </w:rPr>
+      </w:pPr>
+      <w:r>
+        <w:rPr>
+          <w:rFonts w:ascii="Times New Roman" w:hAnsi="Times New Roman" w:cs="Times New Roman"/>
+          <w:sz w:val="20"/>
+          <w:szCs w:val="20"/>
+        </w:rPr>
+        <w:t>3. Adatbázis struktúra kezelése</w:t>
+      </w:r>
+    </w:p>
+    <w:p>
+      <w:pPr>
+        <w:rPr>
+          <w:rFonts w:ascii="Times New Roman" w:hAnsi="Times New Roman" w:cs="Times New Roman"/>
+          <w:sz w:val="20"/>
+          <w:szCs w:val="20"/>
+        </w:rPr>
+      </w:pPr>
+      <w:r>
+        <w:rPr>
+          <w:rFonts w:ascii="Times New Roman" w:hAnsi="Times New Roman" w:cs="Times New Roman"/>
+          <w:sz w:val="20"/>
+          <w:szCs w:val="20"/>
+        </w:rPr>
+        <w:t>4. Jogosultságkezelés</w:t>
+      </w:r>
+    </w:p>
+    <w:p>
+      <w:pPr>
+        <w:rPr>
+          <w:rFonts w:ascii="Times New Roman" w:hAnsi="Times New Roman" w:cs="Times New Roman"/>
+          <w:sz w:val="20"/>
+          <w:szCs w:val="20"/>
+        </w:rPr>
+      </w:pPr>
+      <w:r>
+        <w:rPr>
+          <w:rFonts w:ascii="Times New Roman" w:hAnsi="Times New Roman" w:cs="Times New Roman"/>
+          <w:sz w:val="20"/>
+          <w:szCs w:val="20"/>
+        </w:rPr>
+        <w:t>5. Import/Export funkciók</w:t>
+      </w:r>
+    </w:p>
+    <w:p>
+      <w:pPr>
+        <w:rPr>
+          <w:rFonts w:ascii="Times New Roman" w:hAnsi="Times New Roman" w:cs="Times New Roman"/>
+          <w:sz w:val="20"/>
+          <w:szCs w:val="20"/>
+        </w:rPr>
+      </w:pPr>
+    </w:p>
+    <w:p>
+      <w:pPr>
+        <w:rPr>
+          <w:rFonts w:ascii="Times New Roman" w:hAnsi="Times New Roman" w:cs="Times New Roman"/>
+          <w:sz w:val="20"/>
+          <w:szCs w:val="20"/>
+        </w:rPr>
+      </w:pPr>
+      <w:r>
+        <w:rPr>
+          <w:rFonts w:ascii="Times New Roman" w:hAnsi="Times New Roman" w:cs="Times New Roman"/>
+          <w:sz w:val="20"/>
+          <w:szCs w:val="20"/>
+        </w:rPr>
+        <w:t>## Alapvető funkcionalitás</w:t>
+      </w:r>
+    </w:p>
+    <w:p>
+      <w:pPr>
+        <w:rPr>
+          <w:rFonts w:ascii="Times New Roman" w:hAnsi="Times New Roman" w:cs="Times New Roman"/>
+          <w:sz w:val="20"/>
+          <w:szCs w:val="20"/>
+        </w:rPr>
+      </w:pPr>
+    </w:p>
+    <w:p>
+      <w:pPr>
+        <w:rPr>
+          <w:rFonts w:ascii="Times New Roman" w:hAnsi="Times New Roman" w:cs="Times New Roman"/>
+          <w:sz w:val="20"/>
+          <w:szCs w:val="20"/>
+        </w:rPr>
+      </w:pPr>
+      <w:r>
+        <w:rPr>
+          <w:rFonts w:ascii="Times New Roman" w:hAnsi="Times New Roman" w:cs="Times New Roman"/>
+          <w:sz w:val="20"/>
+          <w:szCs w:val="20"/>
+        </w:rPr>
+        <w:t>Fő jellemzők:</w:t>
+      </w:r>
+    </w:p>
+    <w:p>
+      <w:pPr>
+        <w:rPr>
+          <w:rFonts w:ascii="Times New Roman" w:hAnsi="Times New Roman" w:cs="Times New Roman"/>
+          <w:sz w:val="20"/>
+          <w:szCs w:val="20"/>
+        </w:rPr>
+      </w:pPr>
+      <w:r>
+        <w:rPr>
+          <w:rFonts w:ascii="Times New Roman" w:hAnsi="Times New Roman" w:cs="Times New Roman"/>
+          <w:sz w:val="20"/>
+          <w:szCs w:val="20"/>
+        </w:rPr>
+        <w:t>- Vizuális adatbázis kezelés</w:t>
+      </w:r>
+    </w:p>
+    <w:p>
+      <w:pPr>
+        <w:rPr>
+          <w:rFonts w:ascii="Times New Roman" w:hAnsi="Times New Roman" w:cs="Times New Roman"/>
+          <w:sz w:val="20"/>
+          <w:szCs w:val="20"/>
+        </w:rPr>
+      </w:pPr>
+      <w:r>
+        <w:rPr>
+          <w:rFonts w:ascii="Times New Roman" w:hAnsi="Times New Roman" w:cs="Times New Roman"/>
+          <w:sz w:val="20"/>
+          <w:szCs w:val="20"/>
+        </w:rPr>
+        <w:t>- SQL lekérdezés szerkesztő</w:t>
+      </w:r>
+    </w:p>
+    <w:p>
+      <w:pPr>
+        <w:rPr>
+          <w:rFonts w:ascii="Times New Roman" w:hAnsi="Times New Roman" w:cs="Times New Roman"/>
+          <w:sz w:val="20"/>
+          <w:szCs w:val="20"/>
+        </w:rPr>
+      </w:pPr>
+      <w:r>
+        <w:rPr>
+          <w:rFonts w:ascii="Times New Roman" w:hAnsi="Times New Roman" w:cs="Times New Roman"/>
+          <w:sz w:val="20"/>
+          <w:szCs w:val="20"/>
+        </w:rPr>
+        <w:t>- Adatimport/export</w:t>
+      </w:r>
+    </w:p>
+    <w:p>
+      <w:pPr>
+        <w:rPr>
+          <w:rFonts w:ascii="Times New Roman" w:hAnsi="Times New Roman" w:cs="Times New Roman"/>
+          <w:sz w:val="20"/>
+          <w:szCs w:val="20"/>
+        </w:rPr>
+      </w:pPr>
+      <w:r>
+        <w:rPr>
+          <w:rFonts w:ascii="Times New Roman" w:hAnsi="Times New Roman" w:cs="Times New Roman"/>
+          <w:sz w:val="20"/>
+          <w:szCs w:val="20"/>
+        </w:rPr>
+        <w:t>- Felhasználókezelés</w:t>
+      </w:r>
+    </w:p>
+    <w:p>
+      <w:pPr>
+        <w:rPr>
+          <w:rFonts w:ascii="Times New Roman" w:hAnsi="Times New Roman" w:cs="Times New Roman"/>
+          <w:sz w:val="20"/>
+          <w:szCs w:val="20"/>
+        </w:rPr>
+      </w:pPr>
+      <w:r>
+        <w:rPr>
+          <w:rFonts w:ascii="Times New Roman" w:hAnsi="Times New Roman" w:cs="Times New Roman"/>
+          <w:sz w:val="20"/>
+          <w:szCs w:val="20"/>
+        </w:rPr>
+        <w:t>- Backup funkciók</w:t>
+      </w:r>
+    </w:p>
+    <w:p>
+      <w:pPr>
+        <w:rPr>
+          <w:rFonts w:ascii="Times New Roman" w:hAnsi="Times New Roman" w:cs="Times New Roman"/>
+          <w:sz w:val="20"/>
+          <w:szCs w:val="20"/>
+        </w:rPr>
+      </w:pPr>
+    </w:p>
+    <w:p>
+      <w:pPr>
+        <w:rPr>
+          <w:rFonts w:ascii="Times New Roman" w:hAnsi="Times New Roman" w:cs="Times New Roman"/>
+          <w:sz w:val="20"/>
+          <w:szCs w:val="20"/>
+        </w:rPr>
+      </w:pPr>
+      <w:r>
+        <w:rPr>
+          <w:rFonts w:ascii="Times New Roman" w:hAnsi="Times New Roman" w:cs="Times New Roman"/>
+          <w:sz w:val="20"/>
+          <w:szCs w:val="20"/>
+        </w:rPr>
+        <w:t>## Integráció más technológiákkal</w:t>
+      </w:r>
+    </w:p>
+    <w:p>
+      <w:pPr>
+        <w:rPr>
+          <w:rFonts w:ascii="Times New Roman" w:hAnsi="Times New Roman" w:cs="Times New Roman"/>
+          <w:sz w:val="20"/>
+          <w:szCs w:val="20"/>
+        </w:rPr>
+      </w:pPr>
+    </w:p>
+    <w:p>
+      <w:pPr>
+        <w:rPr>
+          <w:rFonts w:ascii="Times New Roman" w:hAnsi="Times New Roman" w:cs="Times New Roman"/>
+          <w:sz w:val="20"/>
+          <w:szCs w:val="20"/>
+        </w:rPr>
+      </w:pPr>
+      <w:r>
+        <w:rPr>
+          <w:rFonts w:ascii="Times New Roman" w:hAnsi="Times New Roman" w:cs="Times New Roman"/>
+          <w:sz w:val="20"/>
+          <w:szCs w:val="20"/>
+        </w:rPr>
+        <w:t>Kapcsolódási pontok:</w:t>
+      </w:r>
+    </w:p>
+    <w:p>
+      <w:pPr>
+        <w:rPr>
+          <w:rFonts w:ascii="Times New Roman" w:hAnsi="Times New Roman" w:cs="Times New Roman"/>
+          <w:sz w:val="20"/>
+          <w:szCs w:val="20"/>
+        </w:rPr>
+      </w:pPr>
+      <w:r>
+        <w:rPr>
+          <w:rFonts w:ascii="Times New Roman" w:hAnsi="Times New Roman" w:cs="Times New Roman"/>
+          <w:sz w:val="20"/>
+          <w:szCs w:val="20"/>
+        </w:rPr>
+        <w:t>- MySQL/</w:t>
+      </w:r>
+      <w:proofErr w:type="spellStart"/>
+      <w:r>
+        <w:rPr>
+          <w:rFonts w:ascii="Times New Roman" w:hAnsi="Times New Roman" w:cs="Times New Roman"/>
+          <w:sz w:val="20"/>
+          <w:szCs w:val="20"/>
+        </w:rPr>
+        <w:t>MariaDB</w:t>
+      </w:r>
+      <w:proofErr w:type="spellEnd"/>
+    </w:p>
+    <w:p>
+      <w:pPr>
+        <w:rPr>
+          <w:rFonts w:ascii="Times New Roman" w:hAnsi="Times New Roman" w:cs="Times New Roman"/>
+          <w:sz w:val="20"/>
+          <w:szCs w:val="20"/>
+        </w:rPr>
+      </w:pPr>
+      <w:r>
+        <w:rPr>
+          <w:rFonts w:ascii="Times New Roman" w:hAnsi="Times New Roman" w:cs="Times New Roman"/>
+          <w:sz w:val="20"/>
+          <w:szCs w:val="20"/>
+        </w:rPr>
+        <w:lastRenderedPageBreak/>
+        <w:t>- Web szerverek</w:t>
+      </w:r>
+    </w:p>
+    <w:p>
+      <w:pPr>
+        <w:rPr>
+          <w:rFonts w:ascii="Times New Roman" w:hAnsi="Times New Roman" w:cs="Times New Roman"/>
+          <w:sz w:val="20"/>
+          <w:szCs w:val="20"/>
+        </w:rPr>
+      </w:pPr>
+      <w:r>
+        <w:rPr>
+          <w:rFonts w:ascii="Times New Roman" w:hAnsi="Times New Roman" w:cs="Times New Roman"/>
+          <w:sz w:val="20"/>
+          <w:szCs w:val="20"/>
+        </w:rPr>
+        <w:t>- PHP alkalmazások</w:t>
+      </w:r>
+    </w:p>
+    <w:p>
+      <w:pPr>
+        <w:rPr>
+          <w:rFonts w:ascii="Times New Roman" w:hAnsi="Times New Roman" w:cs="Times New Roman"/>
+          <w:sz w:val="20"/>
+          <w:szCs w:val="20"/>
+        </w:rPr>
+      </w:pPr>
+      <w:r>
+        <w:rPr>
+          <w:rFonts w:ascii="Times New Roman" w:hAnsi="Times New Roman" w:cs="Times New Roman"/>
+          <w:sz w:val="20"/>
+          <w:szCs w:val="20"/>
+        </w:rPr>
+        <w:t>- Backup rendszerek</w:t>
+      </w:r>
+    </w:p>
+    <w:p>
+      <w:pPr>
+        <w:rPr>
+          <w:rFonts w:ascii="Times New Roman" w:hAnsi="Times New Roman" w:cs="Times New Roman"/>
+          <w:sz w:val="20"/>
+          <w:szCs w:val="20"/>
+        </w:rPr>
+      </w:pPr>
+      <w:r>
+        <w:rPr>
+          <w:rFonts w:ascii="Times New Roman" w:hAnsi="Times New Roman" w:cs="Times New Roman"/>
+          <w:sz w:val="20"/>
+          <w:szCs w:val="20"/>
+        </w:rPr>
+        <w:t xml:space="preserve">- </w:t>
+      </w:r>
+      <w:proofErr w:type="spellStart"/>
+      <w:r>
+        <w:rPr>
+          <w:rFonts w:ascii="Times New Roman" w:hAnsi="Times New Roman" w:cs="Times New Roman"/>
+          <w:sz w:val="20"/>
+          <w:szCs w:val="20"/>
+        </w:rPr>
+        <w:t>Hosting</w:t>
+      </w:r>
+      <w:proofErr w:type="spellEnd"/>
+      <w:r>
+        <w:rPr>
+          <w:rFonts w:ascii="Times New Roman" w:hAnsi="Times New Roman" w:cs="Times New Roman"/>
+          <w:sz w:val="20"/>
+          <w:szCs w:val="20"/>
+        </w:rPr>
+        <w:t xml:space="preserve"> szolgáltatások</w:t>
+      </w:r>
+    </w:p>
+    <w:p>
+      <w:pPr>
+        <w:rPr>
+          <w:rFonts w:ascii="Times New Roman" w:hAnsi="Times New Roman" w:cs="Times New Roman"/>
+          <w:sz w:val="20"/>
+          <w:szCs w:val="20"/>
+        </w:rPr>
+      </w:pPr>
+    </w:p>
+    <w:p>
+      <w:pPr>
+        <w:rPr>
+          <w:rFonts w:ascii="Times New Roman" w:hAnsi="Times New Roman" w:cs="Times New Roman"/>
+          <w:sz w:val="20"/>
+          <w:szCs w:val="20"/>
+        </w:rPr>
+      </w:pPr>
+      <w:r>
+        <w:rPr>
+          <w:rFonts w:ascii="Times New Roman" w:hAnsi="Times New Roman" w:cs="Times New Roman"/>
+          <w:sz w:val="20"/>
+          <w:szCs w:val="20"/>
+        </w:rPr>
+        <w:t>## Következtetés</w:t>
+      </w:r>
+    </w:p>
+    <w:p>
+      <w:pPr>
+        <w:rPr>
+          <w:rFonts w:ascii="Times New Roman" w:hAnsi="Times New Roman" w:cs="Times New Roman"/>
+          <w:sz w:val="20"/>
+          <w:szCs w:val="20"/>
+        </w:rPr>
+      </w:pPr>
+    </w:p>
+    <w:p>
+      <w:pPr>
+        <w:rPr>
+          <w:rFonts w:ascii="Times New Roman" w:hAnsi="Times New Roman" w:cs="Times New Roman"/>
+          <w:sz w:val="20"/>
+          <w:szCs w:val="20"/>
+        </w:rPr>
+      </w:pPr>
+      <w:r>
+        <w:rPr>
+          <w:rFonts w:ascii="Times New Roman" w:hAnsi="Times New Roman" w:cs="Times New Roman"/>
+          <w:sz w:val="20"/>
+          <w:szCs w:val="20"/>
+        </w:rPr>
+        <w:t>A phpMyAdmin egy megbízható és széles körben használt eszköz MySQL adatbázisok kezeléséhez, amely különösen hasznos web-alapú projektek fejlesztésénél.</w:t>
+      </w:r>
+    </w:p>
+    <w:p>
+      <w:pPr>
+        <w:rPr>
+          <w:rFonts w:ascii="Times New Roman" w:hAnsi="Times New Roman" w:cs="Times New Roman"/>
+          <w:sz w:val="20"/>
+          <w:szCs w:val="20"/>
+        </w:rPr>
+      </w:pPr>
+      <w:r>
+        <w:rPr>
+          <w:rFonts w:ascii="Times New Roman" w:hAnsi="Times New Roman" w:cs="Times New Roman"/>
+          <w:sz w:val="20"/>
+          <w:szCs w:val="20"/>
+        </w:rPr>
+        <w:t>Következtetés</w:t>
+      </w:r>
+    </w:p>
+    <w:p>
+      <w:pPr>
+        <w:rPr>
+          <w:rFonts w:ascii="Times New Roman" w:hAnsi="Times New Roman" w:cs="Times New Roman"/>
+          <w:sz w:val="20"/>
+          <w:szCs w:val="20"/>
+        </w:rPr>
+      </w:pPr>
+    </w:p>
+    <w:p>
+      <w:pPr>
+        <w:rPr>
+          <w:rFonts w:ascii="Times New Roman" w:hAnsi="Times New Roman" w:cs="Times New Roman"/>
+          <w:sz w:val="20"/>
+          <w:szCs w:val="20"/>
+        </w:rPr>
+      </w:pPr>
+      <w:r>
+        <w:rPr>
+          <w:rFonts w:ascii="Times New Roman" w:hAnsi="Times New Roman" w:cs="Times New Roman"/>
+          <w:sz w:val="20"/>
+          <w:szCs w:val="20"/>
+        </w:rPr>
+        <w:t>A VS Code egy rendkívül rugalmas és hatékony fejlesztőeszköz, amely alkalmazkodik a modern fejlesztési igényekhez és folyamatokhoz.</w:t>
+      </w:r>
     </w:p>
     <w:p>
       <w:pPr>
@@ -6555,7 +9540,7 @@
     <w:rsidRoot w:val="00BE5DE9"/>
     <w:rsid w:val="0045496F"/>
     <w:rsid w:val="00BE5DE9"/>
-    <w:rsid w:val="00C46BE9"/>
+    <w:rsid w:val="00CB6BA0"/>
   </w:rsids>
   <m:mathPr>
     <m:mathFont m:val="Cambria Math"/>

</xml_diff>

<commit_message>
atiras, nyelvi hibak javitasa
</commit_message>
<xml_diff>
--- a/Lakberendezés_Dokumentum.docx
+++ b/Lakberendezés_Dokumentum.docx
@@ -1180,7 +1180,25 @@
               <w:sz w:val="28"/>
               <w:szCs w:val="28"/>
             </w:rPr>
-            <w:t>megtervezhetjük a leendő álomszobánkat.</w:t>
+            <w:t>megtervezhetjük</w:t>
+          </w:r>
+          <w:r>
+            <w:rPr>
+              <w:rFonts w:cs="Times New Roman"/>
+              <w:color w:val="156082" w:themeColor="accent1"/>
+              <w:sz w:val="28"/>
+              <w:szCs w:val="28"/>
+            </w:rPr>
+            <w:t xml:space="preserve"> </w:t>
+          </w:r>
+          <w:r>
+            <w:rPr>
+              <w:rFonts w:cs="Times New Roman"/>
+              <w:color w:val="156082" w:themeColor="accent1"/>
+              <w:sz w:val="28"/>
+              <w:szCs w:val="28"/>
+            </w:rPr>
+            <w:t>leendő álomszobánkat.</w:t>
           </w:r>
         </w:p>
         <w:p>
@@ -1227,7 +1245,43 @@
               <w:sz w:val="28"/>
               <w:szCs w:val="28"/>
             </w:rPr>
-            <w:t xml:space="preserve">különböző szobákat, és a számtalan bútort, de ezek segítségéhez </w:t>
+            <w:t xml:space="preserve">különböző szobákat, és a </w:t>
+          </w:r>
+          <w:r>
+            <w:rPr>
+              <w:rFonts w:cs="Times New Roman"/>
+              <w:color w:val="156082" w:themeColor="accent1"/>
+              <w:sz w:val="28"/>
+              <w:szCs w:val="28"/>
+            </w:rPr>
+            <w:t xml:space="preserve">megannyi </w:t>
+          </w:r>
+          <w:r>
+            <w:rPr>
+              <w:rFonts w:cs="Times New Roman"/>
+              <w:color w:val="156082" w:themeColor="accent1"/>
+              <w:sz w:val="28"/>
+              <w:szCs w:val="28"/>
+            </w:rPr>
+            <w:t xml:space="preserve"> bútort, de ezek </w:t>
+          </w:r>
+          <w:r>
+            <w:rPr>
+              <w:rFonts w:cs="Times New Roman"/>
+              <w:color w:val="156082" w:themeColor="accent1"/>
+              <w:sz w:val="28"/>
+              <w:szCs w:val="28"/>
+            </w:rPr>
+            <w:t>megvalósításához</w:t>
+          </w:r>
+          <w:r>
+            <w:rPr>
+              <w:rFonts w:cs="Times New Roman"/>
+              <w:color w:val="156082" w:themeColor="accent1"/>
+              <w:sz w:val="28"/>
+              <w:szCs w:val="28"/>
+            </w:rPr>
+            <w:t xml:space="preserve"> </w:t>
           </w:r>
           <w:r>
             <w:rPr>
@@ -1299,7 +1353,7 @@
               <w:sz w:val="28"/>
               <w:szCs w:val="28"/>
             </w:rPr>
-            <w:t xml:space="preserve"> amikről </w:t>
+            <w:t xml:space="preserve"> amikről</w:t>
           </w:r>
           <w:r>
             <w:rPr>
@@ -1308,7 +1362,7 @@
               <w:sz w:val="28"/>
               <w:szCs w:val="28"/>
             </w:rPr>
-            <w:t>a k</w:t>
+            <w:t xml:space="preserve"> </w:t>
           </w:r>
           <w:r>
             <w:rPr>
@@ -1317,25 +1371,7 @@
               <w:sz w:val="28"/>
               <w:szCs w:val="28"/>
             </w:rPr>
-            <w:t>é</w:t>
-          </w:r>
-          <w:r>
-            <w:rPr>
-              <w:rFonts w:cs="Times New Roman"/>
-              <w:color w:val="156082" w:themeColor="accent1"/>
-              <w:sz w:val="28"/>
-              <w:szCs w:val="28"/>
-            </w:rPr>
-            <w:t>ső</w:t>
-          </w:r>
-          <w:r>
-            <w:rPr>
-              <w:rFonts w:cs="Times New Roman"/>
-              <w:color w:val="156082" w:themeColor="accent1"/>
-              <w:sz w:val="28"/>
-              <w:szCs w:val="28"/>
-            </w:rPr>
-            <w:t>bbiekben</w:t>
+            <w:t>elsősorban</w:t>
           </w:r>
           <w:r>
             <w:rPr>
@@ -1438,7 +1474,25 @@
           <w:sz w:val="26"/>
           <w:szCs w:val="26"/>
         </w:rPr>
-        <w:t xml:space="preserve"> (REACT, Axios)</w:t>
+        <w:t xml:space="preserve"> (REACT, Axios</w:t>
+      </w:r>
+      <w:r>
+        <w:rPr>
+          <w:rFonts w:cs="Times New Roman"/>
+          <w:color w:val="156082" w:themeColor="accent1"/>
+          <w:sz w:val="26"/>
+          <w:szCs w:val="26"/>
+        </w:rPr>
+        <w:t>,Craco</w:t>
+      </w:r>
+      <w:r>
+        <w:rPr>
+          <w:rFonts w:cs="Times New Roman"/>
+          <w:color w:val="156082" w:themeColor="accent1"/>
+          <w:sz w:val="26"/>
+          <w:szCs w:val="26"/>
+        </w:rPr>
+        <w:t>)</w:t>
       </w:r>
     </w:p>
     <w:p>
@@ -1643,7 +1697,7 @@
           <w:sz w:val="26"/>
           <w:szCs w:val="26"/>
         </w:rPr>
-        <w:t>Visual Studio 2022, Visual Studio code, phpMyAdmin – XAMPP, Swagger, Trello, Github</w:t>
+        <w:t>Firebase</w:t>
       </w:r>
       <w:r>
         <w:rPr>
@@ -1661,16 +1715,16 @@
           <w:sz w:val="26"/>
           <w:szCs w:val="26"/>
         </w:rPr>
-        <w:t>Firebase</w:t>
-      </w:r>
-      <w:r>
-        <w:rPr>
-          <w:rFonts w:cs="Times New Roman"/>
-          <w:color w:val="156082" w:themeColor="accent1"/>
-          <w:sz w:val="26"/>
-          <w:szCs w:val="26"/>
-        </w:rPr>
-        <w:t>, Docker</w:t>
+        <w:t xml:space="preserve">Visual Studio 2022, Visual Studio code, phpMyAdmin – XAMPP, Swagger, </w:t>
+      </w:r>
+      <w:r>
+        <w:rPr>
+          <w:rFonts w:cs="Times New Roman"/>
+          <w:color w:val="156082" w:themeColor="accent1"/>
+          <w:sz w:val="26"/>
+          <w:szCs w:val="26"/>
+        </w:rPr>
+        <w:t>Docker</w:t>
       </w:r>
       <w:r>
         <w:rPr>
@@ -1680,6 +1734,24 @@
           <w:szCs w:val="26"/>
         </w:rPr>
         <w:t>, Railway, Cloudinary</w:t>
+      </w:r>
+      <w:r>
+        <w:rPr>
+          <w:rFonts w:cs="Times New Roman"/>
+          <w:color w:val="156082" w:themeColor="accent1"/>
+          <w:sz w:val="26"/>
+          <w:szCs w:val="26"/>
+        </w:rPr>
+        <w:t xml:space="preserve">, </w:t>
+      </w:r>
+      <w:r>
+        <w:rPr>
+          <w:rFonts w:cs="Times New Roman"/>
+          <w:color w:val="156082" w:themeColor="accent1"/>
+          <w:sz w:val="26"/>
+          <w:szCs w:val="26"/>
+        </w:rPr>
+        <w:t>Trello, Github</w:t>
       </w:r>
     </w:p>
     <w:p>
@@ -1817,7 +1889,39 @@
           <w:sz w:val="26"/>
           <w:szCs w:val="26"/>
         </w:rPr>
-        <w:t>A HTML és CSS a weboldalak alapvető építőelemei. A HTML (HyperText Markup Language) felelős a tartalom szerkezetéért, míg a CSS (Cascading Style Sheets) a megjelenésért. Együtt alkotják a webes felületek vizuális és strukturális alapjait.</w:t>
+        <w:t xml:space="preserve">A HTML és CSS a weboldalak alapvető építőelemei. A HTML (HyperText Markup Language) felelős a tartalom szerkezetéért, a CSS (Cascading Style Sheets) </w:t>
+      </w:r>
+      <w:r>
+        <w:rPr>
+          <w:color w:val="156082" w:themeColor="accent1"/>
+          <w:sz w:val="26"/>
+          <w:szCs w:val="26"/>
+        </w:rPr>
+        <w:t xml:space="preserve">pedig </w:t>
+      </w:r>
+      <w:r>
+        <w:rPr>
+          <w:color w:val="156082" w:themeColor="accent1"/>
+          <w:sz w:val="26"/>
+          <w:szCs w:val="26"/>
+        </w:rPr>
+        <w:t>a megjelenésért.</w:t>
+      </w:r>
+      <w:r>
+        <w:rPr>
+          <w:color w:val="156082" w:themeColor="accent1"/>
+          <w:sz w:val="26"/>
+          <w:szCs w:val="26"/>
+        </w:rPr>
+        <w:t xml:space="preserve"> Ezek ketten </w:t>
+      </w:r>
+      <w:r>
+        <w:rPr>
+          <w:color w:val="156082" w:themeColor="accent1"/>
+          <w:sz w:val="26"/>
+          <w:szCs w:val="26"/>
+        </w:rPr>
+        <w:t>alkotják a webes felületek vizuális és strukturális alapjait.</w:t>
       </w:r>
       <w:r>
         <w:rPr>
@@ -1833,7 +1937,7 @@
           <w:sz w:val="26"/>
           <w:szCs w:val="26"/>
         </w:rPr>
-        <w:t>A HTML segítségével definiáljuk az oldal elemeit - címeket, bekezdéseket, képeket, linkeket és űrlapokat.</w:t>
+        <w:t>A HTML segítségével definiáljuk az oldal elemeit - címeket, bekezdéseket, képeket, linkeket.</w:t>
       </w:r>
       <w:r>
         <w:rPr>
@@ -1849,79 +1953,7 @@
           <w:sz w:val="26"/>
           <w:szCs w:val="26"/>
         </w:rPr>
-        <w:t>A CSS ezeket az elemeket formázza, meghatározva a színeket, betűtípusokat, méreteket és elrendezést. Lehetővé teszi reszponzív tervezést, így az oldalak jól megjeleníthetők különböző méretű képernyőkön is.</w:t>
-      </w:r>
-      <w:r>
-        <w:rPr>
-          <w:color w:val="156082" w:themeColor="accent1"/>
-          <w:sz w:val="26"/>
-          <w:szCs w:val="26"/>
-        </w:rPr>
-        <w:t xml:space="preserve"> </w:t>
-      </w:r>
-      <w:r>
-        <w:rPr>
-          <w:color w:val="156082" w:themeColor="accent1"/>
-          <w:sz w:val="26"/>
-          <w:szCs w:val="26"/>
-        </w:rPr>
-        <w:t>A</w:t>
-      </w:r>
-      <w:r>
-        <w:rPr>
-          <w:color w:val="156082" w:themeColor="accent1"/>
-          <w:sz w:val="26"/>
-          <w:szCs w:val="26"/>
-        </w:rPr>
-        <w:t xml:space="preserve"> HTML és CSS</w:t>
-      </w:r>
-      <w:r>
-        <w:rPr>
-          <w:color w:val="156082" w:themeColor="accent1"/>
-          <w:sz w:val="26"/>
-          <w:szCs w:val="26"/>
-        </w:rPr>
-        <w:t xml:space="preserve"> együtt</w:t>
-      </w:r>
-      <w:r>
-        <w:rPr>
-          <w:color w:val="156082" w:themeColor="accent1"/>
-          <w:sz w:val="26"/>
-          <w:szCs w:val="26"/>
-        </w:rPr>
-        <w:t xml:space="preserve"> teszi </w:t>
-      </w:r>
-      <w:r>
-        <w:rPr>
-          <w:color w:val="156082" w:themeColor="accent1"/>
-          <w:sz w:val="26"/>
-          <w:szCs w:val="26"/>
-        </w:rPr>
-        <w:t xml:space="preserve">lehetővé </w:t>
-      </w:r>
-      <w:r>
-        <w:rPr>
-          <w:color w:val="156082" w:themeColor="accent1"/>
-          <w:sz w:val="26"/>
-          <w:szCs w:val="26"/>
-        </w:rPr>
-        <w:t>a komplex web</w:t>
-      </w:r>
-      <w:r>
-        <w:rPr>
-          <w:color w:val="156082" w:themeColor="accent1"/>
-          <w:sz w:val="26"/>
-          <w:szCs w:val="26"/>
-        </w:rPr>
-        <w:t xml:space="preserve">es alkalmazások </w:t>
-      </w:r>
-      <w:r>
-        <w:rPr>
-          <w:color w:val="156082" w:themeColor="accent1"/>
-          <w:sz w:val="26"/>
-          <w:szCs w:val="26"/>
-        </w:rPr>
-        <w:t>létrehozását. Bár ma már számos keretrendszer és könyvtár létezik webfejlesztéshez, a HTML és CSS ismerete továbbra is alapvető követelmény minden frontend fejlesztő számára.</w:t>
+        <w:t>A CSS ezeket az elemeket formázza, meghatározva a színeket, betűtípusokat, méreteket és elrendezést. Lehetővé teszi reszponzív tervezést, így az oldalak jól megjeleníthetők különböző méretű képernyőkön is. Bár ma már számos keretrendszer és könyvtár létezik webfejlesztéshez, a HTML és CSS ismerete továbbra is alapvető követelmény minden frontend fejlesztő számára.</w:t>
       </w:r>
     </w:p>
     <w:p>
@@ -2042,7 +2074,15 @@
           <w:sz w:val="26"/>
           <w:szCs w:val="26"/>
         </w:rPr>
-        <w:t xml:space="preserve"> - gombokat, navigációs sávokat, kártyákat, űrlapokat -, amelyek mind reszponzívak és könnyen </w:t>
+        <w:t xml:space="preserve">, </w:t>
+      </w:r>
+      <w:r>
+        <w:rPr>
+          <w:color w:val="156082" w:themeColor="accent1"/>
+          <w:sz w:val="26"/>
+          <w:szCs w:val="26"/>
+        </w:rPr>
+        <w:t xml:space="preserve">gombokat, navigációs sávokat, kártyákat, űrlapokat, amelyek mind reszponzívak és könnyen </w:t>
       </w:r>
       <w:r>
         <w:rPr>
@@ -2074,7 +2114,39 @@
           <w:sz w:val="26"/>
           <w:szCs w:val="26"/>
         </w:rPr>
-        <w:t xml:space="preserve"> rendszere lehetővé teszi a tartalom pontos elhelyezését különböző képernyőméretekhez, miközben a beépített segédosztályok egyszerűsítik a margók, paddingok és színek kezelését. Bár a Bootstrap főként CSS alapú, tartalmaz néhány JavaScript plugint is a komplexebb komponensek működtetéséhez. A keretrendszer különösen hasznos </w:t>
+        <w:t xml:space="preserve"> rendszere lehetővé teszi a tartalom pontos elhelyezését különböző képernyőméretekhez, miközben a beépített segédosztályok egyszerűsítik a margók, padding</w:t>
+      </w:r>
+      <w:r>
+        <w:rPr>
+          <w:color w:val="156082" w:themeColor="accent1"/>
+          <w:sz w:val="26"/>
+          <w:szCs w:val="26"/>
+        </w:rPr>
+        <w:t>-ek (belső margó)</w:t>
+      </w:r>
+      <w:r>
+        <w:rPr>
+          <w:color w:val="156082" w:themeColor="accent1"/>
+          <w:sz w:val="26"/>
+          <w:szCs w:val="26"/>
+        </w:rPr>
+        <w:t xml:space="preserve"> és színek kezelését. A </w:t>
+      </w:r>
+      <w:r>
+        <w:rPr>
+          <w:color w:val="156082" w:themeColor="accent1"/>
+          <w:sz w:val="26"/>
+          <w:szCs w:val="26"/>
+        </w:rPr>
+        <w:t xml:space="preserve">Bootstrap </w:t>
+      </w:r>
+      <w:r>
+        <w:rPr>
+          <w:color w:val="156082" w:themeColor="accent1"/>
+          <w:sz w:val="26"/>
+          <w:szCs w:val="26"/>
+        </w:rPr>
+        <w:t xml:space="preserve">különösen hasznos </w:t>
       </w:r>
       <w:r>
         <w:rPr>
@@ -2109,7 +2181,7 @@
           <w:szCs w:val="26"/>
         </w:rPr>
         <w:drawing>
-          <wp:inline distT="0" distB="0" distL="0" distR="0" wp14:anchorId="575E4A57" wp14:editId="6CC23F1F">
+          <wp:inline distT="0" distB="0" distL="0" distR="0" wp14:anchorId="575E4A57" wp14:editId="52E11EE6">
             <wp:extent cx="5419725" cy="723900"/>
             <wp:effectExtent l="0" t="0" r="9525" b="0"/>
             <wp:docPr id="1536839375" name="Kép 8"/>
@@ -2366,56 +2438,64 @@
           <w:sz w:val="26"/>
           <w:szCs w:val="26"/>
         </w:rPr>
+        <w:t>Axios könyvtár</w:t>
+      </w:r>
+      <w:r>
+        <w:rPr>
+          <w:color w:val="156082" w:themeColor="accent1"/>
+          <w:sz w:val="26"/>
+          <w:szCs w:val="26"/>
+        </w:rPr>
+        <w:t>at</w:t>
+      </w:r>
+      <w:r>
+        <w:rPr>
+          <w:color w:val="156082" w:themeColor="accent1"/>
+          <w:sz w:val="26"/>
+          <w:szCs w:val="26"/>
+        </w:rPr>
+        <w:t xml:space="preserve"> HTTP kérések küldéséhez, </w:t>
+      </w:r>
+      <w:r>
+        <w:rPr>
+          <w:color w:val="156082" w:themeColor="accent1"/>
+          <w:sz w:val="26"/>
+          <w:szCs w:val="26"/>
+        </w:rPr>
+        <w:t>amik</w:t>
+      </w:r>
+      <w:r>
+        <w:rPr>
+          <w:color w:val="156082" w:themeColor="accent1"/>
+          <w:sz w:val="26"/>
+          <w:szCs w:val="26"/>
+        </w:rPr>
+        <w:t xml:space="preserve"> leegyszerűsíti</w:t>
+      </w:r>
+      <w:r>
+        <w:rPr>
+          <w:color w:val="156082" w:themeColor="accent1"/>
+          <w:sz w:val="26"/>
+          <w:szCs w:val="26"/>
+        </w:rPr>
+        <w:t>k</w:t>
+      </w:r>
+      <w:r>
+        <w:rPr>
+          <w:color w:val="156082" w:themeColor="accent1"/>
+          <w:sz w:val="26"/>
+          <w:szCs w:val="26"/>
+        </w:rPr>
+        <w:t xml:space="preserve"> a szerverrel való </w:t>
+      </w:r>
+      <w:r>
+        <w:rPr>
+          <w:color w:val="156082" w:themeColor="accent1"/>
+          <w:sz w:val="26"/>
+          <w:szCs w:val="26"/>
+        </w:rPr>
         <w:lastRenderedPageBreak/>
-        <w:t>Axios könyvtár</w:t>
-      </w:r>
-      <w:r>
-        <w:rPr>
-          <w:color w:val="156082" w:themeColor="accent1"/>
-          <w:sz w:val="26"/>
-          <w:szCs w:val="26"/>
-        </w:rPr>
-        <w:t>at</w:t>
-      </w:r>
-      <w:r>
-        <w:rPr>
-          <w:color w:val="156082" w:themeColor="accent1"/>
-          <w:sz w:val="26"/>
-          <w:szCs w:val="26"/>
-        </w:rPr>
-        <w:t xml:space="preserve"> HTTP kérések küldéséhez, </w:t>
-      </w:r>
-      <w:r>
-        <w:rPr>
-          <w:color w:val="156082" w:themeColor="accent1"/>
-          <w:sz w:val="26"/>
-          <w:szCs w:val="26"/>
-        </w:rPr>
-        <w:t>amik</w:t>
-      </w:r>
-      <w:r>
-        <w:rPr>
-          <w:color w:val="156082" w:themeColor="accent1"/>
-          <w:sz w:val="26"/>
-          <w:szCs w:val="26"/>
-        </w:rPr>
-        <w:t xml:space="preserve"> leegyszerűsíti</w:t>
-      </w:r>
-      <w:r>
-        <w:rPr>
-          <w:color w:val="156082" w:themeColor="accent1"/>
-          <w:sz w:val="26"/>
-          <w:szCs w:val="26"/>
-        </w:rPr>
-        <w:t>k</w:t>
-      </w:r>
-      <w:r>
-        <w:rPr>
-          <w:color w:val="156082" w:themeColor="accent1"/>
-          <w:sz w:val="26"/>
-          <w:szCs w:val="26"/>
-        </w:rPr>
-        <w:t xml:space="preserve"> a szerverrel való kommunikációt. Az Axios támogatja a CRUD</w:t>
+        <w:t>kommunikációt. Az Axios támogatja a CRUD</w:t>
       </w:r>
       <w:r>
         <w:rPr>
@@ -2431,7 +2511,47 @@
           <w:sz w:val="26"/>
           <w:szCs w:val="26"/>
         </w:rPr>
-        <w:t xml:space="preserve"> műveleteket, képes kezelni a kérések és válaszok átalakítását, és egyszerű hibakezelést biztosít. Különösen hasznos React alkalmazásokban adatok lekéréséhez vagy küldéséhez API-k felé.</w:t>
+        <w:t xml:space="preserve"> műveleteket, képes kezelni a kérések és válaszok átalakítását, és egyszerű hibakezelést biztosít. Különösen hasznos </w:t>
+      </w:r>
+      <w:r>
+        <w:rPr>
+          <w:color w:val="156082" w:themeColor="accent1"/>
+          <w:sz w:val="26"/>
+          <w:szCs w:val="26"/>
+        </w:rPr>
+        <w:t xml:space="preserve">a </w:t>
+      </w:r>
+      <w:r>
+        <w:rPr>
+          <w:color w:val="156082" w:themeColor="accent1"/>
+          <w:sz w:val="26"/>
+          <w:szCs w:val="26"/>
+        </w:rPr>
+        <w:t xml:space="preserve">React </w:t>
+      </w:r>
+      <w:r>
+        <w:rPr>
+          <w:color w:val="156082" w:themeColor="accent1"/>
+          <w:sz w:val="26"/>
+          <w:szCs w:val="26"/>
+        </w:rPr>
+        <w:t>alapú</w:t>
+      </w:r>
+      <w:r>
+        <w:rPr>
+          <w:color w:val="156082" w:themeColor="accent1"/>
+          <w:sz w:val="26"/>
+          <w:szCs w:val="26"/>
+        </w:rPr>
+        <w:t xml:space="preserve"> </w:t>
+      </w:r>
+      <w:r>
+        <w:rPr>
+          <w:color w:val="156082" w:themeColor="accent1"/>
+          <w:sz w:val="26"/>
+          <w:szCs w:val="26"/>
+        </w:rPr>
+        <w:t>alkalmazásokban adatok lekéréséhez vagy küldéséhez API-k felé.</w:t>
       </w:r>
       <w:r>
         <w:rPr>
@@ -3032,23 +3152,87 @@
           <w:sz w:val="26"/>
           <w:szCs w:val="26"/>
         </w:rPr>
-        <w:t xml:space="preserve">A Firebase egy átfogó fejlesztői platform, amely elsősorban frontend fejlesztők számára nyújt egyszerű megoldásokat backend </w:t>
-      </w:r>
-      <w:r>
-        <w:rPr>
-          <w:color w:val="156082" w:themeColor="accent1"/>
-          <w:sz w:val="26"/>
-          <w:szCs w:val="26"/>
-        </w:rPr>
-        <w:t>használata</w:t>
-      </w:r>
-      <w:r>
-        <w:rPr>
-          <w:color w:val="156082" w:themeColor="accent1"/>
-          <w:sz w:val="26"/>
-          <w:szCs w:val="26"/>
-        </w:rPr>
-        <w:t xml:space="preserve"> nélkül. A legfontosabb jellemzője, hogy</w:t>
+        <w:t>A Firebase egy átfogó fejlesztői platform, am</w:t>
+      </w:r>
+      <w:r>
+        <w:rPr>
+          <w:color w:val="156082" w:themeColor="accent1"/>
+          <w:sz w:val="26"/>
+          <w:szCs w:val="26"/>
+        </w:rPr>
+        <w:t>it</w:t>
+      </w:r>
+      <w:r>
+        <w:rPr>
+          <w:color w:val="156082" w:themeColor="accent1"/>
+          <w:sz w:val="26"/>
+          <w:szCs w:val="26"/>
+        </w:rPr>
+        <w:t xml:space="preserve"> elsősorban frontend </w:t>
+      </w:r>
+      <w:r>
+        <w:rPr>
+          <w:color w:val="156082" w:themeColor="accent1"/>
+          <w:sz w:val="26"/>
+          <w:szCs w:val="26"/>
+        </w:rPr>
+        <w:t>elérésé</w:t>
+      </w:r>
+      <w:r>
+        <w:rPr>
+          <w:color w:val="156082" w:themeColor="accent1"/>
+          <w:sz w:val="26"/>
+          <w:szCs w:val="26"/>
+        </w:rPr>
+        <w:t xml:space="preserve">hez </w:t>
+      </w:r>
+      <w:r>
+        <w:rPr>
+          <w:color w:val="156082" w:themeColor="accent1"/>
+          <w:sz w:val="26"/>
+          <w:szCs w:val="26"/>
+        </w:rPr>
+        <w:t xml:space="preserve">használunk a </w:t>
+      </w:r>
+      <w:r>
+        <w:rPr>
+          <w:color w:val="156082" w:themeColor="accent1"/>
+          <w:sz w:val="26"/>
+          <w:szCs w:val="26"/>
+        </w:rPr>
+        <w:t xml:space="preserve"> backend </w:t>
+      </w:r>
+      <w:r>
+        <w:rPr>
+          <w:color w:val="156082" w:themeColor="accent1"/>
+          <w:sz w:val="26"/>
+          <w:szCs w:val="26"/>
+        </w:rPr>
+        <w:t>futtatása</w:t>
+      </w:r>
+      <w:r>
+        <w:rPr>
+          <w:color w:val="156082" w:themeColor="accent1"/>
+          <w:sz w:val="26"/>
+          <w:szCs w:val="26"/>
+        </w:rPr>
+        <w:t xml:space="preserve"> nélkül. </w:t>
+      </w:r>
+      <w:r>
+        <w:rPr>
+          <w:color w:val="156082" w:themeColor="accent1"/>
+          <w:sz w:val="26"/>
+          <w:szCs w:val="26"/>
+        </w:rPr>
+        <w:t>L</w:t>
+      </w:r>
+      <w:r>
+        <w:rPr>
+          <w:color w:val="156082" w:themeColor="accent1"/>
+          <w:sz w:val="26"/>
+          <w:szCs w:val="26"/>
+        </w:rPr>
+        <w:t>egfontosabb jellemzője, hogy</w:t>
       </w:r>
       <w:r>
         <w:rPr>
@@ -3103,15 +3287,23 @@
           <w:sz w:val="26"/>
           <w:szCs w:val="26"/>
         </w:rPr>
-        <w:t>egyik legalapvetőbb</w:t>
-      </w:r>
-      <w:r>
-        <w:rPr>
-          <w:color w:val="156082" w:themeColor="accent1"/>
-          <w:sz w:val="26"/>
-          <w:szCs w:val="26"/>
-        </w:rPr>
-        <w:t xml:space="preserve"> szolgáltatásai közé tartozik a Firebase Hosting, amely lehetővé teszi statikus weboldalak és single-page alkalmazások gyors, biztonságos hosztolását globális CDN-en</w:t>
+        <w:t xml:space="preserve">egyik </w:t>
+      </w:r>
+      <w:r>
+        <w:rPr>
+          <w:color w:val="156082" w:themeColor="accent1"/>
+          <w:sz w:val="26"/>
+          <w:szCs w:val="26"/>
+        </w:rPr>
+        <w:t xml:space="preserve">alapvető szolgáltatása </w:t>
+      </w:r>
+      <w:r>
+        <w:rPr>
+          <w:color w:val="156082" w:themeColor="accent1"/>
+          <w:sz w:val="26"/>
+          <w:szCs w:val="26"/>
+        </w:rPr>
+        <w:t>a Firebase Hosting, amely lehetővé teszi statikus weboldalak és single-page alkalmazások gyors, biztonságos hosztolását globális CDN-en</w:t>
       </w:r>
       <w:r>
         <w:rPr>
@@ -3135,7 +3327,63 @@
           <w:sz w:val="26"/>
           <w:szCs w:val="26"/>
         </w:rPr>
-        <w:t xml:space="preserve"> keresztül. A </w:t>
+        <w:t xml:space="preserve"> keresztül. </w:t>
+      </w:r>
+      <w:r>
+        <w:rPr>
+          <w:color w:val="156082" w:themeColor="accent1"/>
+          <w:sz w:val="26"/>
+          <w:szCs w:val="26"/>
+        </w:rPr>
+        <w:t xml:space="preserve">A </w:t>
+      </w:r>
+      <w:r>
+        <w:rPr>
+          <w:color w:val="156082" w:themeColor="accent1"/>
+          <w:sz w:val="26"/>
+          <w:szCs w:val="26"/>
+        </w:rPr>
+        <w:t>bejelentkez</w:t>
+      </w:r>
+      <w:r>
+        <w:rPr>
+          <w:color w:val="156082" w:themeColor="accent1"/>
+          <w:sz w:val="26"/>
+          <w:szCs w:val="26"/>
+        </w:rPr>
+        <w:t>é</w:t>
+      </w:r>
+      <w:r>
+        <w:rPr>
+          <w:color w:val="156082" w:themeColor="accent1"/>
+          <w:sz w:val="26"/>
+          <w:szCs w:val="26"/>
+        </w:rPr>
+        <w:t>snél</w:t>
+      </w:r>
+      <w:r>
+        <w:rPr>
+          <w:color w:val="156082" w:themeColor="accent1"/>
+          <w:sz w:val="26"/>
+          <w:szCs w:val="26"/>
+        </w:rPr>
+        <w:t xml:space="preserve"> </w:t>
+      </w:r>
+      <w:r>
+        <w:rPr>
+          <w:color w:val="156082" w:themeColor="accent1"/>
+          <w:sz w:val="26"/>
+          <w:szCs w:val="26"/>
+        </w:rPr>
+        <w:t xml:space="preserve">pedig a </w:t>
+      </w:r>
+      <w:r>
+        <w:rPr>
+          <w:color w:val="156082" w:themeColor="accent1"/>
+          <w:sz w:val="26"/>
+          <w:szCs w:val="26"/>
+        </w:rPr>
+        <w:t xml:space="preserve"> </w:t>
       </w:r>
       <w:r>
         <w:rPr>
@@ -3152,64 +3400,186 @@
           <w:sz w:val="26"/>
           <w:szCs w:val="26"/>
         </w:rPr>
-        <w:t xml:space="preserve"> pedig</w:t>
-      </w:r>
-      <w:r>
-        <w:rPr>
-          <w:color w:val="156082" w:themeColor="accent1"/>
-          <w:sz w:val="26"/>
-          <w:szCs w:val="26"/>
-        </w:rPr>
-        <w:t xml:space="preserve"> egyszerű bejelentkezési megoldásokat </w:t>
-      </w:r>
-      <w:r>
-        <w:rPr>
-          <w:color w:val="156082" w:themeColor="accent1"/>
-          <w:sz w:val="26"/>
-          <w:szCs w:val="26"/>
-        </w:rPr>
-        <w:t>szolgáltatótól függetlenül. (Bárhonnan jelentkezünk be, egységesen van lekezelve, nem kell mindenre külön API-t írni)</w:t>
-      </w:r>
-    </w:p>
-    <w:p>
-      <w:pPr>
-        <w:rPr>
-          <w:color w:val="156082" w:themeColor="accent1"/>
-          <w:sz w:val="26"/>
-          <w:szCs w:val="26"/>
-        </w:rPr>
-      </w:pPr>
-      <w:r>
-        <w:rPr>
-          <w:color w:val="156082" w:themeColor="accent1"/>
-          <w:sz w:val="26"/>
-          <w:szCs w:val="26"/>
-        </w:rPr>
-        <w:t>További hasznos funkciók közé tartozik a Firebase Storage fájltároláshoz</w:t>
-      </w:r>
-      <w:r>
-        <w:rPr>
-          <w:color w:val="156082" w:themeColor="accent1"/>
-          <w:sz w:val="26"/>
-          <w:szCs w:val="26"/>
-        </w:rPr>
-        <w:t xml:space="preserve"> és</w:t>
-      </w:r>
-      <w:r>
-        <w:rPr>
-          <w:color w:val="156082" w:themeColor="accent1"/>
-          <w:sz w:val="26"/>
-          <w:szCs w:val="26"/>
-        </w:rPr>
-        <w:t xml:space="preserve"> a Cloud Functions szerver nélküli </w:t>
-      </w:r>
-      <w:r>
-        <w:rPr>
-          <w:color w:val="156082" w:themeColor="accent1"/>
-          <w:sz w:val="26"/>
-          <w:szCs w:val="26"/>
-        </w:rPr>
-        <w:t>vezérléshez</w:t>
+        <w:t xml:space="preserve">-t </w:t>
+      </w:r>
+      <w:r>
+        <w:rPr>
+          <w:color w:val="156082" w:themeColor="accent1"/>
+          <w:sz w:val="26"/>
+          <w:szCs w:val="26"/>
+        </w:rPr>
+        <w:t>használjuk,</w:t>
+      </w:r>
+      <w:r>
+        <w:rPr>
+          <w:color w:val="156082" w:themeColor="accent1"/>
+          <w:sz w:val="26"/>
+          <w:szCs w:val="26"/>
+        </w:rPr>
+        <w:t xml:space="preserve"> ami </w:t>
+      </w:r>
+      <w:r>
+        <w:rPr>
+          <w:color w:val="156082" w:themeColor="accent1"/>
+          <w:sz w:val="26"/>
+          <w:szCs w:val="26"/>
+        </w:rPr>
+        <w:t xml:space="preserve">szolgáltató </w:t>
+      </w:r>
+      <w:r>
+        <w:rPr>
+          <w:color w:val="156082" w:themeColor="accent1"/>
+          <w:sz w:val="26"/>
+          <w:szCs w:val="26"/>
+        </w:rPr>
+        <w:t>független</w:t>
+      </w:r>
+      <w:r>
+        <w:rPr>
+          <w:color w:val="156082" w:themeColor="accent1"/>
+          <w:sz w:val="26"/>
+          <w:szCs w:val="26"/>
+        </w:rPr>
+        <w:t>. (Bárhonnan jelentkezünk be, egységesen van lekezelve, nem kell mindenre külön API-t írni)</w:t>
+      </w:r>
+    </w:p>
+    <w:p>
+      <w:pPr>
+        <w:rPr>
+          <w:color w:val="156082" w:themeColor="accent1"/>
+        </w:rPr>
+      </w:pPr>
+      <w:r>
+        <w:rPr>
+          <w:color w:val="156082" w:themeColor="accent1"/>
+          <w:sz w:val="26"/>
+          <w:szCs w:val="26"/>
+        </w:rPr>
+        <w:t>Röviden</w:t>
+      </w:r>
+      <w:r>
+        <w:rPr>
+          <w:color w:val="156082" w:themeColor="accent1"/>
+          <w:sz w:val="26"/>
+          <w:szCs w:val="26"/>
+        </w:rPr>
+        <w:t xml:space="preserve"> a Firebase egy egyszerű frontend elérési lehetőség a backend </w:t>
+      </w:r>
+      <w:r>
+        <w:rPr>
+          <w:color w:val="156082" w:themeColor="accent1"/>
+          <w:sz w:val="26"/>
+          <w:szCs w:val="26"/>
+        </w:rPr>
+        <w:t xml:space="preserve">kezelése </w:t>
+      </w:r>
+      <w:r>
+        <w:rPr>
+          <w:color w:val="156082" w:themeColor="accent1"/>
+          <w:sz w:val="26"/>
+          <w:szCs w:val="26"/>
+        </w:rPr>
+        <w:t>nélkül</w:t>
+      </w:r>
+      <w:r>
+        <w:rPr>
+          <w:color w:val="156082" w:themeColor="accent1"/>
+          <w:sz w:val="26"/>
+          <w:szCs w:val="26"/>
+        </w:rPr>
+        <w:t>,</w:t>
+      </w:r>
+      <w:r>
+        <w:rPr>
+          <w:color w:val="156082" w:themeColor="accent1"/>
+          <w:sz w:val="26"/>
+          <w:szCs w:val="26"/>
+        </w:rPr>
+        <w:t xml:space="preserve"> </w:t>
+      </w:r>
+      <w:r>
+        <w:rPr>
+          <w:color w:val="156082" w:themeColor="accent1"/>
+          <w:sz w:val="26"/>
+          <w:szCs w:val="26"/>
+        </w:rPr>
+        <w:t>í</w:t>
+      </w:r>
+      <w:r>
+        <w:rPr>
+          <w:color w:val="156082" w:themeColor="accent1"/>
+          <w:sz w:val="26"/>
+          <w:szCs w:val="26"/>
+        </w:rPr>
+        <w:t xml:space="preserve">gy </w:t>
+      </w:r>
+      <w:r>
+        <w:rPr>
+          <w:color w:val="156082" w:themeColor="accent1"/>
+          <w:sz w:val="26"/>
+          <w:szCs w:val="26"/>
+        </w:rPr>
+        <w:t>leegyszerűsít</w:t>
+      </w:r>
+      <w:r>
+        <w:rPr>
+          <w:color w:val="156082" w:themeColor="accent1"/>
+          <w:sz w:val="26"/>
+          <w:szCs w:val="26"/>
+        </w:rPr>
+        <w:t>i</w:t>
+      </w:r>
+      <w:r>
+        <w:rPr>
+          <w:b/>
+          <w:bCs/>
+          <w:i/>
+          <w:iCs/>
+          <w:color w:val="156082" w:themeColor="accent1"/>
+          <w:sz w:val="26"/>
+          <w:szCs w:val="26"/>
+        </w:rPr>
+        <w:t xml:space="preserve"> </w:t>
+      </w:r>
+      <w:r>
+        <w:rPr>
+          <w:color w:val="156082" w:themeColor="accent1"/>
+          <w:sz w:val="26"/>
+          <w:szCs w:val="26"/>
+        </w:rPr>
+        <w:t>é</w:t>
+      </w:r>
+      <w:r>
+        <w:rPr>
+          <w:color w:val="156082" w:themeColor="accent1"/>
+          <w:sz w:val="26"/>
+          <w:szCs w:val="26"/>
+        </w:rPr>
+        <w:t>s gyorsít</w:t>
+      </w:r>
+      <w:r>
+        <w:rPr>
+          <w:color w:val="156082" w:themeColor="accent1"/>
+          <w:sz w:val="26"/>
+          <w:szCs w:val="26"/>
+        </w:rPr>
+        <w:t>ja</w:t>
+      </w:r>
+      <w:r>
+        <w:rPr>
+          <w:color w:val="156082" w:themeColor="accent1"/>
+          <w:sz w:val="26"/>
+          <w:szCs w:val="26"/>
+        </w:rPr>
+        <w:t xml:space="preserve"> a folyamato</w:t>
+      </w:r>
+      <w:r>
+        <w:rPr>
+          <w:color w:val="156082" w:themeColor="accent1"/>
+          <w:sz w:val="26"/>
+          <w:szCs w:val="26"/>
+        </w:rPr>
+        <w:t>kat</w:t>
       </w:r>
       <w:r>
         <w:rPr>
@@ -3219,69 +3589,6 @@
         </w:rPr>
         <w:t xml:space="preserve">. </w:t>
       </w:r>
-      <w:r>
-        <w:rPr>
-          <w:color w:val="156082" w:themeColor="accent1"/>
-          <w:sz w:val="26"/>
-          <w:szCs w:val="26"/>
-        </w:rPr>
-        <w:t>Minde</w:t>
-      </w:r>
-      <w:r>
-        <w:rPr>
-          <w:color w:val="156082" w:themeColor="accent1"/>
-          <w:sz w:val="26"/>
-          <w:szCs w:val="26"/>
-        </w:rPr>
-        <w:t>n</w:t>
-      </w:r>
-      <w:r>
-        <w:rPr>
-          <w:color w:val="156082" w:themeColor="accent1"/>
-          <w:sz w:val="26"/>
-          <w:szCs w:val="26"/>
-        </w:rPr>
-        <w:t xml:space="preserve"> integrált környezetben, könnyen kezelhető felületen érhető el, minimalizálva a backend</w:t>
-      </w:r>
-      <w:r>
-        <w:rPr>
-          <w:color w:val="156082" w:themeColor="accent1"/>
-          <w:sz w:val="26"/>
-          <w:szCs w:val="26"/>
-        </w:rPr>
-        <w:t>től való</w:t>
-      </w:r>
-      <w:r>
-        <w:rPr>
-          <w:color w:val="156082" w:themeColor="accent1"/>
-          <w:sz w:val="26"/>
-          <w:szCs w:val="26"/>
-        </w:rPr>
-        <w:t xml:space="preserve"> </w:t>
-      </w:r>
-      <w:r>
-        <w:rPr>
-          <w:color w:val="156082" w:themeColor="accent1"/>
-          <w:sz w:val="26"/>
-          <w:szCs w:val="26"/>
-        </w:rPr>
-        <w:t>függőséget</w:t>
-      </w:r>
-      <w:r>
-        <w:rPr>
-          <w:color w:val="156082" w:themeColor="accent1"/>
-          <w:sz w:val="26"/>
-          <w:szCs w:val="26"/>
-        </w:rPr>
-        <w:t>.</w:t>
-      </w:r>
-    </w:p>
-    <w:p>
-      <w:pPr>
-        <w:rPr>
-          <w:color w:val="156082" w:themeColor="accent1"/>
-        </w:rPr>
-      </w:pPr>
     </w:p>
     <w:p>
       <w:pPr>
@@ -3365,7 +3672,7 @@
           <w:sz w:val="26"/>
           <w:szCs w:val="26"/>
         </w:rPr>
-        <w:t>. A rendszer kiemelkedő teljesítményt, megbízhatóságot és skálázhatóságot nyújt, miközben széles körben támogatott a fejlesztői közösség által.</w:t>
+        <w:t xml:space="preserve">. </w:t>
       </w:r>
       <w:r>
         <w:rPr>
@@ -3374,6 +3681,69 @@
           <w:sz w:val="26"/>
           <w:szCs w:val="26"/>
         </w:rPr>
+        <w:t>K</w:t>
+      </w:r>
+      <w:r>
+        <w:rPr>
+          <w:rFonts w:asciiTheme="majorHAnsi" w:eastAsiaTheme="majorEastAsia" w:hAnsiTheme="majorHAnsi" w:cstheme="majorBidi"/>
+          <w:color w:val="156082" w:themeColor="accent1"/>
+          <w:sz w:val="26"/>
+          <w:szCs w:val="26"/>
+        </w:rPr>
+        <w:t>ezelését nagyban megkönnyíti a phpMyAdmin</w:t>
+      </w:r>
+      <w:r>
+        <w:rPr>
+          <w:rFonts w:asciiTheme="majorHAnsi" w:eastAsiaTheme="majorEastAsia" w:hAnsiTheme="majorHAnsi" w:cstheme="majorBidi"/>
+          <w:color w:val="156082" w:themeColor="accent1"/>
+          <w:sz w:val="26"/>
+          <w:szCs w:val="26"/>
+        </w:rPr>
+        <w:t>,</w:t>
+      </w:r>
+      <w:r>
+        <w:rPr>
+          <w:rFonts w:asciiTheme="majorHAnsi" w:eastAsiaTheme="majorEastAsia" w:hAnsiTheme="majorHAnsi" w:cstheme="majorBidi"/>
+          <w:color w:val="156082" w:themeColor="accent1"/>
+          <w:sz w:val="26"/>
+          <w:szCs w:val="26"/>
+        </w:rPr>
+        <w:t xml:space="preserve"> egy webalapú felület, amely lehetővé teszi az adatbázisok vizuális kezelését. Ez</w:t>
+      </w:r>
+      <w:r>
+        <w:rPr>
+          <w:rFonts w:asciiTheme="majorHAnsi" w:eastAsiaTheme="majorEastAsia" w:hAnsiTheme="majorHAnsi" w:cstheme="majorBidi"/>
+          <w:color w:val="156082" w:themeColor="accent1"/>
+          <w:sz w:val="26"/>
+          <w:szCs w:val="26"/>
+        </w:rPr>
+        <w:t xml:space="preserve">t a </w:t>
+      </w:r>
+      <w:r>
+        <w:rPr>
+          <w:rFonts w:asciiTheme="majorHAnsi" w:eastAsiaTheme="majorEastAsia" w:hAnsiTheme="majorHAnsi" w:cstheme="majorBidi"/>
+          <w:color w:val="156082" w:themeColor="accent1"/>
+          <w:sz w:val="26"/>
+          <w:szCs w:val="26"/>
+        </w:rPr>
+        <w:t>felületet</w:t>
+      </w:r>
+      <w:r>
+        <w:rPr>
+          <w:rFonts w:asciiTheme="majorHAnsi" w:eastAsiaTheme="majorEastAsia" w:hAnsiTheme="majorHAnsi" w:cstheme="majorBidi"/>
+          <w:color w:val="156082" w:themeColor="accent1"/>
+          <w:sz w:val="26"/>
+          <w:szCs w:val="26"/>
+        </w:rPr>
+        <w:t xml:space="preserve"> választottuk</w:t>
+      </w:r>
+      <w:r>
+        <w:rPr>
+          <w:rFonts w:asciiTheme="majorHAnsi" w:eastAsiaTheme="majorEastAsia" w:hAnsiTheme="majorHAnsi" w:cstheme="majorBidi"/>
+          <w:color w:val="156082" w:themeColor="accent1"/>
+          <w:sz w:val="26"/>
+          <w:szCs w:val="26"/>
+        </w:rPr>
         <w:t xml:space="preserve"> </w:t>
       </w:r>
       <w:r>
@@ -3383,7 +3753,7 @@
           <w:sz w:val="26"/>
           <w:szCs w:val="26"/>
         </w:rPr>
-        <w:t>A MySQL kezelését nagyban megkönnyíti a phpMyAdmin</w:t>
+        <w:t xml:space="preserve">könnyű megjelenése </w:t>
       </w:r>
       <w:r>
         <w:rPr>
@@ -3392,7 +3762,7 @@
           <w:sz w:val="26"/>
           <w:szCs w:val="26"/>
         </w:rPr>
-        <w:t>,</w:t>
+        <w:t>é</w:t>
       </w:r>
       <w:r>
         <w:rPr>
@@ -3401,7 +3771,7 @@
           <w:sz w:val="26"/>
           <w:szCs w:val="26"/>
         </w:rPr>
-        <w:t xml:space="preserve"> egy webalapú felület, amely lehetővé teszi az adatbázisok vizuális kezelését. Ez a megoldás különösen hasznos fejlesztők számára, akik grafikus felületen keresztül szeretnék létrehozni és módosítani a táblákat, illetve SQL lekérdezéseket végrehajtani.</w:t>
+        <w:t>s kezelhetősége miatt,</w:t>
       </w:r>
       <w:r>
         <w:rPr>
@@ -3419,7 +3789,7 @@
           <w:sz w:val="26"/>
           <w:szCs w:val="26"/>
         </w:rPr>
-        <w:t>A helyi fejlesztési környezetekben gyakran alkalmazzák a XAMPP csomagot, amely egy egységes platformot biztosít a MySQL, Apach</w:t>
+        <w:t>az</w:t>
       </w:r>
       <w:r>
         <w:rPr>
@@ -3428,6 +3798,204 @@
           <w:sz w:val="26"/>
           <w:szCs w:val="26"/>
         </w:rPr>
+        <w:t xml:space="preserve"> SQL lekérdezések</w:t>
+      </w:r>
+      <w:r>
+        <w:rPr>
+          <w:rFonts w:asciiTheme="majorHAnsi" w:eastAsiaTheme="majorEastAsia" w:hAnsiTheme="majorHAnsi" w:cstheme="majorBidi"/>
+          <w:color w:val="156082" w:themeColor="accent1"/>
+          <w:sz w:val="26"/>
+          <w:szCs w:val="26"/>
+        </w:rPr>
+        <w:t xml:space="preserve"> </w:t>
+      </w:r>
+      <w:r>
+        <w:rPr>
+          <w:rFonts w:asciiTheme="majorHAnsi" w:eastAsiaTheme="majorEastAsia" w:hAnsiTheme="majorHAnsi" w:cstheme="majorBidi"/>
+          <w:color w:val="156082" w:themeColor="accent1"/>
+          <w:sz w:val="26"/>
+          <w:szCs w:val="26"/>
+        </w:rPr>
+        <w:t>é</w:t>
+      </w:r>
+      <w:r>
+        <w:rPr>
+          <w:rFonts w:asciiTheme="majorHAnsi" w:eastAsiaTheme="majorEastAsia" w:hAnsiTheme="majorHAnsi" w:cstheme="majorBidi"/>
+          <w:color w:val="156082" w:themeColor="accent1"/>
+          <w:sz w:val="26"/>
+          <w:szCs w:val="26"/>
+        </w:rPr>
+        <w:t xml:space="preserve">s </w:t>
+      </w:r>
+      <w:r>
+        <w:rPr>
+          <w:rFonts w:asciiTheme="majorHAnsi" w:eastAsiaTheme="majorEastAsia" w:hAnsiTheme="majorHAnsi" w:cstheme="majorBidi"/>
+          <w:color w:val="156082" w:themeColor="accent1"/>
+          <w:sz w:val="26"/>
+          <w:szCs w:val="26"/>
+        </w:rPr>
+        <w:t>a táblák</w:t>
+      </w:r>
+      <w:r>
+        <w:rPr>
+          <w:rFonts w:asciiTheme="majorHAnsi" w:eastAsiaTheme="majorEastAsia" w:hAnsiTheme="majorHAnsi" w:cstheme="majorBidi"/>
+          <w:color w:val="156082" w:themeColor="accent1"/>
+          <w:sz w:val="26"/>
+          <w:szCs w:val="26"/>
+        </w:rPr>
+        <w:t xml:space="preserve"> </w:t>
+      </w:r>
+      <w:r>
+        <w:rPr>
+          <w:rFonts w:asciiTheme="majorHAnsi" w:eastAsiaTheme="majorEastAsia" w:hAnsiTheme="majorHAnsi" w:cstheme="majorBidi"/>
+          <w:color w:val="156082" w:themeColor="accent1"/>
+          <w:sz w:val="26"/>
+          <w:szCs w:val="26"/>
+        </w:rPr>
+        <w:t>módosítása</w:t>
+      </w:r>
+      <w:r>
+        <w:rPr>
+          <w:rFonts w:asciiTheme="majorHAnsi" w:eastAsiaTheme="majorEastAsia" w:hAnsiTheme="majorHAnsi" w:cstheme="majorBidi"/>
+          <w:color w:val="156082" w:themeColor="accent1"/>
+          <w:sz w:val="26"/>
+          <w:szCs w:val="26"/>
+        </w:rPr>
+        <w:t xml:space="preserve"> </w:t>
+      </w:r>
+      <w:r>
+        <w:rPr>
+          <w:rFonts w:asciiTheme="majorHAnsi" w:eastAsiaTheme="majorEastAsia" w:hAnsiTheme="majorHAnsi" w:cstheme="majorBidi"/>
+          <w:color w:val="156082" w:themeColor="accent1"/>
+          <w:sz w:val="26"/>
+          <w:szCs w:val="26"/>
+        </w:rPr>
+        <w:t>könnyedén elvégezhető</w:t>
+      </w:r>
+      <w:r>
+        <w:rPr>
+          <w:rFonts w:asciiTheme="majorHAnsi" w:eastAsiaTheme="majorEastAsia" w:hAnsiTheme="majorHAnsi" w:cstheme="majorBidi"/>
+          <w:color w:val="156082" w:themeColor="accent1"/>
+          <w:sz w:val="26"/>
+          <w:szCs w:val="26"/>
+        </w:rPr>
+        <w:t xml:space="preserve"> vele</w:t>
+      </w:r>
+      <w:r>
+        <w:rPr>
+          <w:rFonts w:asciiTheme="majorHAnsi" w:eastAsiaTheme="majorEastAsia" w:hAnsiTheme="majorHAnsi" w:cstheme="majorBidi"/>
+          <w:color w:val="156082" w:themeColor="accent1"/>
+          <w:sz w:val="26"/>
+          <w:szCs w:val="26"/>
+        </w:rPr>
+        <w:t>.</w:t>
+      </w:r>
+      <w:r>
+        <w:rPr>
+          <w:rFonts w:asciiTheme="majorHAnsi" w:eastAsiaTheme="majorEastAsia" w:hAnsiTheme="majorHAnsi" w:cstheme="majorBidi"/>
+          <w:color w:val="156082" w:themeColor="accent1"/>
+          <w:sz w:val="26"/>
+          <w:szCs w:val="26"/>
+        </w:rPr>
+        <w:t xml:space="preserve"> </w:t>
+      </w:r>
+      <w:r>
+        <w:rPr>
+          <w:rFonts w:asciiTheme="majorHAnsi" w:eastAsiaTheme="majorEastAsia" w:hAnsiTheme="majorHAnsi" w:cstheme="majorBidi"/>
+          <w:color w:val="156082" w:themeColor="accent1"/>
+          <w:sz w:val="26"/>
+          <w:szCs w:val="26"/>
+        </w:rPr>
+        <w:t xml:space="preserve">Eléréséhez a  </w:t>
+      </w:r>
+      <w:r>
+        <w:rPr>
+          <w:rFonts w:asciiTheme="majorHAnsi" w:eastAsiaTheme="majorEastAsia" w:hAnsiTheme="majorHAnsi" w:cstheme="majorBidi"/>
+          <w:color w:val="156082" w:themeColor="accent1"/>
+          <w:sz w:val="26"/>
+          <w:szCs w:val="26"/>
+        </w:rPr>
+        <w:t>XAMPP</w:t>
+      </w:r>
+      <w:r>
+        <w:rPr>
+          <w:rFonts w:asciiTheme="majorHAnsi" w:eastAsiaTheme="majorEastAsia" w:hAnsiTheme="majorHAnsi" w:cstheme="majorBidi"/>
+          <w:color w:val="156082" w:themeColor="accent1"/>
+          <w:sz w:val="26"/>
+          <w:szCs w:val="26"/>
+        </w:rPr>
+        <w:t>-ot</w:t>
+      </w:r>
+      <w:r>
+        <w:rPr>
+          <w:rFonts w:asciiTheme="majorHAnsi" w:eastAsiaTheme="majorEastAsia" w:hAnsiTheme="majorHAnsi" w:cstheme="majorBidi"/>
+          <w:color w:val="156082" w:themeColor="accent1"/>
+          <w:sz w:val="26"/>
+          <w:szCs w:val="26"/>
+        </w:rPr>
+        <w:t xml:space="preserve"> </w:t>
+      </w:r>
+      <w:r>
+        <w:rPr>
+          <w:rFonts w:asciiTheme="majorHAnsi" w:eastAsiaTheme="majorEastAsia" w:hAnsiTheme="majorHAnsi" w:cstheme="majorBidi"/>
+          <w:color w:val="156082" w:themeColor="accent1"/>
+          <w:sz w:val="26"/>
+          <w:szCs w:val="26"/>
+        </w:rPr>
+        <w:t>használjuk</w:t>
+      </w:r>
+      <w:r>
+        <w:rPr>
+          <w:rFonts w:asciiTheme="majorHAnsi" w:eastAsiaTheme="majorEastAsia" w:hAnsiTheme="majorHAnsi" w:cstheme="majorBidi"/>
+          <w:color w:val="156082" w:themeColor="accent1"/>
+          <w:sz w:val="26"/>
+          <w:szCs w:val="26"/>
+        </w:rPr>
+        <w:t>, am</w:t>
+      </w:r>
+      <w:r>
+        <w:rPr>
+          <w:rFonts w:asciiTheme="majorHAnsi" w:eastAsiaTheme="majorEastAsia" w:hAnsiTheme="majorHAnsi" w:cstheme="majorBidi"/>
+          <w:color w:val="156082" w:themeColor="accent1"/>
+          <w:sz w:val="26"/>
+          <w:szCs w:val="26"/>
+        </w:rPr>
+        <w:t xml:space="preserve">i </w:t>
+      </w:r>
+      <w:r>
+        <w:rPr>
+          <w:rFonts w:asciiTheme="majorHAnsi" w:eastAsiaTheme="majorEastAsia" w:hAnsiTheme="majorHAnsi" w:cstheme="majorBidi"/>
+          <w:color w:val="156082" w:themeColor="accent1"/>
+          <w:sz w:val="26"/>
+          <w:szCs w:val="26"/>
+        </w:rPr>
+        <w:t xml:space="preserve">egy egységes </w:t>
+      </w:r>
+      <w:r>
+        <w:rPr>
+          <w:rFonts w:asciiTheme="majorHAnsi" w:eastAsiaTheme="majorEastAsia" w:hAnsiTheme="majorHAnsi" w:cstheme="majorBidi"/>
+          <w:color w:val="156082" w:themeColor="accent1"/>
+          <w:sz w:val="26"/>
+          <w:szCs w:val="26"/>
+        </w:rPr>
+        <w:t>futtatást</w:t>
+      </w:r>
+      <w:r>
+        <w:rPr>
+          <w:rFonts w:asciiTheme="majorHAnsi" w:eastAsiaTheme="majorEastAsia" w:hAnsiTheme="majorHAnsi" w:cstheme="majorBidi"/>
+          <w:color w:val="156082" w:themeColor="accent1"/>
+          <w:sz w:val="26"/>
+          <w:szCs w:val="26"/>
+        </w:rPr>
+        <w:t xml:space="preserve"> biztosít a MySQL, Apach</w:t>
+      </w:r>
+      <w:r>
+        <w:rPr>
+          <w:rFonts w:asciiTheme="majorHAnsi" w:eastAsiaTheme="majorEastAsia" w:hAnsiTheme="majorHAnsi" w:cstheme="majorBidi"/>
+          <w:color w:val="156082" w:themeColor="accent1"/>
+          <w:sz w:val="26"/>
+          <w:szCs w:val="26"/>
+        </w:rPr>
         <w:t>e,</w:t>
       </w:r>
       <w:r>
@@ -3455,17 +4023,7 @@
           <w:sz w:val="26"/>
           <w:szCs w:val="26"/>
         </w:rPr>
-        <w:t>PHP kombinációjával. Ez a megoldás lehetővé teszi a teljes webalkalmazások helyi tesztelését és fejlesztését anélkül, hogy külső szerverre lenne szükség.</w:t>
-      </w:r>
-      <w:r>
-        <w:rPr>
-          <w:rFonts w:asciiTheme="majorHAnsi" w:eastAsiaTheme="majorEastAsia" w:hAnsiTheme="majorHAnsi" w:cstheme="majorBidi"/>
-          <w:noProof/>
-          <w:color w:val="156082" w:themeColor="accent1"/>
-          <w:sz w:val="26"/>
-          <w:szCs w:val="26"/>
-        </w:rPr>
-        <w:t xml:space="preserve"> </w:t>
+        <w:t xml:space="preserve">PHP kombinációjával. </w:t>
       </w:r>
     </w:p>
     <w:p>
@@ -3540,145 +4098,7 @@
       <w:pPr>
         <w:spacing w:before="60" w:after="60"/>
         <w:rPr>
-          <w:rFonts w:asciiTheme="majorHAnsi" w:eastAsiaTheme="majorEastAsia" w:hAnsiTheme="majorHAnsi" w:cstheme="majorBidi"/>
-          <w:color w:val="156082" w:themeColor="accent1"/>
-          <w:sz w:val="26"/>
-          <w:szCs w:val="26"/>
-        </w:rPr>
-      </w:pPr>
-      <w:r>
-        <w:rPr>
-          <w:rFonts w:asciiTheme="majorHAnsi" w:eastAsiaTheme="majorEastAsia" w:hAnsiTheme="majorHAnsi" w:cstheme="majorBidi"/>
-          <w:color w:val="156082" w:themeColor="accent1"/>
-          <w:sz w:val="26"/>
-          <w:szCs w:val="26"/>
-        </w:rPr>
-        <w:lastRenderedPageBreak/>
-        <w:t>Az</w:t>
-      </w:r>
-      <w:r>
-        <w:rPr>
-          <w:rFonts w:asciiTheme="majorHAnsi" w:eastAsiaTheme="majorEastAsia" w:hAnsiTheme="majorHAnsi" w:cstheme="majorBidi"/>
-          <w:color w:val="156082" w:themeColor="accent1"/>
-          <w:sz w:val="26"/>
-          <w:szCs w:val="26"/>
-        </w:rPr>
-        <w:t xml:space="preserve"> API-fejlesztés esetén </w:t>
-      </w:r>
-      <w:r>
-        <w:rPr>
-          <w:rFonts w:asciiTheme="majorHAnsi" w:eastAsiaTheme="majorEastAsia" w:hAnsiTheme="majorHAnsi" w:cstheme="majorBidi"/>
-          <w:color w:val="156082" w:themeColor="accent1"/>
-          <w:sz w:val="26"/>
-          <w:szCs w:val="26"/>
-        </w:rPr>
-        <w:t xml:space="preserve">nálunk a </w:t>
-      </w:r>
-      <w:r>
-        <w:rPr>
-          <w:rFonts w:asciiTheme="majorHAnsi" w:eastAsiaTheme="majorEastAsia" w:hAnsiTheme="majorHAnsi" w:cstheme="majorBidi"/>
-          <w:color w:val="156082" w:themeColor="accent1"/>
-          <w:sz w:val="26"/>
-          <w:szCs w:val="26"/>
-        </w:rPr>
-        <w:t>Swagger</w:t>
-      </w:r>
-      <w:r>
-        <w:rPr>
-          <w:rFonts w:asciiTheme="majorHAnsi" w:eastAsiaTheme="majorEastAsia" w:hAnsiTheme="majorHAnsi" w:cstheme="majorBidi"/>
-          <w:color w:val="156082" w:themeColor="accent1"/>
-          <w:sz w:val="26"/>
-          <w:szCs w:val="26"/>
-        </w:rPr>
-        <w:t xml:space="preserve">-re esett a </w:t>
-      </w:r>
-      <w:r>
-        <w:rPr>
-          <w:rFonts w:asciiTheme="majorHAnsi" w:eastAsiaTheme="majorEastAsia" w:hAnsiTheme="majorHAnsi" w:cstheme="majorBidi"/>
-          <w:color w:val="156082" w:themeColor="accent1"/>
-          <w:sz w:val="26"/>
-          <w:szCs w:val="26"/>
-        </w:rPr>
-        <w:t>választás,</w:t>
-      </w:r>
-      <w:r>
-        <w:rPr>
-          <w:rFonts w:asciiTheme="majorHAnsi" w:eastAsiaTheme="majorEastAsia" w:hAnsiTheme="majorHAnsi" w:cstheme="majorBidi"/>
-          <w:color w:val="156082" w:themeColor="accent1"/>
-          <w:sz w:val="26"/>
-          <w:szCs w:val="26"/>
-        </w:rPr>
-        <w:t xml:space="preserve"> aminek</w:t>
-      </w:r>
-      <w:r>
-        <w:rPr>
-          <w:rFonts w:asciiTheme="majorHAnsi" w:eastAsiaTheme="majorEastAsia" w:hAnsiTheme="majorHAnsi" w:cstheme="majorBidi"/>
-          <w:color w:val="156082" w:themeColor="accent1"/>
-          <w:sz w:val="26"/>
-          <w:szCs w:val="26"/>
-        </w:rPr>
-        <w:t xml:space="preserve"> segítségével könnyedén dokumentálható és tesztelhető a MySQL adatbázi</w:t>
-      </w:r>
-      <w:r>
-        <w:rPr>
-          <w:rFonts w:asciiTheme="majorHAnsi" w:eastAsiaTheme="majorEastAsia" w:hAnsiTheme="majorHAnsi" w:cstheme="majorBidi"/>
-          <w:color w:val="156082" w:themeColor="accent1"/>
-          <w:sz w:val="26"/>
-          <w:szCs w:val="26"/>
-        </w:rPr>
-        <w:t xml:space="preserve">s, </w:t>
-      </w:r>
-      <w:r>
-        <w:rPr>
-          <w:rFonts w:asciiTheme="majorHAnsi" w:eastAsiaTheme="majorEastAsia" w:hAnsiTheme="majorHAnsi" w:cstheme="majorBidi"/>
-          <w:color w:val="156082" w:themeColor="accent1"/>
-          <w:sz w:val="26"/>
-          <w:szCs w:val="26"/>
-        </w:rPr>
-        <w:t xml:space="preserve">és a </w:t>
-      </w:r>
-      <w:r>
-        <w:rPr>
-          <w:rFonts w:asciiTheme="majorHAnsi" w:eastAsiaTheme="majorEastAsia" w:hAnsiTheme="majorHAnsi" w:cstheme="majorBidi"/>
-          <w:color w:val="156082" w:themeColor="accent1"/>
-          <w:sz w:val="26"/>
-          <w:szCs w:val="26"/>
-        </w:rPr>
-        <w:t>vele kommunikáló</w:t>
-      </w:r>
-      <w:r>
-        <w:rPr>
-          <w:rFonts w:asciiTheme="majorHAnsi" w:eastAsiaTheme="majorEastAsia" w:hAnsiTheme="majorHAnsi" w:cstheme="majorBidi"/>
-          <w:color w:val="156082" w:themeColor="accent1"/>
-          <w:sz w:val="26"/>
-          <w:szCs w:val="26"/>
-        </w:rPr>
-        <w:t xml:space="preserve"> RESTful API-k</w:t>
-      </w:r>
-      <w:r>
-        <w:rPr>
-          <w:rFonts w:asciiTheme="majorHAnsi" w:eastAsiaTheme="majorEastAsia" w:hAnsiTheme="majorHAnsi" w:cstheme="majorBidi"/>
-          <w:color w:val="156082" w:themeColor="accent1"/>
-          <w:sz w:val="26"/>
-          <w:szCs w:val="26"/>
-        </w:rPr>
-        <w:t xml:space="preserve"> szinte bármelyik pontja</w:t>
-      </w:r>
-      <w:r>
-        <w:rPr>
-          <w:rFonts w:asciiTheme="majorHAnsi" w:eastAsiaTheme="majorEastAsia" w:hAnsiTheme="majorHAnsi" w:cstheme="majorBidi"/>
-          <w:color w:val="156082" w:themeColor="accent1"/>
-          <w:sz w:val="26"/>
-          <w:szCs w:val="26"/>
-        </w:rPr>
-        <w:t>. Ez a megoldás lehetővé teszi a végpontok egyszerű tesztelését és a fejlesztők közötti együttműködést.</w:t>
-      </w:r>
-    </w:p>
-    <w:p>
-      <w:pPr>
-        <w:spacing w:before="60" w:after="60"/>
-        <w:rPr>
-          <w:rFonts w:asciiTheme="majorHAnsi" w:eastAsiaTheme="majorEastAsia" w:hAnsiTheme="majorHAnsi" w:cstheme="majorBidi"/>
+          <w:rFonts w:eastAsiaTheme="majorEastAsia" w:cstheme="majorBidi"/>
           <w:color w:val="156082" w:themeColor="accent1"/>
           <w:sz w:val="26"/>
           <w:szCs w:val="26"/>
@@ -3693,16 +4113,16 @@
           <w:szCs w:val="26"/>
         </w:rPr>
         <w:drawing>
-          <wp:anchor distT="0" distB="0" distL="114300" distR="114300" simplePos="0" relativeHeight="251666432" behindDoc="0" locked="0" layoutInCell="1" allowOverlap="1" wp14:anchorId="71D600B7" wp14:editId="0AA800B9">
+          <wp:anchor distT="0" distB="0" distL="114300" distR="114300" simplePos="0" relativeHeight="251666432" behindDoc="1" locked="0" layoutInCell="1" allowOverlap="1" wp14:anchorId="71D600B7" wp14:editId="327EBF3E">
             <wp:simplePos x="0" y="0"/>
-            <wp:positionH relativeFrom="column">
-              <wp:posOffset>-1298</wp:posOffset>
+            <wp:positionH relativeFrom="margin">
+              <wp:align>center</wp:align>
             </wp:positionH>
             <wp:positionV relativeFrom="paragraph">
-              <wp:posOffset>2292</wp:posOffset>
+              <wp:posOffset>981872</wp:posOffset>
             </wp:positionV>
-            <wp:extent cx="5756910" cy="374015"/>
-            <wp:effectExtent l="0" t="0" r="0" b="6985"/>
+            <wp:extent cx="6506210" cy="552450"/>
+            <wp:effectExtent l="0" t="0" r="8890" b="0"/>
             <wp:wrapSquare wrapText="bothSides"/>
             <wp:docPr id="1383825589" name="Kép 22"/>
             <wp:cNvGraphicFramePr>
@@ -3733,7 +4153,7 @@
                   <pic:spPr bwMode="auto">
                     <a:xfrm>
                       <a:off x="0" y="0"/>
-                      <a:ext cx="5756910" cy="374015"/>
+                      <a:ext cx="6506210" cy="552450"/>
                     </a:xfrm>
                     <a:prstGeom prst="rect">
                       <a:avLst/>
@@ -3746,9 +4166,206 @@
                 </pic:pic>
               </a:graphicData>
             </a:graphic>
+            <wp14:sizeRelH relativeFrom="margin">
+              <wp14:pctWidth>0</wp14:pctWidth>
+            </wp14:sizeRelH>
+            <wp14:sizeRelV relativeFrom="margin">
+              <wp14:pctHeight>0</wp14:pctHeight>
+            </wp14:sizeRelV>
           </wp:anchor>
         </w:drawing>
       </w:r>
+      <w:r>
+        <w:rPr>
+          <w:rFonts w:asciiTheme="majorHAnsi" w:eastAsiaTheme="majorEastAsia" w:hAnsiTheme="majorHAnsi" w:cstheme="majorBidi"/>
+          <w:color w:val="156082" w:themeColor="accent1"/>
+          <w:sz w:val="26"/>
+          <w:szCs w:val="26"/>
+        </w:rPr>
+        <w:t>Az</w:t>
+      </w:r>
+      <w:r>
+        <w:rPr>
+          <w:rFonts w:asciiTheme="majorHAnsi" w:eastAsiaTheme="majorEastAsia" w:hAnsiTheme="majorHAnsi" w:cstheme="majorBidi"/>
+          <w:color w:val="156082" w:themeColor="accent1"/>
+          <w:sz w:val="26"/>
+          <w:szCs w:val="26"/>
+        </w:rPr>
+        <w:t xml:space="preserve"> API-fejlesztés esetén </w:t>
+      </w:r>
+      <w:r>
+        <w:rPr>
+          <w:rFonts w:asciiTheme="majorHAnsi" w:eastAsiaTheme="majorEastAsia" w:hAnsiTheme="majorHAnsi" w:cstheme="majorBidi"/>
+          <w:color w:val="156082" w:themeColor="accent1"/>
+          <w:sz w:val="26"/>
+          <w:szCs w:val="26"/>
+        </w:rPr>
+        <w:t xml:space="preserve">nálunk a </w:t>
+      </w:r>
+      <w:r>
+        <w:rPr>
+          <w:rFonts w:asciiTheme="majorHAnsi" w:eastAsiaTheme="majorEastAsia" w:hAnsiTheme="majorHAnsi" w:cstheme="majorBidi"/>
+          <w:color w:val="156082" w:themeColor="accent1"/>
+          <w:sz w:val="26"/>
+          <w:szCs w:val="26"/>
+        </w:rPr>
+        <w:t>Swagger</w:t>
+      </w:r>
+      <w:r>
+        <w:rPr>
+          <w:rFonts w:asciiTheme="majorHAnsi" w:eastAsiaTheme="majorEastAsia" w:hAnsiTheme="majorHAnsi" w:cstheme="majorBidi"/>
+          <w:color w:val="156082" w:themeColor="accent1"/>
+          <w:sz w:val="26"/>
+          <w:szCs w:val="26"/>
+        </w:rPr>
+        <w:t xml:space="preserve">-re esett a </w:t>
+      </w:r>
+      <w:r>
+        <w:rPr>
+          <w:rFonts w:asciiTheme="majorHAnsi" w:eastAsiaTheme="majorEastAsia" w:hAnsiTheme="majorHAnsi" w:cstheme="majorBidi"/>
+          <w:color w:val="156082" w:themeColor="accent1"/>
+          <w:sz w:val="26"/>
+          <w:szCs w:val="26"/>
+        </w:rPr>
+        <w:t>választás,</w:t>
+      </w:r>
+      <w:r>
+        <w:rPr>
+          <w:rFonts w:asciiTheme="majorHAnsi" w:eastAsiaTheme="majorEastAsia" w:hAnsiTheme="majorHAnsi" w:cstheme="majorBidi"/>
+          <w:color w:val="156082" w:themeColor="accent1"/>
+          <w:sz w:val="26"/>
+          <w:szCs w:val="26"/>
+        </w:rPr>
+        <w:t xml:space="preserve"> aminek</w:t>
+      </w:r>
+      <w:r>
+        <w:rPr>
+          <w:rFonts w:asciiTheme="majorHAnsi" w:eastAsiaTheme="majorEastAsia" w:hAnsiTheme="majorHAnsi" w:cstheme="majorBidi"/>
+          <w:color w:val="156082" w:themeColor="accent1"/>
+          <w:sz w:val="26"/>
+          <w:szCs w:val="26"/>
+        </w:rPr>
+        <w:t xml:space="preserve"> segítségével könnyedén dokumentálható és tesztelhető </w:t>
+      </w:r>
+      <w:r>
+        <w:rPr>
+          <w:rFonts w:asciiTheme="majorHAnsi" w:eastAsiaTheme="majorEastAsia" w:hAnsiTheme="majorHAnsi" w:cstheme="majorBidi"/>
+          <w:color w:val="156082" w:themeColor="accent1"/>
+          <w:sz w:val="26"/>
+          <w:szCs w:val="26"/>
+        </w:rPr>
+        <w:t>az</w:t>
+      </w:r>
+      <w:r>
+        <w:rPr>
+          <w:rFonts w:asciiTheme="majorHAnsi" w:eastAsiaTheme="majorEastAsia" w:hAnsiTheme="majorHAnsi" w:cstheme="majorBidi"/>
+          <w:color w:val="156082" w:themeColor="accent1"/>
+          <w:sz w:val="26"/>
+          <w:szCs w:val="26"/>
+        </w:rPr>
+        <w:t xml:space="preserve"> adatbázi</w:t>
+      </w:r>
+      <w:r>
+        <w:rPr>
+          <w:rFonts w:asciiTheme="majorHAnsi" w:eastAsiaTheme="majorEastAsia" w:hAnsiTheme="majorHAnsi" w:cstheme="majorBidi"/>
+          <w:color w:val="156082" w:themeColor="accent1"/>
+          <w:sz w:val="26"/>
+          <w:szCs w:val="26"/>
+        </w:rPr>
+        <w:t xml:space="preserve">s, </w:t>
+      </w:r>
+      <w:r>
+        <w:rPr>
+          <w:rFonts w:asciiTheme="majorHAnsi" w:eastAsiaTheme="majorEastAsia" w:hAnsiTheme="majorHAnsi" w:cstheme="majorBidi"/>
+          <w:color w:val="156082" w:themeColor="accent1"/>
+          <w:sz w:val="26"/>
+          <w:szCs w:val="26"/>
+        </w:rPr>
+        <w:t>elérhető a vele</w:t>
+      </w:r>
+      <w:r>
+        <w:rPr>
+          <w:rFonts w:asciiTheme="majorHAnsi" w:eastAsiaTheme="majorEastAsia" w:hAnsiTheme="majorHAnsi" w:cstheme="majorBidi"/>
+          <w:color w:val="156082" w:themeColor="accent1"/>
+          <w:sz w:val="26"/>
+          <w:szCs w:val="26"/>
+        </w:rPr>
+        <w:t xml:space="preserve"> kommunikáló</w:t>
+      </w:r>
+      <w:r>
+        <w:rPr>
+          <w:rFonts w:asciiTheme="majorHAnsi" w:eastAsiaTheme="majorEastAsia" w:hAnsiTheme="majorHAnsi" w:cstheme="majorBidi"/>
+          <w:color w:val="156082" w:themeColor="accent1"/>
+          <w:sz w:val="26"/>
+          <w:szCs w:val="26"/>
+        </w:rPr>
+        <w:t xml:space="preserve"> RESTful API-k</w:t>
+      </w:r>
+      <w:r>
+        <w:rPr>
+          <w:rFonts w:asciiTheme="majorHAnsi" w:eastAsiaTheme="majorEastAsia" w:hAnsiTheme="majorHAnsi" w:cstheme="majorBidi"/>
+          <w:color w:val="156082" w:themeColor="accent1"/>
+          <w:sz w:val="26"/>
+          <w:szCs w:val="26"/>
+        </w:rPr>
+        <w:t xml:space="preserve"> </w:t>
+      </w:r>
+      <w:r>
+        <w:rPr>
+          <w:rFonts w:asciiTheme="majorHAnsi" w:eastAsiaTheme="majorEastAsia" w:hAnsiTheme="majorHAnsi" w:cstheme="majorBidi"/>
+          <w:color w:val="156082" w:themeColor="accent1"/>
+          <w:sz w:val="26"/>
+          <w:szCs w:val="26"/>
+        </w:rPr>
+        <w:t>összes</w:t>
+      </w:r>
+      <w:r>
+        <w:rPr>
+          <w:rFonts w:asciiTheme="majorHAnsi" w:eastAsiaTheme="majorEastAsia" w:hAnsiTheme="majorHAnsi" w:cstheme="majorBidi"/>
+          <w:color w:val="156082" w:themeColor="accent1"/>
+          <w:sz w:val="26"/>
+          <w:szCs w:val="26"/>
+        </w:rPr>
+        <w:t xml:space="preserve"> pontja</w:t>
+      </w:r>
+      <w:r>
+        <w:rPr>
+          <w:rFonts w:asciiTheme="majorHAnsi" w:eastAsiaTheme="majorEastAsia" w:hAnsiTheme="majorHAnsi" w:cstheme="majorBidi"/>
+          <w:color w:val="156082" w:themeColor="accent1"/>
+          <w:sz w:val="26"/>
+          <w:szCs w:val="26"/>
+        </w:rPr>
+        <w:t xml:space="preserve">. Ez a megoldás lehetővé teszi a </w:t>
+      </w:r>
+      <w:r>
+        <w:rPr>
+          <w:rFonts w:eastAsiaTheme="majorEastAsia" w:cstheme="majorBidi"/>
+          <w:color w:val="156082" w:themeColor="accent1"/>
+          <w:sz w:val="26"/>
+          <w:szCs w:val="26"/>
+        </w:rPr>
+        <w:t>végpontok egyszerű összekapcsolását és tesztelését</w:t>
+      </w:r>
+      <w:r>
+        <w:rPr>
+          <w:rFonts w:eastAsiaTheme="majorEastAsia" w:cstheme="majorBidi"/>
+          <w:color w:val="156082" w:themeColor="accent1"/>
+          <w:sz w:val="26"/>
+          <w:szCs w:val="26"/>
+        </w:rPr>
+        <w:t>.</w:t>
+      </w:r>
+    </w:p>
+    <w:p>
+      <w:pPr>
+        <w:spacing w:before="60" w:after="60"/>
+        <w:rPr>
+          <w:rFonts w:asciiTheme="majorHAnsi" w:eastAsiaTheme="majorEastAsia" w:hAnsiTheme="majorHAnsi" w:cstheme="majorBidi"/>
+          <w:color w:val="156082" w:themeColor="accent1"/>
+          <w:sz w:val="26"/>
+          <w:szCs w:val="26"/>
+        </w:rPr>
+      </w:pPr>
     </w:p>
     <w:p>
       <w:pPr>
@@ -3768,6 +4385,7 @@
           <w:sz w:val="26"/>
           <w:szCs w:val="26"/>
         </w:rPr>
+        <w:lastRenderedPageBreak/>
         <w:drawing>
           <wp:anchor distT="0" distB="0" distL="114300" distR="114300" simplePos="0" relativeHeight="251667456" behindDoc="1" locked="0" layoutInCell="1" allowOverlap="1" wp14:anchorId="709BB26D" wp14:editId="353CCC1B">
             <wp:simplePos x="0" y="0"/>
@@ -3846,7 +4464,52 @@
           <w:sz w:val="26"/>
           <w:szCs w:val="26"/>
         </w:rPr>
-        <w:t>A MySQL továbbra is az egyik legnépszerűbb adatbázis-kezelő rendszer marad, amely kiválóan integrálható mind helyi (XAMPP), mind felhőalapú környezetekbe, miközben számos eszköz (phpMyAdmin, Swagger) segíti a fejlesztők munkáját. A rendszer folyamatos fejlődése biztosítja, hogy mindig naprakész megoldásokat kínáljon a modern webalkalmazások fejlesztéséhez.</w:t>
+        <w:t>A MySQL továbbra is az egyik legnépszerűbb adatbázis-kezelő rendszer marad, am</w:t>
+      </w:r>
+      <w:r>
+        <w:rPr>
+          <w:rFonts w:asciiTheme="majorHAnsi" w:eastAsiaTheme="majorEastAsia" w:hAnsiTheme="majorHAnsi" w:cstheme="majorBidi"/>
+          <w:color w:val="156082" w:themeColor="accent1"/>
+          <w:sz w:val="26"/>
+          <w:szCs w:val="26"/>
+        </w:rPr>
+        <w:t xml:space="preserve">i </w:t>
+      </w:r>
+      <w:r>
+        <w:rPr>
+          <w:rFonts w:asciiTheme="majorHAnsi" w:eastAsiaTheme="majorEastAsia" w:hAnsiTheme="majorHAnsi" w:cstheme="majorBidi"/>
+          <w:color w:val="156082" w:themeColor="accent1"/>
+          <w:sz w:val="26"/>
+          <w:szCs w:val="26"/>
+        </w:rPr>
+        <w:t xml:space="preserve">kiválóan integrálható mind helyi (XAMPP), mind felhőalapú környezetekbe, miközben számos eszköz (phpMyAdmin, Swagger) segíti a </w:t>
+      </w:r>
+      <w:r>
+        <w:rPr>
+          <w:rFonts w:asciiTheme="majorHAnsi" w:eastAsiaTheme="majorEastAsia" w:hAnsiTheme="majorHAnsi" w:cstheme="majorBidi"/>
+          <w:color w:val="156082" w:themeColor="accent1"/>
+          <w:sz w:val="26"/>
+          <w:szCs w:val="26"/>
+        </w:rPr>
+        <w:t>fejlesz</w:t>
+      </w:r>
+      <w:r>
+        <w:rPr>
+          <w:rFonts w:asciiTheme="majorHAnsi" w:eastAsiaTheme="majorEastAsia" w:hAnsiTheme="majorHAnsi" w:cstheme="majorBidi"/>
+          <w:color w:val="156082" w:themeColor="accent1"/>
+          <w:sz w:val="26"/>
+          <w:szCs w:val="26"/>
+        </w:rPr>
+        <w:t>tést</w:t>
+      </w:r>
+      <w:r>
+        <w:rPr>
+          <w:rFonts w:asciiTheme="majorHAnsi" w:eastAsiaTheme="majorEastAsia" w:hAnsiTheme="majorHAnsi" w:cstheme="majorBidi"/>
+          <w:color w:val="156082" w:themeColor="accent1"/>
+          <w:sz w:val="26"/>
+          <w:szCs w:val="26"/>
+        </w:rPr>
+        <w:t xml:space="preserve">. </w:t>
       </w:r>
     </w:p>
     <w:p>
@@ -3878,34 +4541,64 @@
     <w:p>
       <w:pPr>
         <w:rPr>
-          <w:color w:val="156082" w:themeColor="accent1"/>
-          <w:sz w:val="26"/>
-          <w:szCs w:val="26"/>
-        </w:rPr>
-      </w:pPr>
-      <w:r>
-        <w:rPr>
-          <w:color w:val="156082" w:themeColor="accent1"/>
-          <w:sz w:val="26"/>
-          <w:szCs w:val="26"/>
-        </w:rPr>
-        <w:t xml:space="preserve">A Docker egy konténerizációs platform, amely forradalmasította a szoftverfejlesztést és </w:t>
-      </w:r>
-      <w:r>
-        <w:rPr>
-          <w:color w:val="156082" w:themeColor="accent1"/>
-          <w:sz w:val="26"/>
-          <w:szCs w:val="26"/>
-        </w:rPr>
-        <w:t xml:space="preserve">annak </w:t>
-      </w:r>
-      <w:r>
-        <w:rPr>
-          <w:color w:val="156082" w:themeColor="accent1"/>
-          <w:sz w:val="26"/>
-          <w:szCs w:val="26"/>
-        </w:rPr>
-        <w:t>üzembe helyezés</w:t>
+          <w:noProof/>
+        </w:rPr>
+      </w:pPr>
+      <w:r>
+        <w:rPr>
+          <w:color w:val="156082" w:themeColor="accent1"/>
+          <w:sz w:val="26"/>
+          <w:szCs w:val="26"/>
+        </w:rPr>
+        <w:t>A Docker egy konténerizációs platform, amely forradalm</w:t>
+      </w:r>
+      <w:r>
+        <w:rPr>
+          <w:color w:val="156082" w:themeColor="accent1"/>
+          <w:sz w:val="26"/>
+          <w:szCs w:val="26"/>
+        </w:rPr>
+        <w:t>i a ma ismert</w:t>
+      </w:r>
+      <w:r>
+        <w:rPr>
+          <w:color w:val="156082" w:themeColor="accent1"/>
+          <w:sz w:val="26"/>
+          <w:szCs w:val="26"/>
+        </w:rPr>
+        <w:t xml:space="preserve"> </w:t>
+      </w:r>
+      <w:r>
+        <w:rPr>
+          <w:color w:val="156082" w:themeColor="accent1"/>
+          <w:sz w:val="26"/>
+          <w:szCs w:val="26"/>
+        </w:rPr>
+        <w:t>szoftverfejlesz</w:t>
+      </w:r>
+      <w:r>
+        <w:rPr>
+          <w:color w:val="156082" w:themeColor="accent1"/>
+          <w:sz w:val="26"/>
+          <w:szCs w:val="26"/>
+        </w:rPr>
+        <w:t>tés</w:t>
+      </w:r>
+      <w:r>
+        <w:rPr>
+          <w:color w:val="156082" w:themeColor="accent1"/>
+          <w:sz w:val="26"/>
+          <w:szCs w:val="26"/>
+        </w:rPr>
+        <w:t xml:space="preserve"> és üzembe helyezés</w:t>
+      </w:r>
+      <w:r>
+        <w:rPr>
+          <w:color w:val="156082" w:themeColor="accent1"/>
+          <w:sz w:val="26"/>
+          <w:szCs w:val="26"/>
+        </w:rPr>
+        <w:t xml:space="preserve"> tekintet</w:t>
       </w:r>
       <w:r>
         <w:rPr>
@@ -3921,143 +4614,111 @@
           <w:sz w:val="26"/>
           <w:szCs w:val="26"/>
         </w:rPr>
-        <w:t>t. A Docker segítségével az alkalmazások és függőségeik elkülönített konténerekben futtathatók, biztosítva a konziszten</w:t>
-      </w:r>
-      <w:r>
-        <w:rPr>
-          <w:color w:val="156082" w:themeColor="accent1"/>
-          <w:sz w:val="26"/>
-          <w:szCs w:val="26"/>
-        </w:rPr>
-        <w:t xml:space="preserve">s </w:t>
-      </w:r>
-      <w:r>
-        <w:rPr>
-          <w:color w:val="156082" w:themeColor="accent1"/>
-          <w:sz w:val="26"/>
-          <w:szCs w:val="26"/>
-        </w:rPr>
-        <w:t>fejlesztés</w:t>
-      </w:r>
-      <w:r>
-        <w:rPr>
-          <w:color w:val="156082" w:themeColor="accent1"/>
-          <w:sz w:val="26"/>
-          <w:szCs w:val="26"/>
-        </w:rPr>
-        <w:t>t</w:t>
-      </w:r>
-      <w:r>
-        <w:rPr>
-          <w:color w:val="156082" w:themeColor="accent1"/>
-          <w:sz w:val="26"/>
-          <w:szCs w:val="26"/>
-        </w:rPr>
-        <w:t>, tesztelés</w:t>
-      </w:r>
-      <w:r>
-        <w:rPr>
-          <w:color w:val="156082" w:themeColor="accent1"/>
-          <w:sz w:val="26"/>
-          <w:szCs w:val="26"/>
-        </w:rPr>
-        <w:t>t</w:t>
-      </w:r>
-      <w:r>
-        <w:rPr>
-          <w:color w:val="156082" w:themeColor="accent1"/>
-          <w:sz w:val="26"/>
-          <w:szCs w:val="26"/>
-        </w:rPr>
-        <w:t xml:space="preserve"> és </w:t>
-      </w:r>
-      <w:r>
-        <w:rPr>
-          <w:color w:val="156082" w:themeColor="accent1"/>
-          <w:sz w:val="26"/>
-          <w:szCs w:val="26"/>
-        </w:rPr>
-        <w:t xml:space="preserve">az </w:t>
-      </w:r>
-      <w:r>
-        <w:rPr>
-          <w:color w:val="156082" w:themeColor="accent1"/>
-          <w:sz w:val="26"/>
-          <w:szCs w:val="26"/>
-        </w:rPr>
-        <w:t>éles</w:t>
-      </w:r>
-      <w:r>
-        <w:rPr>
-          <w:color w:val="156082" w:themeColor="accent1"/>
-          <w:sz w:val="26"/>
-          <w:szCs w:val="26"/>
-        </w:rPr>
-        <w:t xml:space="preserve"> működés</w:t>
-      </w:r>
-      <w:r>
-        <w:rPr>
-          <w:color w:val="156082" w:themeColor="accent1"/>
-          <w:sz w:val="26"/>
-          <w:szCs w:val="26"/>
-        </w:rPr>
-        <w:t>t a</w:t>
-      </w:r>
-      <w:r>
-        <w:rPr>
-          <w:color w:val="156082" w:themeColor="accent1"/>
-          <w:sz w:val="26"/>
-          <w:szCs w:val="26"/>
-        </w:rPr>
-        <w:t xml:space="preserve"> környezetek között.</w:t>
-      </w:r>
-      <w:r>
-        <w:rPr>
-          <w:color w:val="156082" w:themeColor="accent1"/>
-          <w:sz w:val="26"/>
-          <w:szCs w:val="26"/>
-        </w:rPr>
-        <w:t xml:space="preserve"> Ez k</w:t>
-      </w:r>
-      <w:r>
-        <w:rPr>
-          <w:color w:val="156082" w:themeColor="accent1"/>
-          <w:sz w:val="26"/>
-          <w:szCs w:val="26"/>
-        </w:rPr>
-        <w:t>ulcsfontosságú a modern DevOps</w:t>
-      </w:r>
-      <w:r>
-        <w:rPr>
-          <w:color w:val="156082" w:themeColor="accent1"/>
-          <w:sz w:val="26"/>
-          <w:szCs w:val="26"/>
-        </w:rPr>
-        <w:t xml:space="preserve"> (</w:t>
-      </w:r>
-      <w:r>
-        <w:rPr>
-          <w:color w:val="156082" w:themeColor="accent1"/>
-          <w:sz w:val="26"/>
-          <w:szCs w:val="26"/>
-        </w:rPr>
-        <w:t>fejlesztés és üzemeltetés összekötve</w:t>
-      </w:r>
-      <w:r>
-        <w:rPr>
-          <w:color w:val="156082" w:themeColor="accent1"/>
-          <w:sz w:val="26"/>
-          <w:szCs w:val="26"/>
-        </w:rPr>
-        <w:t>)</w:t>
-      </w:r>
-      <w:r>
-        <w:rPr>
-          <w:color w:val="156082" w:themeColor="accent1"/>
-          <w:sz w:val="26"/>
-          <w:szCs w:val="26"/>
-        </w:rPr>
-        <w:t xml:space="preserve"> folyamatokban, lehetővé téve a gyors és megbízható alkalmazásterjesztést.</w:t>
+        <w:t>ben</w:t>
+      </w:r>
+      <w:r>
+        <w:rPr>
+          <w:color w:val="156082" w:themeColor="accent1"/>
+          <w:sz w:val="26"/>
+          <w:szCs w:val="26"/>
+        </w:rPr>
+        <w:t xml:space="preserve">. </w:t>
+      </w:r>
+      <w:r>
+        <w:rPr>
+          <w:color w:val="156082" w:themeColor="accent1"/>
+          <w:sz w:val="26"/>
+          <w:szCs w:val="26"/>
+        </w:rPr>
+        <w:t xml:space="preserve">A Docker segítségével az alkalmazások gyorsabban és megbízhatóbban </w:t>
+      </w:r>
+      <w:r>
+        <w:rPr>
+          <w:color w:val="156082" w:themeColor="accent1"/>
+          <w:sz w:val="26"/>
+          <w:szCs w:val="26"/>
+        </w:rPr>
+        <w:t>üzemeltethetők</w:t>
+      </w:r>
+      <w:r>
+        <w:rPr>
+          <w:color w:val="156082" w:themeColor="accent1"/>
+          <w:sz w:val="26"/>
+          <w:szCs w:val="26"/>
+        </w:rPr>
+        <w:t>, mivel minden környezetben azonos módon viselkednek. Ez csökkenti a telepítési hibákat és gyorsítja a fejlesztési ciklust.</w:t>
+      </w:r>
+      <w:r>
+        <w:rPr>
+          <w:color w:val="156082" w:themeColor="accent1"/>
+          <w:sz w:val="26"/>
+          <w:szCs w:val="26"/>
+        </w:rPr>
+        <w:t xml:space="preserve"> </w:t>
+      </w:r>
+      <w:r>
+        <w:rPr>
+          <w:color w:val="156082" w:themeColor="accent1"/>
+          <w:sz w:val="26"/>
+          <w:szCs w:val="26"/>
+        </w:rPr>
+        <w:t>Ez</w:t>
+      </w:r>
+      <w:r>
+        <w:rPr>
+          <w:color w:val="156082" w:themeColor="accent1"/>
+          <w:sz w:val="26"/>
+          <w:szCs w:val="26"/>
+        </w:rPr>
+        <w:t xml:space="preserve"> volt az egyik fő szempont, amit figyelembe vettünk az </w:t>
+      </w:r>
+      <w:r>
+        <w:rPr>
+          <w:color w:val="156082" w:themeColor="accent1"/>
+          <w:sz w:val="26"/>
+          <w:szCs w:val="26"/>
+        </w:rPr>
+        <w:t xml:space="preserve"> üzemeltetés </w:t>
+      </w:r>
+      <w:r>
+        <w:rPr>
+          <w:color w:val="156082" w:themeColor="accent1"/>
+          <w:sz w:val="26"/>
+          <w:szCs w:val="26"/>
+        </w:rPr>
+        <w:t>szempontjából</w:t>
+      </w:r>
+      <w:r>
+        <w:rPr>
+          <w:color w:val="156082" w:themeColor="accent1"/>
+          <w:sz w:val="26"/>
+          <w:szCs w:val="26"/>
+        </w:rPr>
+        <w:t xml:space="preserve">, lehetővé téve a gyors és megbízható </w:t>
+      </w:r>
+      <w:r>
+        <w:rPr>
+          <w:color w:val="156082" w:themeColor="accent1"/>
+          <w:sz w:val="26"/>
+          <w:szCs w:val="26"/>
+        </w:rPr>
+        <w:t>alkalmazás</w:t>
+      </w:r>
+      <w:r>
+        <w:rPr>
+          <w:color w:val="156082" w:themeColor="accent1"/>
+          <w:sz w:val="26"/>
+          <w:szCs w:val="26"/>
+        </w:rPr>
+        <w:t>kezelést</w:t>
+      </w:r>
+      <w:r>
+        <w:rPr>
+          <w:color w:val="156082" w:themeColor="accent1"/>
+          <w:sz w:val="26"/>
+          <w:szCs w:val="26"/>
+        </w:rPr>
+        <w:t>.</w:t>
       </w:r>
       <w:r>
         <w:rPr>
@@ -4152,99 +4813,308 @@
           <w:sz w:val="26"/>
           <w:szCs w:val="26"/>
         </w:rPr>
+        <w:t>Ehhez társul</w:t>
+      </w:r>
+      <w:r>
+        <w:rPr>
+          <w:color w:val="156082" w:themeColor="accent1"/>
+          <w:sz w:val="26"/>
+          <w:szCs w:val="26"/>
+        </w:rPr>
+        <w:t xml:space="preserve"> a </w:t>
+      </w:r>
+      <w:r>
+        <w:rPr>
+          <w:color w:val="156082" w:themeColor="accent1"/>
+          <w:sz w:val="26"/>
+          <w:szCs w:val="26"/>
+        </w:rPr>
+        <w:t>Railway,</w:t>
+      </w:r>
+      <w:r>
+        <w:rPr>
+          <w:color w:val="156082" w:themeColor="accent1"/>
+          <w:sz w:val="26"/>
+          <w:szCs w:val="26"/>
+        </w:rPr>
+        <w:t xml:space="preserve"> </w:t>
+      </w:r>
+      <w:r>
+        <w:rPr>
+          <w:color w:val="156082" w:themeColor="accent1"/>
+          <w:sz w:val="26"/>
+          <w:szCs w:val="26"/>
+        </w:rPr>
+        <w:t>egy innovatív felhőalapú platform, am</w:t>
+      </w:r>
+      <w:r>
+        <w:rPr>
+          <w:color w:val="156082" w:themeColor="accent1"/>
+          <w:sz w:val="26"/>
+          <w:szCs w:val="26"/>
+        </w:rPr>
+        <w:t>i</w:t>
+      </w:r>
+      <w:r>
+        <w:rPr>
+          <w:color w:val="156082" w:themeColor="accent1"/>
+          <w:sz w:val="26"/>
+          <w:szCs w:val="26"/>
+        </w:rPr>
+        <w:t xml:space="preserve"> leegyszerűsíti az alkalmazások üzembe </w:t>
+      </w:r>
+      <w:r>
+        <w:rPr>
+          <w:color w:val="156082" w:themeColor="accent1"/>
+          <w:sz w:val="26"/>
+          <w:szCs w:val="26"/>
+        </w:rPr>
+        <w:t>helyezés</w:t>
+      </w:r>
+      <w:r>
+        <w:rPr>
+          <w:color w:val="156082" w:themeColor="accent1"/>
+          <w:sz w:val="26"/>
+          <w:szCs w:val="26"/>
+        </w:rPr>
+        <w:t>ét, ezzel kiegészítve a Dockert</w:t>
+      </w:r>
+      <w:r>
+        <w:rPr>
+          <w:color w:val="156082" w:themeColor="accent1"/>
+          <w:sz w:val="26"/>
+          <w:szCs w:val="26"/>
+        </w:rPr>
+        <w:t xml:space="preserve">. </w:t>
+      </w:r>
+      <w:r>
+        <w:rPr>
+          <w:color w:val="156082" w:themeColor="accent1"/>
+          <w:sz w:val="26"/>
+          <w:szCs w:val="26"/>
+        </w:rPr>
+        <w:t>F</w:t>
+      </w:r>
+      <w:r>
+        <w:rPr>
+          <w:color w:val="156082" w:themeColor="accent1"/>
+          <w:sz w:val="26"/>
+          <w:szCs w:val="26"/>
+        </w:rPr>
+        <w:t>elhasználóbarát felület</w:t>
+      </w:r>
+      <w:r>
+        <w:rPr>
+          <w:color w:val="156082" w:themeColor="accent1"/>
+          <w:sz w:val="26"/>
+          <w:szCs w:val="26"/>
+        </w:rPr>
+        <w:t>e,</w:t>
+      </w:r>
+      <w:r>
+        <w:rPr>
+          <w:color w:val="156082" w:themeColor="accent1"/>
+          <w:sz w:val="26"/>
+          <w:szCs w:val="26"/>
+        </w:rPr>
+        <w:t xml:space="preserve"> és automatikus konfiguráció</w:t>
+      </w:r>
+      <w:r>
+        <w:rPr>
+          <w:color w:val="156082" w:themeColor="accent1"/>
+          <w:sz w:val="26"/>
+          <w:szCs w:val="26"/>
+        </w:rPr>
+        <w:t>j</w:t>
+      </w:r>
+      <w:r>
+        <w:rPr>
+          <w:color w:val="156082" w:themeColor="accent1"/>
+          <w:sz w:val="26"/>
+          <w:szCs w:val="26"/>
+        </w:rPr>
+        <w:t>a</w:t>
+      </w:r>
+      <w:r>
+        <w:rPr>
+          <w:color w:val="156082" w:themeColor="accent1"/>
+          <w:sz w:val="26"/>
+          <w:szCs w:val="26"/>
+        </w:rPr>
+        <w:t xml:space="preserve"> miatt választottuk</w:t>
+      </w:r>
+      <w:r>
+        <w:rPr>
+          <w:color w:val="156082" w:themeColor="accent1"/>
+          <w:sz w:val="26"/>
+          <w:szCs w:val="26"/>
+        </w:rPr>
+        <w:t>,</w:t>
+      </w:r>
+      <w:r>
+        <w:rPr>
+          <w:color w:val="156082" w:themeColor="accent1"/>
+          <w:sz w:val="26"/>
+          <w:szCs w:val="26"/>
+        </w:rPr>
+        <w:t xml:space="preserve"> ami </w:t>
+      </w:r>
+      <w:r>
+        <w:rPr>
+          <w:color w:val="156082" w:themeColor="accent1"/>
+          <w:sz w:val="26"/>
+          <w:szCs w:val="26"/>
+        </w:rPr>
+        <w:t>támogat</w:t>
+      </w:r>
+      <w:r>
+        <w:rPr>
+          <w:color w:val="156082" w:themeColor="accent1"/>
+          <w:sz w:val="26"/>
+          <w:szCs w:val="26"/>
+        </w:rPr>
+        <w:t>ja</w:t>
+      </w:r>
+      <w:r>
+        <w:rPr>
+          <w:color w:val="156082" w:themeColor="accent1"/>
+          <w:sz w:val="26"/>
+          <w:szCs w:val="26"/>
+        </w:rPr>
+        <w:t xml:space="preserve"> a </w:t>
+      </w:r>
+      <w:r>
+        <w:rPr>
+          <w:color w:val="156082" w:themeColor="accent1"/>
+          <w:sz w:val="26"/>
+          <w:szCs w:val="26"/>
+        </w:rPr>
+        <w:t xml:space="preserve">ma népszerű </w:t>
+      </w:r>
+      <w:r>
+        <w:rPr>
+          <w:color w:val="156082" w:themeColor="accent1"/>
+          <w:sz w:val="26"/>
+          <w:szCs w:val="26"/>
+        </w:rPr>
+        <w:t>programozási nyelveket és keretrendszereket. A Railway</w:t>
+      </w:r>
+      <w:r>
+        <w:rPr>
+          <w:color w:val="156082" w:themeColor="accent1"/>
+          <w:sz w:val="26"/>
+          <w:szCs w:val="26"/>
+        </w:rPr>
+        <w:t xml:space="preserve">-nél különösen jól jött a </w:t>
+      </w:r>
+      <w:r>
+        <w:rPr>
+          <w:color w:val="156082" w:themeColor="accent1"/>
+          <w:sz w:val="26"/>
+          <w:szCs w:val="26"/>
+        </w:rPr>
+        <w:t>GitHub integráció, ami automatikusan buildeli a kódot</w:t>
+      </w:r>
+      <w:r>
+        <w:rPr>
+          <w:color w:val="156082" w:themeColor="accent1"/>
+          <w:sz w:val="26"/>
+          <w:szCs w:val="26"/>
+        </w:rPr>
+        <w:t xml:space="preserve">, </w:t>
+      </w:r>
+      <w:r>
+        <w:rPr>
+          <w:color w:val="156082" w:themeColor="accent1"/>
+          <w:sz w:val="26"/>
+          <w:szCs w:val="26"/>
+        </w:rPr>
+        <w:t xml:space="preserve">így </w:t>
+      </w:r>
+      <w:r>
+        <w:rPr>
+          <w:color w:val="156082" w:themeColor="accent1"/>
+          <w:sz w:val="26"/>
+          <w:szCs w:val="26"/>
+        </w:rPr>
+        <w:t>ideális választást nyújt</w:t>
+      </w:r>
+      <w:r>
+        <w:rPr>
+          <w:color w:val="156082" w:themeColor="accent1"/>
+          <w:sz w:val="26"/>
+          <w:szCs w:val="26"/>
+        </w:rPr>
+        <w:t>ott</w:t>
+      </w:r>
+      <w:r>
+        <w:rPr>
+          <w:color w:val="156082" w:themeColor="accent1"/>
+          <w:sz w:val="26"/>
+          <w:szCs w:val="26"/>
+        </w:rPr>
+        <w:t xml:space="preserve"> </w:t>
+      </w:r>
+      <w:r>
+        <w:rPr>
+          <w:color w:val="156082" w:themeColor="accent1"/>
+          <w:sz w:val="26"/>
+          <w:szCs w:val="26"/>
+        </w:rPr>
+        <w:t xml:space="preserve">a </w:t>
+      </w:r>
+      <w:r>
+        <w:rPr>
+          <w:color w:val="156082" w:themeColor="accent1"/>
+          <w:sz w:val="26"/>
+          <w:szCs w:val="26"/>
+        </w:rPr>
+        <w:t>projekt</w:t>
+      </w:r>
+      <w:r>
+        <w:rPr>
+          <w:color w:val="156082" w:themeColor="accent1"/>
+          <w:sz w:val="26"/>
+          <w:szCs w:val="26"/>
+        </w:rPr>
+        <w:t>ünk</w:t>
+      </w:r>
+      <w:r>
+        <w:rPr>
+          <w:color w:val="156082" w:themeColor="accent1"/>
+          <w:sz w:val="26"/>
+          <w:szCs w:val="26"/>
+        </w:rPr>
+        <w:t xml:space="preserve"> </w:t>
+      </w:r>
+      <w:r>
+        <w:rPr>
+          <w:color w:val="156082" w:themeColor="accent1"/>
+          <w:sz w:val="26"/>
+          <w:szCs w:val="26"/>
+        </w:rPr>
+        <w:t>számára.</w:t>
+      </w:r>
+      <w:r>
+        <w:rPr>
+          <w:noProof/>
+        </w:rPr>
+        <w:t xml:space="preserve"> </w:t>
+      </w:r>
+    </w:p>
+    <w:p>
+      <w:pPr>
+        <w:rPr>
+          <w:color w:val="156082" w:themeColor="accent1"/>
+          <w:sz w:val="26"/>
+          <w:szCs w:val="26"/>
+        </w:rPr>
+      </w:pPr>
+      <w:r>
+        <w:rPr>
+          <w:noProof/>
+        </w:rPr>
         <w:lastRenderedPageBreak/>
-        <w:t xml:space="preserve">Következő a </w:t>
-      </w:r>
-      <w:r>
-        <w:rPr>
-          <w:color w:val="156082" w:themeColor="accent1"/>
-          <w:sz w:val="26"/>
-          <w:szCs w:val="26"/>
-        </w:rPr>
-        <w:t>Railway,</w:t>
-      </w:r>
-      <w:r>
-        <w:rPr>
-          <w:color w:val="156082" w:themeColor="accent1"/>
-          <w:sz w:val="26"/>
-          <w:szCs w:val="26"/>
-        </w:rPr>
-        <w:t xml:space="preserve"> </w:t>
-      </w:r>
-      <w:r>
-        <w:rPr>
-          <w:color w:val="156082" w:themeColor="accent1"/>
-          <w:sz w:val="26"/>
-          <w:szCs w:val="26"/>
-        </w:rPr>
-        <w:t xml:space="preserve">ami </w:t>
-      </w:r>
-      <w:r>
-        <w:rPr>
-          <w:color w:val="156082" w:themeColor="accent1"/>
-          <w:sz w:val="26"/>
-          <w:szCs w:val="26"/>
-        </w:rPr>
-        <w:t>egy innovatív felhőalapú platform, amely leegyszerűsíti az alkalmazások üzembe helyezését és skálázását. A megoldás kiemelkedik a felhasználóbarát felületével és az automatikus konfiguráció</w:t>
-      </w:r>
-      <w:r>
-        <w:rPr>
-          <w:color w:val="156082" w:themeColor="accent1"/>
-          <w:sz w:val="26"/>
-          <w:szCs w:val="26"/>
-        </w:rPr>
-        <w:t>jával</w:t>
-      </w:r>
-      <w:r>
-        <w:rPr>
-          <w:color w:val="156082" w:themeColor="accent1"/>
-          <w:sz w:val="26"/>
-          <w:szCs w:val="26"/>
-        </w:rPr>
-        <w:t xml:space="preserve">, támogatva a legnépszerűbb programozási nyelveket és keretrendszereket. A Railway integrált adatbázis-kezelési lehetőségeket és zökkenőmentes Git-integrációt kínál, </w:t>
-      </w:r>
-      <w:r>
-        <w:rPr>
-          <w:color w:val="156082" w:themeColor="accent1"/>
-          <w:sz w:val="26"/>
-          <w:szCs w:val="26"/>
-        </w:rPr>
-        <w:t xml:space="preserve">így </w:t>
-      </w:r>
-      <w:r>
-        <w:rPr>
-          <w:color w:val="156082" w:themeColor="accent1"/>
-          <w:sz w:val="26"/>
-          <w:szCs w:val="26"/>
-        </w:rPr>
-        <w:t xml:space="preserve">ideális választást nyújt mind kis, </w:t>
-      </w:r>
-      <w:r>
-        <w:rPr>
-          <w:color w:val="156082" w:themeColor="accent1"/>
-          <w:sz w:val="26"/>
-          <w:szCs w:val="26"/>
-        </w:rPr>
-        <w:t>és</w:t>
-      </w:r>
-      <w:r>
-        <w:rPr>
-          <w:color w:val="156082" w:themeColor="accent1"/>
-          <w:sz w:val="26"/>
-          <w:szCs w:val="26"/>
-        </w:rPr>
-        <w:t xml:space="preserve"> nagyobb projektek számára.</w:t>
-      </w:r>
-      <w:r>
-        <w:rPr>
-          <w:noProof/>
-        </w:rPr>
-        <w:t xml:space="preserve"> </w:t>
-      </w:r>
-      <w:r>
-        <w:rPr>
-          <w:noProof/>
-        </w:rPr>
         <w:drawing>
           <wp:inline distT="0" distB="0" distL="0" distR="0" wp14:anchorId="75DD98AB" wp14:editId="208578AD">
             <wp:extent cx="5962650" cy="1888490"/>
@@ -4317,15 +5187,95 @@
           <w:sz w:val="26"/>
           <w:szCs w:val="26"/>
         </w:rPr>
-        <w:t>egy</w:t>
-      </w:r>
-      <w:r>
-        <w:rPr>
-          <w:color w:val="156082" w:themeColor="accent1"/>
-          <w:sz w:val="26"/>
-          <w:szCs w:val="26"/>
-        </w:rPr>
-        <w:t xml:space="preserve"> felhőalapú médiakezelő szolgáltatás, amely átfogó megoldást kínál a digitális tartalmak tárolására, kezelésére és kézbesítésére. A platform intelligens kép- és videóoptimalizálási képességeivel jelentősen javítható a weboldalak teljesítménye és felhasználói élménye. A Cloudinary fejlett API-jai és SDK-i</w:t>
+        <w:t>ezekhez k</w:t>
+      </w:r>
+      <w:r>
+        <w:rPr>
+          <w:color w:val="156082" w:themeColor="accent1"/>
+          <w:sz w:val="26"/>
+          <w:szCs w:val="26"/>
+        </w:rPr>
+        <w:t>é</w:t>
+      </w:r>
+      <w:r>
+        <w:rPr>
+          <w:color w:val="156082" w:themeColor="accent1"/>
+          <w:sz w:val="26"/>
+          <w:szCs w:val="26"/>
+        </w:rPr>
+        <w:t>p</w:t>
+      </w:r>
+      <w:r>
+        <w:rPr>
+          <w:color w:val="156082" w:themeColor="accent1"/>
+          <w:sz w:val="26"/>
+          <w:szCs w:val="26"/>
+        </w:rPr>
+        <w:t>e</w:t>
+      </w:r>
+      <w:r>
+        <w:rPr>
+          <w:color w:val="156082" w:themeColor="accent1"/>
+          <w:sz w:val="26"/>
+          <w:szCs w:val="26"/>
+        </w:rPr>
+        <w:t>st</w:t>
+      </w:r>
+      <w:r>
+        <w:rPr>
+          <w:color w:val="156082" w:themeColor="accent1"/>
+          <w:sz w:val="26"/>
+          <w:szCs w:val="26"/>
+        </w:rPr>
+        <w:t xml:space="preserve"> felhőalapú médiakezelő, a</w:t>
+      </w:r>
+      <w:r>
+        <w:rPr>
+          <w:color w:val="156082" w:themeColor="accent1"/>
+          <w:sz w:val="26"/>
+          <w:szCs w:val="26"/>
+        </w:rPr>
+        <w:t>mi</w:t>
+      </w:r>
+      <w:r>
+        <w:rPr>
+          <w:color w:val="156082" w:themeColor="accent1"/>
+          <w:sz w:val="26"/>
+          <w:szCs w:val="26"/>
+        </w:rPr>
+        <w:t xml:space="preserve"> átfogó megoldást kínál a digitális tartalmak tárolására, kezelésére és kézbesítésére. A platform intelligens kép- és videóoptimalizálási képességeivel jelentősen jav</w:t>
+      </w:r>
+      <w:r>
+        <w:rPr>
+          <w:color w:val="156082" w:themeColor="accent1"/>
+          <w:sz w:val="26"/>
+          <w:szCs w:val="26"/>
+        </w:rPr>
+        <w:t xml:space="preserve">ul a </w:t>
+      </w:r>
+      <w:r>
+        <w:rPr>
+          <w:color w:val="156082" w:themeColor="accent1"/>
+          <w:sz w:val="26"/>
+          <w:szCs w:val="26"/>
+        </w:rPr>
+        <w:t xml:space="preserve"> weboldal</w:t>
+      </w:r>
+      <w:r>
+        <w:rPr>
+          <w:color w:val="156082" w:themeColor="accent1"/>
+          <w:sz w:val="26"/>
+          <w:szCs w:val="26"/>
+        </w:rPr>
+        <w:t>unk</w:t>
+      </w:r>
+      <w:r>
+        <w:rPr>
+          <w:color w:val="156082" w:themeColor="accent1"/>
+          <w:sz w:val="26"/>
+          <w:szCs w:val="26"/>
+        </w:rPr>
+        <w:t xml:space="preserve"> teljesítménye és felhasználói élménye. A fejlett API-jai és SDK-i</w:t>
       </w:r>
       <w:r>
         <w:rPr>
@@ -4341,7 +5291,96 @@
           <w:sz w:val="26"/>
           <w:szCs w:val="26"/>
         </w:rPr>
-        <w:t xml:space="preserve"> lehetővé teszik a könnyű integrációt minden népszerű fejlesztői környezetbe. E három technológia együttes használata kiváló alapot nyújt modern, skálázható webalkalmazások fejlesztéséhez. A Docker biztosítja a konzisztens fejlesztési környezetet, a Railway lehetővé teszi a zökkenőmentes felhőbe történő telepítést, míg a Cloudinary optimalizálja a médiatartalmak kezelését. M</w:t>
+        <w:t xml:space="preserve"> lehetővé teszik a könnyű integrációt minden népszerű fejlesztői környezetbe.</w:t>
+      </w:r>
+    </w:p>
+    <w:p>
+      <w:pPr>
+        <w:rPr>
+          <w:color w:val="156082" w:themeColor="accent1"/>
+          <w:sz w:val="26"/>
+          <w:szCs w:val="26"/>
+        </w:rPr>
+      </w:pPr>
+      <w:r>
+        <w:rPr>
+          <w:color w:val="156082" w:themeColor="accent1"/>
+          <w:sz w:val="26"/>
+          <w:szCs w:val="26"/>
+        </w:rPr>
+        <w:t xml:space="preserve"> Mind</w:t>
+      </w:r>
+      <w:r>
+        <w:rPr>
+          <w:color w:val="156082" w:themeColor="accent1"/>
+          <w:sz w:val="26"/>
+          <w:szCs w:val="26"/>
+        </w:rPr>
+        <w:t>három technológia együttes</w:t>
+      </w:r>
+      <w:r>
+        <w:rPr>
+          <w:color w:val="156082" w:themeColor="accent1"/>
+          <w:sz w:val="26"/>
+          <w:szCs w:val="26"/>
+        </w:rPr>
+        <w:t>en</w:t>
+      </w:r>
+      <w:r>
+        <w:rPr>
+          <w:color w:val="156082" w:themeColor="accent1"/>
+          <w:sz w:val="26"/>
+          <w:szCs w:val="26"/>
+        </w:rPr>
+        <w:t xml:space="preserve"> </w:t>
+      </w:r>
+      <w:r>
+        <w:rPr>
+          <w:color w:val="156082" w:themeColor="accent1"/>
+          <w:sz w:val="26"/>
+          <w:szCs w:val="26"/>
+        </w:rPr>
+        <w:t>nyújt stabil alapot</w:t>
+      </w:r>
+      <w:r>
+        <w:rPr>
+          <w:color w:val="156082" w:themeColor="accent1"/>
+          <w:sz w:val="26"/>
+          <w:szCs w:val="26"/>
+        </w:rPr>
+        <w:t xml:space="preserve"> </w:t>
+      </w:r>
+      <w:r>
+        <w:rPr>
+          <w:color w:val="156082" w:themeColor="accent1"/>
+          <w:sz w:val="26"/>
+          <w:szCs w:val="26"/>
+        </w:rPr>
+        <w:t>az oldalunk</w:t>
+      </w:r>
+      <w:r>
+        <w:rPr>
+          <w:color w:val="156082" w:themeColor="accent1"/>
+          <w:sz w:val="26"/>
+          <w:szCs w:val="26"/>
+        </w:rPr>
+        <w:t xml:space="preserve"> </w:t>
+      </w:r>
+      <w:r>
+        <w:rPr>
+          <w:color w:val="156082" w:themeColor="accent1"/>
+          <w:sz w:val="26"/>
+          <w:szCs w:val="26"/>
+        </w:rPr>
+        <w:t xml:space="preserve">futtatásához es </w:t>
+      </w:r>
+      <w:r>
+        <w:rPr>
+          <w:color w:val="156082" w:themeColor="accent1"/>
+          <w:sz w:val="26"/>
+          <w:szCs w:val="26"/>
+        </w:rPr>
+        <w:t>fejlesztéséhez. A Docker biztosítja a konzisztens fejlesztési környezetet, a Railway lehetővé teszi a zökkenőmentes felhőbe történő telepítést, míg a Cloudinary optimalizálja a médiatartalmak kezelését. M</w:t>
       </w:r>
       <w:r>
         <w:rPr>
@@ -4507,7 +5546,23 @@
           <w:sz w:val="26"/>
           <w:szCs w:val="26"/>
         </w:rPr>
-        <w:t>fejlesztői eszköz, de különböző célokra és projektméretekre optimalizált</w:t>
+        <w:t xml:space="preserve">fejlesztői </w:t>
+      </w:r>
+      <w:r>
+        <w:rPr>
+          <w:color w:val="156082" w:themeColor="accent1"/>
+          <w:sz w:val="26"/>
+          <w:szCs w:val="26"/>
+        </w:rPr>
+        <w:t>szoftver</w:t>
+      </w:r>
+      <w:r>
+        <w:rPr>
+          <w:color w:val="156082" w:themeColor="accent1"/>
+          <w:sz w:val="26"/>
+          <w:szCs w:val="26"/>
+        </w:rPr>
+        <w:t>, de különböző célokra és projektméretekre optimalizált</w:t>
       </w:r>
       <w:r>
         <w:rPr>
@@ -4523,39 +5578,39 @@
           <w:sz w:val="26"/>
           <w:szCs w:val="26"/>
         </w:rPr>
-        <w:t>k. A Visual Studio 2022 egy teljes értékű integrált fejlesztői környezet (IDE), amely elsősorban nagyobb, komplex .NET</w:t>
-      </w:r>
-      <w:r>
-        <w:rPr>
-          <w:color w:val="156082" w:themeColor="accent1"/>
-          <w:sz w:val="26"/>
-          <w:szCs w:val="26"/>
-        </w:rPr>
-        <w:t>,</w:t>
-      </w:r>
-      <w:r>
-        <w:rPr>
-          <w:color w:val="156082" w:themeColor="accent1"/>
-          <w:sz w:val="26"/>
-          <w:szCs w:val="26"/>
-        </w:rPr>
-        <w:t xml:space="preserve"> C++ </w:t>
-      </w:r>
-      <w:r>
-        <w:rPr>
-          <w:color w:val="156082" w:themeColor="accent1"/>
-          <w:sz w:val="26"/>
-          <w:szCs w:val="26"/>
-        </w:rPr>
-        <w:t xml:space="preserve">és C# </w:t>
-      </w:r>
-      <w:r>
-        <w:rPr>
-          <w:color w:val="156082" w:themeColor="accent1"/>
-          <w:sz w:val="26"/>
-          <w:szCs w:val="26"/>
-        </w:rPr>
-        <w:t xml:space="preserve">projektekhez ajánlott, </w:t>
+        <w:t>k. A Visual Studio 2022 egy teljes értékű integrált fejlesztői környezet (IDE), amely elsősorban nagyobb</w:t>
+      </w:r>
+      <w:r>
+        <w:rPr>
+          <w:color w:val="156082" w:themeColor="accent1"/>
+          <w:sz w:val="26"/>
+          <w:szCs w:val="26"/>
+        </w:rPr>
+        <w:t xml:space="preserve"> </w:t>
+      </w:r>
+      <w:r>
+        <w:rPr>
+          <w:color w:val="156082" w:themeColor="accent1"/>
+          <w:sz w:val="26"/>
+          <w:szCs w:val="26"/>
+        </w:rPr>
+        <w:t>é</w:t>
+      </w:r>
+      <w:r>
+        <w:rPr>
+          <w:color w:val="156082" w:themeColor="accent1"/>
+          <w:sz w:val="26"/>
+          <w:szCs w:val="26"/>
+        </w:rPr>
+        <w:t xml:space="preserve">s </w:t>
+      </w:r>
+      <w:r>
+        <w:rPr>
+          <w:color w:val="156082" w:themeColor="accent1"/>
+          <w:sz w:val="26"/>
+          <w:szCs w:val="26"/>
+        </w:rPr>
+        <w:t xml:space="preserve">komplex projektekhez ajánlott, </w:t>
       </w:r>
       <w:r>
         <w:rPr>
@@ -4571,39 +5626,111 @@
           <w:sz w:val="26"/>
           <w:szCs w:val="26"/>
         </w:rPr>
-        <w:t xml:space="preserve"> beépített adatbázis-kezelés, GUI tervezőeszközök és hibakeresési lehetőségek</w:t>
-      </w:r>
-      <w:r>
-        <w:rPr>
-          <w:color w:val="156082" w:themeColor="accent1"/>
-          <w:sz w:val="26"/>
-          <w:szCs w:val="26"/>
-        </w:rPr>
-        <w:t xml:space="preserve"> is találhatók</w:t>
-      </w:r>
-      <w:r>
-        <w:rPr>
-          <w:color w:val="156082" w:themeColor="accent1"/>
-          <w:sz w:val="26"/>
-          <w:szCs w:val="26"/>
-        </w:rPr>
-        <w:t xml:space="preserve">. Ez az eszköz különösen hatékony vállalati környezetekben, ahol a teljes stack fejlesztésre van szükség, és jól integrálódik más Microsoft termékekkel, mint az Azure vagy SQL </w:t>
-      </w:r>
-      <w:r>
-        <w:rPr>
-          <w:color w:val="156082" w:themeColor="accent1"/>
-          <w:sz w:val="26"/>
-          <w:szCs w:val="26"/>
-        </w:rPr>
-        <w:t>sz</w:t>
-      </w:r>
-      <w:r>
-        <w:rPr>
-          <w:color w:val="156082" w:themeColor="accent1"/>
-          <w:sz w:val="26"/>
-          <w:szCs w:val="26"/>
-        </w:rPr>
-        <w:t>erver.</w:t>
+        <w:t xml:space="preserve"> beépített adatbázis-kezelés, GUI tervezőeszköz és hibakeresési lehetőség</w:t>
+      </w:r>
+      <w:r>
+        <w:rPr>
+          <w:color w:val="156082" w:themeColor="accent1"/>
+          <w:sz w:val="26"/>
+          <w:szCs w:val="26"/>
+        </w:rPr>
+        <w:t xml:space="preserve"> is található</w:t>
+      </w:r>
+      <w:r>
+        <w:rPr>
+          <w:color w:val="156082" w:themeColor="accent1"/>
+          <w:sz w:val="26"/>
+          <w:szCs w:val="26"/>
+        </w:rPr>
+        <w:t xml:space="preserve">. Ez különösen hatékony </w:t>
+      </w:r>
+      <w:r>
+        <w:rPr>
+          <w:color w:val="156082" w:themeColor="accent1"/>
+          <w:sz w:val="26"/>
+          <w:szCs w:val="26"/>
+        </w:rPr>
+        <w:t>olyan projekteknél, mint ak</w:t>
+      </w:r>
+      <w:r>
+        <w:rPr>
+          <w:color w:val="156082" w:themeColor="accent1"/>
+          <w:sz w:val="26"/>
+          <w:szCs w:val="26"/>
+        </w:rPr>
+        <w:t>á</w:t>
+      </w:r>
+      <w:r>
+        <w:rPr>
+          <w:color w:val="156082" w:themeColor="accent1"/>
+          <w:sz w:val="26"/>
+          <w:szCs w:val="26"/>
+        </w:rPr>
+        <w:t xml:space="preserve">r a </w:t>
+      </w:r>
+      <w:r>
+        <w:rPr>
+          <w:color w:val="156082" w:themeColor="accent1"/>
+          <w:sz w:val="26"/>
+          <w:szCs w:val="26"/>
+        </w:rPr>
+        <w:t>miénk</w:t>
+      </w:r>
+      <w:r>
+        <w:rPr>
+          <w:color w:val="156082" w:themeColor="accent1"/>
+          <w:sz w:val="26"/>
+          <w:szCs w:val="26"/>
+        </w:rPr>
+        <w:t xml:space="preserve">, ahol a teljes stack fejlesztésre van szükség, és jól integrálódik más </w:t>
+      </w:r>
+      <w:r>
+        <w:rPr>
+          <w:color w:val="156082" w:themeColor="accent1"/>
+          <w:sz w:val="26"/>
+          <w:szCs w:val="26"/>
+        </w:rPr>
+        <w:t>adatbázisokkal</w:t>
+      </w:r>
+      <w:r>
+        <w:rPr>
+          <w:color w:val="156082" w:themeColor="accent1"/>
+          <w:sz w:val="26"/>
+          <w:szCs w:val="26"/>
+        </w:rPr>
+        <w:t xml:space="preserve">, mint </w:t>
+      </w:r>
+      <w:r>
+        <w:rPr>
+          <w:color w:val="156082" w:themeColor="accent1"/>
+          <w:sz w:val="26"/>
+          <w:szCs w:val="26"/>
+        </w:rPr>
+        <w:t xml:space="preserve">pl. </w:t>
+      </w:r>
+      <w:r>
+        <w:rPr>
+          <w:color w:val="156082" w:themeColor="accent1"/>
+          <w:sz w:val="26"/>
+          <w:szCs w:val="26"/>
+        </w:rPr>
+        <w:t>SQL vagy MySQL-</w:t>
+      </w:r>
+      <w:r>
+        <w:rPr>
+          <w:color w:val="156082" w:themeColor="accent1"/>
+          <w:sz w:val="26"/>
+          <w:szCs w:val="26"/>
+        </w:rPr>
+        <w:t>l</w:t>
+      </w:r>
+      <w:r>
+        <w:rPr>
+          <w:color w:val="156082" w:themeColor="accent1"/>
+          <w:sz w:val="26"/>
+          <w:szCs w:val="26"/>
+        </w:rPr>
+        <w:t>el.</w:t>
       </w:r>
     </w:p>
     <w:p>
@@ -4623,13 +5750,13 @@
         </w:rPr>
         <w:lastRenderedPageBreak/>
         <w:drawing>
-          <wp:anchor distT="0" distB="0" distL="114300" distR="114300" simplePos="0" relativeHeight="251668480" behindDoc="1" locked="0" layoutInCell="1" allowOverlap="1" wp14:anchorId="08745E00" wp14:editId="55D584EC">
+          <wp:anchor distT="0" distB="0" distL="114300" distR="114300" simplePos="0" relativeHeight="251668480" behindDoc="1" locked="0" layoutInCell="1" allowOverlap="1" wp14:anchorId="08745E00" wp14:editId="566ACDF6">
             <wp:simplePos x="0" y="0"/>
             <wp:positionH relativeFrom="margin">
               <wp:align>right</wp:align>
             </wp:positionH>
             <wp:positionV relativeFrom="paragraph">
-              <wp:posOffset>7951</wp:posOffset>
+              <wp:posOffset>162</wp:posOffset>
             </wp:positionV>
             <wp:extent cx="3721100" cy="2094230"/>
             <wp:effectExtent l="0" t="0" r="0" b="1270"/>
@@ -4687,15 +5814,6 @@
           </wp:anchor>
         </w:drawing>
       </w:r>
-    </w:p>
-    <w:p>
-      <w:pPr>
-        <w:rPr>
-          <w:color w:val="156082" w:themeColor="accent1"/>
-          <w:sz w:val="26"/>
-          <w:szCs w:val="26"/>
-        </w:rPr>
-      </w:pPr>
       <w:r>
         <w:rPr>
           <w:color w:val="156082" w:themeColor="accent1"/>
@@ -4718,7 +5836,64 @@
           <w:sz w:val="26"/>
           <w:szCs w:val="26"/>
         </w:rPr>
-        <w:t xml:space="preserve"> egy könnyű, nyílt forráskódú szerkesztő, amelyet főleg webfejlesztéshez és kis- vagy közepes méretű projektekhez használnak. A VS Code moduláris kialakítása és a gazdag bővítménykönyvtára lehetővé teszi a gyors </w:t>
+        <w:t> egy könnyű, nyílt forráskódú szerkesztő, am</w:t>
+      </w:r>
+      <w:r>
+        <w:rPr>
+          <w:color w:val="156082" w:themeColor="accent1"/>
+          <w:sz w:val="26"/>
+          <w:szCs w:val="26"/>
+        </w:rPr>
+        <w:t xml:space="preserve">it most elsősorban </w:t>
+      </w:r>
+      <w:r>
+        <w:rPr>
+          <w:color w:val="156082" w:themeColor="accent1"/>
+          <w:sz w:val="26"/>
+          <w:szCs w:val="26"/>
+        </w:rPr>
+        <w:t xml:space="preserve">webfejlesztéshez </w:t>
+      </w:r>
+      <w:r>
+        <w:rPr>
+          <w:color w:val="156082" w:themeColor="accent1"/>
+          <w:sz w:val="26"/>
+          <w:szCs w:val="26"/>
+        </w:rPr>
+        <w:t>h</w:t>
+      </w:r>
+      <w:r>
+        <w:rPr>
+          <w:color w:val="156082" w:themeColor="accent1"/>
+          <w:sz w:val="26"/>
+          <w:szCs w:val="26"/>
+        </w:rPr>
+        <w:t xml:space="preserve">asználtunk, de más közepesen nagy projektekhez is alkalmas. </w:t>
+      </w:r>
+      <w:r>
+        <w:rPr>
+          <w:color w:val="156082" w:themeColor="accent1"/>
+          <w:sz w:val="26"/>
+          <w:szCs w:val="26"/>
+        </w:rPr>
+        <w:t xml:space="preserve"> </w:t>
+      </w:r>
+    </w:p>
+    <w:p>
+      <w:pPr>
+        <w:rPr>
+          <w:color w:val="156082" w:themeColor="accent1"/>
+          <w:sz w:val="26"/>
+          <w:szCs w:val="26"/>
+        </w:rPr>
+      </w:pPr>
+      <w:r>
+        <w:rPr>
+          <w:color w:val="156082" w:themeColor="accent1"/>
+          <w:sz w:val="26"/>
+          <w:szCs w:val="26"/>
+        </w:rPr>
+        <w:t xml:space="preserve">A VS Code moduláris kialakítása és a gazdag bővítménykönyvtára lehetővé teszi a gyors </w:t>
       </w:r>
       <w:r>
         <w:rPr>
@@ -4750,13 +5925,185 @@
           <w:sz w:val="26"/>
           <w:szCs w:val="26"/>
         </w:rPr>
-        <w:t>. Bár kevésbé teljes körű, mint a Visual Studio 2022, a VS Code népszerű választás frontend fejlesztők és agilis csapatok körében, köszönhetően a gyors működésének és az egyszerű használatának. Mindkét eszköz támogatja a webes fejlesztést, de míg a Visual Studio 2022 a nagyvállalati szintű megoldásokhoz nyújt kifinomultabb eszközöket, addig a VS Code a gyors prototípuskészítés és a rugalmas fejlesztés előnyeit kínálja. A választás a projekt méretétől, a technológiai stacktől és a csapat igényeitől függ.</w:t>
-      </w:r>
-    </w:p>
-    <w:p>
-      <w:r>
+        <w:t xml:space="preserve">. Bár kevésbé teljes körű, mint a Visual Studio 2022, a VS Code népszerű választás </w:t>
+      </w:r>
+      <w:r>
+        <w:rPr>
+          <w:color w:val="156082" w:themeColor="accent1"/>
+          <w:sz w:val="26"/>
+          <w:szCs w:val="26"/>
+        </w:rPr>
+        <w:t xml:space="preserve">a </w:t>
+      </w:r>
+      <w:r>
+        <w:rPr>
+          <w:color w:val="156082" w:themeColor="accent1"/>
+          <w:sz w:val="26"/>
+          <w:szCs w:val="26"/>
+        </w:rPr>
+        <w:t xml:space="preserve">fejlesztők körében, köszönhetően a gyors működésének és az egyszerű használatának. Mindkét eszköz támogatja a webes fejlesztést, de </w:t>
+      </w:r>
+      <w:r>
+        <w:rPr>
+          <w:color w:val="156082" w:themeColor="accent1"/>
+          <w:sz w:val="26"/>
+          <w:szCs w:val="26"/>
+        </w:rPr>
+        <w:t>a</w:t>
+      </w:r>
+      <w:r>
+        <w:rPr>
+          <w:color w:val="156082" w:themeColor="accent1"/>
+          <w:sz w:val="26"/>
+          <w:szCs w:val="26"/>
+        </w:rPr>
+        <w:t xml:space="preserve">míg a Visual Studio 2022 a </w:t>
+      </w:r>
+      <w:r>
+        <w:rPr>
+          <w:color w:val="156082" w:themeColor="accent1"/>
+          <w:sz w:val="26"/>
+          <w:szCs w:val="26"/>
+        </w:rPr>
+        <w:t>nehezebb, komplexebb</w:t>
+      </w:r>
+      <w:r>
+        <w:rPr>
+          <w:color w:val="156082" w:themeColor="accent1"/>
+          <w:sz w:val="26"/>
+          <w:szCs w:val="26"/>
+        </w:rPr>
+        <w:t xml:space="preserve"> megoldásokhoz nyújt </w:t>
+      </w:r>
+      <w:r>
+        <w:rPr>
+          <w:color w:val="156082" w:themeColor="accent1"/>
+          <w:sz w:val="26"/>
+          <w:szCs w:val="26"/>
+        </w:rPr>
+        <w:t>megoldást</w:t>
+      </w:r>
+      <w:r>
+        <w:rPr>
+          <w:color w:val="156082" w:themeColor="accent1"/>
+          <w:sz w:val="26"/>
+          <w:szCs w:val="26"/>
+        </w:rPr>
+        <w:t xml:space="preserve">, addig a VS Code a </w:t>
+      </w:r>
+      <w:r>
+        <w:rPr>
+          <w:color w:val="156082" w:themeColor="accent1"/>
+          <w:sz w:val="26"/>
+          <w:szCs w:val="26"/>
+        </w:rPr>
+        <w:t>gyors</w:t>
+      </w:r>
+      <w:r>
+        <w:rPr>
+          <w:color w:val="156082" w:themeColor="accent1"/>
+          <w:sz w:val="26"/>
+          <w:szCs w:val="26"/>
+        </w:rPr>
+        <w:t>aságot</w:t>
+      </w:r>
+      <w:r>
+        <w:rPr>
+          <w:color w:val="156082" w:themeColor="accent1"/>
+          <w:sz w:val="26"/>
+          <w:szCs w:val="26"/>
+        </w:rPr>
+        <w:t xml:space="preserve"> és a rugalmas fejlesztés</w:t>
+      </w:r>
+      <w:r>
+        <w:rPr>
+          <w:color w:val="156082" w:themeColor="accent1"/>
+          <w:sz w:val="26"/>
+          <w:szCs w:val="26"/>
+        </w:rPr>
+        <w:t>t részesíti előnyben</w:t>
+      </w:r>
+      <w:r>
+        <w:rPr>
+          <w:color w:val="156082" w:themeColor="accent1"/>
+          <w:sz w:val="26"/>
+          <w:szCs w:val="26"/>
+        </w:rPr>
+        <w:t xml:space="preserve">. A választás a projekt méretétől, </w:t>
+      </w:r>
+      <w:r>
+        <w:rPr>
+          <w:color w:val="156082" w:themeColor="accent1"/>
+          <w:sz w:val="26"/>
+          <w:szCs w:val="26"/>
+        </w:rPr>
+        <w:t>é</w:t>
+      </w:r>
+      <w:r>
+        <w:rPr>
+          <w:color w:val="156082" w:themeColor="accent1"/>
+          <w:sz w:val="26"/>
+          <w:szCs w:val="26"/>
+        </w:rPr>
+        <w:t>s az elv</w:t>
+      </w:r>
+      <w:r>
+        <w:rPr>
+          <w:color w:val="156082" w:themeColor="accent1"/>
+          <w:sz w:val="26"/>
+          <w:szCs w:val="26"/>
+        </w:rPr>
+        <w:t>á</w:t>
+      </w:r>
+      <w:r>
+        <w:rPr>
+          <w:color w:val="156082" w:themeColor="accent1"/>
+          <w:sz w:val="26"/>
+          <w:szCs w:val="26"/>
+        </w:rPr>
+        <w:t>rt</w:t>
+      </w:r>
+      <w:r>
+        <w:rPr>
+          <w:color w:val="156082" w:themeColor="accent1"/>
+          <w:sz w:val="26"/>
+          <w:szCs w:val="26"/>
+        </w:rPr>
         <w:t xml:space="preserve"> </w:t>
       </w:r>
+      <w:r>
+        <w:rPr>
+          <w:color w:val="156082" w:themeColor="accent1"/>
+          <w:sz w:val="26"/>
+          <w:szCs w:val="26"/>
+        </w:rPr>
+        <w:t>igény</w:t>
+      </w:r>
+      <w:r>
+        <w:rPr>
+          <w:color w:val="156082" w:themeColor="accent1"/>
+          <w:sz w:val="26"/>
+          <w:szCs w:val="26"/>
+        </w:rPr>
+        <w:t>től</w:t>
+      </w:r>
+      <w:r>
+        <w:rPr>
+          <w:color w:val="156082" w:themeColor="accent1"/>
+          <w:sz w:val="26"/>
+          <w:szCs w:val="26"/>
+        </w:rPr>
+        <w:t xml:space="preserve"> függ.</w:t>
+      </w:r>
+    </w:p>
+    <w:p>
+      <w:pPr>
+        <w:rPr>
+          <w:color w:val="156082" w:themeColor="accent1"/>
+          <w:sz w:val="26"/>
+          <w:szCs w:val="26"/>
+        </w:rPr>
+      </w:pPr>
     </w:p>
     <w:p>
       <w:pPr>
@@ -4786,13 +6133,13 @@
           <w:szCs w:val="26"/>
         </w:rPr>
         <w:drawing>
-          <wp:anchor distT="0" distB="0" distL="114300" distR="114300" simplePos="0" relativeHeight="251669504" behindDoc="1" locked="0" layoutInCell="1" allowOverlap="1" wp14:anchorId="6B40B974" wp14:editId="74059333">
+          <wp:anchor distT="0" distB="0" distL="114300" distR="114300" simplePos="0" relativeHeight="251669504" behindDoc="1" locked="0" layoutInCell="1" allowOverlap="1" wp14:anchorId="6B40B974" wp14:editId="55972D4F">
             <wp:simplePos x="0" y="0"/>
             <wp:positionH relativeFrom="margin">
-              <wp:align>center</wp:align>
+              <wp:posOffset>487370</wp:posOffset>
             </wp:positionH>
             <wp:positionV relativeFrom="paragraph">
-              <wp:posOffset>1188251</wp:posOffset>
+              <wp:posOffset>1410305</wp:posOffset>
             </wp:positionV>
             <wp:extent cx="4737100" cy="2313305"/>
             <wp:effectExtent l="0" t="0" r="6350" b="0"/>
@@ -4920,7 +6267,39 @@
           <w:sz w:val="26"/>
           <w:szCs w:val="26"/>
         </w:rPr>
-        <w:t>létrehozását, valamint integrálható más fejlesztői eszközökkel.</w:t>
+        <w:t>létrehozását, valamint integrálható más fejlesztői eszközökkel</w:t>
+      </w:r>
+      <w:r>
+        <w:rPr>
+          <w:color w:val="156082" w:themeColor="accent1"/>
+          <w:sz w:val="26"/>
+          <w:szCs w:val="26"/>
+        </w:rPr>
+        <w:t xml:space="preserve"> (</w:t>
+      </w:r>
+      <w:r>
+        <w:rPr>
+          <w:color w:val="156082" w:themeColor="accent1"/>
+          <w:sz w:val="26"/>
+          <w:szCs w:val="26"/>
+        </w:rPr>
+        <w:t>pl.</w:t>
+      </w:r>
+      <w:r>
+        <w:rPr>
+          <w:color w:val="156082" w:themeColor="accent1"/>
+          <w:sz w:val="26"/>
+          <w:szCs w:val="26"/>
+        </w:rPr>
+        <w:t xml:space="preserve"> Railway)</w:t>
+      </w:r>
+      <w:r>
+        <w:rPr>
+          <w:color w:val="156082" w:themeColor="accent1"/>
+          <w:sz w:val="26"/>
+          <w:szCs w:val="26"/>
+        </w:rPr>
+        <w:t>.</w:t>
       </w:r>
       <w:r>
         <w:rPr>
@@ -4949,7 +6328,7 @@
         </w:rPr>
         <w:lastRenderedPageBreak/>
         <w:drawing>
-          <wp:anchor distT="0" distB="0" distL="114300" distR="114300" simplePos="0" relativeHeight="251670528" behindDoc="0" locked="0" layoutInCell="1" allowOverlap="1" wp14:anchorId="3CF13BC4" wp14:editId="48BA7E70">
+          <wp:anchor distT="0" distB="0" distL="114300" distR="114300" simplePos="0" relativeHeight="251670528" behindDoc="0" locked="0" layoutInCell="1" allowOverlap="1" wp14:anchorId="3CF13BC4" wp14:editId="65DACCF1">
             <wp:simplePos x="0" y="0"/>
             <wp:positionH relativeFrom="margin">
               <wp:posOffset>4332163</wp:posOffset>
@@ -4989,7 +6368,7 @@
                   <pic:spPr bwMode="auto">
                     <a:xfrm>
                       <a:off x="0" y="0"/>
-                      <a:ext cx="1811360" cy="3845422"/>
+                      <a:ext cx="1804946" cy="3831805"/>
                     </a:xfrm>
                     <a:prstGeom prst="rect">
                       <a:avLst/>
@@ -5122,31 +6501,63 @@
           <w:sz w:val="26"/>
           <w:szCs w:val="26"/>
         </w:rPr>
-        <w:t xml:space="preserve"> felülete lehetővé teszi a csapat</w:t>
-      </w:r>
-      <w:r>
-        <w:rPr>
-          <w:color w:val="156082" w:themeColor="accent1"/>
-          <w:sz w:val="26"/>
-          <w:szCs w:val="26"/>
-        </w:rPr>
-        <w:t>tagok</w:t>
-      </w:r>
-      <w:r>
-        <w:rPr>
-          <w:color w:val="156082" w:themeColor="accent1"/>
-          <w:sz w:val="26"/>
-          <w:szCs w:val="26"/>
-        </w:rPr>
-        <w:t xml:space="preserve"> számára, hogy hatékonyan </w:t>
-      </w:r>
-      <w:r>
-        <w:rPr>
-          <w:color w:val="156082" w:themeColor="accent1"/>
-          <w:sz w:val="26"/>
-          <w:szCs w:val="26"/>
-        </w:rPr>
-        <w:t>tudják megtervezni</w:t>
+        <w:t xml:space="preserve"> felülete lehetővé teszi a </w:t>
+      </w:r>
+      <w:r>
+        <w:rPr>
+          <w:color w:val="156082" w:themeColor="accent1"/>
+          <w:sz w:val="26"/>
+          <w:szCs w:val="26"/>
+        </w:rPr>
+        <w:t>könnyű kommunikációt a csapatban</w:t>
+      </w:r>
+      <w:r>
+        <w:rPr>
+          <w:color w:val="156082" w:themeColor="accent1"/>
+          <w:sz w:val="26"/>
+          <w:szCs w:val="26"/>
+        </w:rPr>
+        <w:t xml:space="preserve">, </w:t>
+      </w:r>
+      <w:r>
+        <w:rPr>
+          <w:color w:val="156082" w:themeColor="accent1"/>
+          <w:sz w:val="26"/>
+          <w:szCs w:val="26"/>
+        </w:rPr>
+        <w:t xml:space="preserve">miközben </w:t>
+      </w:r>
+      <w:r>
+        <w:rPr>
+          <w:color w:val="156082" w:themeColor="accent1"/>
+          <w:sz w:val="26"/>
+          <w:szCs w:val="26"/>
+        </w:rPr>
+        <w:t xml:space="preserve">hatékonyan </w:t>
+      </w:r>
+      <w:r>
+        <w:rPr>
+          <w:color w:val="156082" w:themeColor="accent1"/>
+          <w:sz w:val="26"/>
+          <w:szCs w:val="26"/>
+        </w:rPr>
+        <w:t>tudj</w:t>
+      </w:r>
+      <w:r>
+        <w:rPr>
+          <w:color w:val="156082" w:themeColor="accent1"/>
+          <w:sz w:val="26"/>
+          <w:szCs w:val="26"/>
+        </w:rPr>
+        <w:t>uk</w:t>
+      </w:r>
+      <w:r>
+        <w:rPr>
+          <w:color w:val="156082" w:themeColor="accent1"/>
+          <w:sz w:val="26"/>
+          <w:szCs w:val="26"/>
+        </w:rPr>
+        <w:t xml:space="preserve"> megtervezni</w:t>
       </w:r>
       <w:r>
         <w:rPr>
@@ -5187,17 +6598,50 @@
           <w:sz w:val="26"/>
           <w:szCs w:val="26"/>
         </w:rPr>
-        <w:t>Mindkét platform fontos szerepet játszik a modern szoftverfejlesztési folyamatokban, különböző területeken nyújtva támogatást a fejlesztők számára.</w:t>
-      </w:r>
-    </w:p>
-    <w:p>
-      <w:pPr>
-        <w:rPr>
-          <w:color w:val="156082" w:themeColor="accent1"/>
-          <w:sz w:val="26"/>
-          <w:szCs w:val="26"/>
-        </w:rPr>
-      </w:pPr>
+        <w:t>A két platform nélkülözhetetlen a projekt</w:t>
+      </w:r>
+      <w:r>
+        <w:rPr>
+          <w:color w:val="156082" w:themeColor="accent1"/>
+          <w:sz w:val="26"/>
+          <w:szCs w:val="26"/>
+        </w:rPr>
+        <w:t xml:space="preserve"> szempontjából</w:t>
+      </w:r>
+      <w:r>
+        <w:rPr>
+          <w:color w:val="156082" w:themeColor="accent1"/>
+          <w:sz w:val="26"/>
+          <w:szCs w:val="26"/>
+        </w:rPr>
+        <w:t>, nemcsak kommunikáció, hanem egyéb feladatok</w:t>
+      </w:r>
+      <w:r>
+        <w:rPr>
+          <w:color w:val="156082" w:themeColor="accent1"/>
+          <w:sz w:val="26"/>
+          <w:szCs w:val="26"/>
+        </w:rPr>
+        <w:t xml:space="preserve"> miatt</w:t>
+      </w:r>
+      <w:r>
+        <w:rPr>
+          <w:color w:val="156082" w:themeColor="accent1"/>
+          <w:sz w:val="26"/>
+          <w:szCs w:val="26"/>
+        </w:rPr>
+        <w:t xml:space="preserve"> is</w:t>
+      </w:r>
+      <w:r>
+        <w:rPr>
+          <w:i/>
+          <w:iCs/>
+          <w:color w:val="156082" w:themeColor="accent1"/>
+          <w:sz w:val="26"/>
+          <w:szCs w:val="26"/>
+        </w:rPr>
+        <w:t>.</w:t>
+      </w:r>
     </w:p>
     <w:p>
       <w:pPr>
@@ -5452,7 +6896,25 @@
           <w:sz w:val="26"/>
           <w:szCs w:val="26"/>
         </w:rPr>
-        <w:t xml:space="preserve"> A felhasználók által elmentett tervek (bútor koordinációk, nagyítás, kicsinyítés adatok, mikor készült és hogy melyik </w:t>
+        <w:t xml:space="preserve"> A felhasználók által elmentett tervek (bútor koordinációk, </w:t>
+      </w:r>
+      <w:r>
+        <w:rPr>
+          <w:rFonts w:cs="Times New Roman"/>
+          <w:color w:val="156082" w:themeColor="accent1"/>
+          <w:sz w:val="26"/>
+          <w:szCs w:val="26"/>
+        </w:rPr>
+        <w:t xml:space="preserve">méretezési </w:t>
+      </w:r>
+      <w:r>
+        <w:rPr>
+          <w:rFonts w:cs="Times New Roman"/>
+          <w:color w:val="156082" w:themeColor="accent1"/>
+          <w:sz w:val="26"/>
+          <w:szCs w:val="26"/>
+        </w:rPr>
+        <w:t xml:space="preserve">adatok, mikor készült és hogy melyik </w:t>
       </w:r>
       <w:r>
         <w:rPr>
@@ -5548,7 +7010,7 @@
           <w:sz w:val="26"/>
           <w:szCs w:val="26"/>
         </w:rPr>
-        <w:t xml:space="preserve"> nevei, weboldaluk, telefonszámuk és email címük.</w:t>
+        <w:t xml:space="preserve"> nevei, weboldaluk, telefonszám és email címük.</w:t>
       </w:r>
     </w:p>
     <w:p>
@@ -5581,7 +7043,6 @@
           <w:sz w:val="26"/>
           <w:szCs w:val="26"/>
         </w:rPr>
-        <w:lastRenderedPageBreak/>
         <w:t>Producttype</w:t>
       </w:r>
       <w:r>
@@ -5627,7 +7088,25 @@
           <w:sz w:val="26"/>
           <w:szCs w:val="26"/>
         </w:rPr>
-        <w:t xml:space="preserve"> vegyük példának asztal, szék, </w:t>
+        <w:t xml:space="preserve"> </w:t>
+      </w:r>
+      <w:r>
+        <w:rPr>
+          <w:rFonts w:cs="Times New Roman"/>
+          <w:color w:val="156082" w:themeColor="accent1"/>
+          <w:sz w:val="26"/>
+          <w:szCs w:val="26"/>
+        </w:rPr>
+        <w:t>pl.</w:t>
+      </w:r>
+      <w:r>
+        <w:rPr>
+          <w:rFonts w:cs="Times New Roman"/>
+          <w:color w:val="156082" w:themeColor="accent1"/>
+          <w:sz w:val="26"/>
+          <w:szCs w:val="26"/>
+        </w:rPr>
+        <w:t xml:space="preserve"> asztal, szék, </w:t>
       </w:r>
       <w:r>
         <w:rPr>
@@ -5645,7 +7124,34 @@
           <w:sz w:val="26"/>
           <w:szCs w:val="26"/>
         </w:rPr>
-        <w:t>, az adatokon kívül tartalmazza még hogy melyik szobához tartoznak.</w:t>
+        <w:t xml:space="preserve">, az adatokon kívül </w:t>
+      </w:r>
+      <w:r>
+        <w:rPr>
+          <w:rFonts w:cs="Times New Roman"/>
+          <w:color w:val="156082" w:themeColor="accent1"/>
+          <w:sz w:val="26"/>
+          <w:szCs w:val="26"/>
+        </w:rPr>
+        <w:t>tartalmazza,</w:t>
+      </w:r>
+      <w:r>
+        <w:rPr>
+          <w:rFonts w:cs="Times New Roman"/>
+          <w:color w:val="156082" w:themeColor="accent1"/>
+          <w:sz w:val="26"/>
+          <w:szCs w:val="26"/>
+        </w:rPr>
+        <w:t xml:space="preserve"> </w:t>
+      </w:r>
+      <w:r>
+        <w:rPr>
+          <w:rFonts w:cs="Times New Roman"/>
+          <w:color w:val="156082" w:themeColor="accent1"/>
+          <w:sz w:val="26"/>
+          <w:szCs w:val="26"/>
+        </w:rPr>
+        <w:t>hogy melyik szobához tartoznak.</w:t>
       </w:r>
     </w:p>
     <w:p>
@@ -5696,6 +7202,33 @@
           <w:sz w:val="26"/>
           <w:szCs w:val="26"/>
         </w:rPr>
+        <w:t>UR</w:t>
+      </w:r>
+      <w:r>
+        <w:rPr>
+          <w:rFonts w:cs="Times New Roman"/>
+          <w:color w:val="156082" w:themeColor="accent1"/>
+          <w:sz w:val="26"/>
+          <w:szCs w:val="26"/>
+        </w:rPr>
+        <w:t>L</w:t>
+      </w:r>
+      <w:r>
+        <w:rPr>
+          <w:rFonts w:cs="Times New Roman"/>
+          <w:color w:val="156082" w:themeColor="accent1"/>
+          <w:sz w:val="26"/>
+          <w:szCs w:val="26"/>
+        </w:rPr>
+        <w:t xml:space="preserve">, áruk és a bútorok képeinek </w:t>
+      </w:r>
+      <w:r>
+        <w:rPr>
+          <w:rFonts w:cs="Times New Roman"/>
+          <w:color w:val="156082" w:themeColor="accent1"/>
+          <w:sz w:val="26"/>
+          <w:szCs w:val="26"/>
+        </w:rPr>
         <w:t>URL</w:t>
       </w:r>
       <w:r>
@@ -5705,7 +7238,7 @@
           <w:sz w:val="26"/>
           <w:szCs w:val="26"/>
         </w:rPr>
-        <w:t xml:space="preserve">, áruk és a bútorok képeinek url-je a megfelelő </w:t>
+        <w:t xml:space="preserve">-je a megfelelő </w:t>
       </w:r>
       <w:r>
         <w:rPr>
@@ -5843,7 +7376,34 @@
           <w:sz w:val="26"/>
           <w:szCs w:val="26"/>
         </w:rPr>
-        <w:t xml:space="preserve"> Különböző szobák.</w:t>
+        <w:t xml:space="preserve"> Különböző szobák</w:t>
+      </w:r>
+      <w:r>
+        <w:rPr>
+          <w:rFonts w:cs="Times New Roman"/>
+          <w:color w:val="156082" w:themeColor="accent1"/>
+          <w:sz w:val="26"/>
+          <w:szCs w:val="26"/>
+        </w:rPr>
+        <w:t xml:space="preserve"> pl</w:t>
+      </w:r>
+      <w:r>
+        <w:rPr>
+          <w:rFonts w:cs="Times New Roman"/>
+          <w:color w:val="156082" w:themeColor="accent1"/>
+          <w:sz w:val="26"/>
+          <w:szCs w:val="26"/>
+        </w:rPr>
+        <w:t>.</w:t>
+      </w:r>
+      <w:r>
+        <w:rPr>
+          <w:rFonts w:cs="Times New Roman"/>
+          <w:color w:val="156082" w:themeColor="accent1"/>
+          <w:sz w:val="26"/>
+          <w:szCs w:val="26"/>
+        </w:rPr>
+        <w:t xml:space="preserve"> nappali, hálószoba.</w:t>
       </w:r>
     </w:p>
     <w:p>
@@ -5894,16 +7454,52 @@
           <w:sz w:val="26"/>
           <w:szCs w:val="26"/>
         </w:rPr>
-        <w:t>felhasználok</w:t>
-      </w:r>
-      <w:r>
-        <w:rPr>
-          <w:rFonts w:cs="Times New Roman"/>
-          <w:color w:val="156082" w:themeColor="accent1"/>
-          <w:sz w:val="26"/>
-          <w:szCs w:val="26"/>
-        </w:rPr>
-        <w:t xml:space="preserve"> által szerzett mérföldköveket </w:t>
+        <w:t>fe</w:t>
+      </w:r>
+      <w:r>
+        <w:rPr>
+          <w:rFonts w:cs="Times New Roman"/>
+          <w:color w:val="156082" w:themeColor="accent1"/>
+          <w:sz w:val="26"/>
+          <w:szCs w:val="26"/>
+        </w:rPr>
+        <w:t>lhasznál</w:t>
+      </w:r>
+      <w:r>
+        <w:rPr>
+          <w:rFonts w:cs="Times New Roman"/>
+          <w:color w:val="156082" w:themeColor="accent1"/>
+          <w:sz w:val="26"/>
+          <w:szCs w:val="26"/>
+        </w:rPr>
+        <w:t>ó</w:t>
+      </w:r>
+      <w:r>
+        <w:rPr>
+          <w:rFonts w:cs="Times New Roman"/>
+          <w:color w:val="156082" w:themeColor="accent1"/>
+          <w:sz w:val="26"/>
+          <w:szCs w:val="26"/>
+        </w:rPr>
+        <w:t>k</w:t>
+      </w:r>
+      <w:r>
+        <w:rPr>
+          <w:rFonts w:cs="Times New Roman"/>
+          <w:color w:val="156082" w:themeColor="accent1"/>
+          <w:sz w:val="26"/>
+          <w:szCs w:val="26"/>
+        </w:rPr>
+        <w:t xml:space="preserve"> </w:t>
+      </w:r>
+      <w:r>
+        <w:rPr>
+          <w:rFonts w:cs="Times New Roman"/>
+          <w:color w:val="156082" w:themeColor="accent1"/>
+          <w:sz w:val="26"/>
+          <w:szCs w:val="26"/>
+        </w:rPr>
+        <w:t xml:space="preserve">által szerzett mérföldköveket </w:t>
       </w:r>
       <w:r>
         <w:rPr>
@@ -5921,16 +7517,25 @@
           <w:sz w:val="26"/>
           <w:szCs w:val="26"/>
         </w:rPr>
-        <w:t xml:space="preserve"> amiben szerepel egy </w:t>
-      </w:r>
-      <w:r>
-        <w:rPr>
-          <w:rFonts w:cs="Times New Roman"/>
-          <w:color w:val="156082" w:themeColor="accent1"/>
-          <w:sz w:val="26"/>
-          <w:szCs w:val="26"/>
-        </w:rPr>
-        <w:t>cím,</w:t>
+        <w:t xml:space="preserve"> amiben szerepel </w:t>
+      </w:r>
+      <w:r>
+        <w:rPr>
+          <w:rFonts w:cs="Times New Roman"/>
+          <w:color w:val="156082" w:themeColor="accent1"/>
+          <w:sz w:val="26"/>
+          <w:szCs w:val="26"/>
+        </w:rPr>
+        <w:t>a mérföldkő neve</w:t>
+      </w:r>
+      <w:r>
+        <w:rPr>
+          <w:rFonts w:cs="Times New Roman"/>
+          <w:color w:val="156082" w:themeColor="accent1"/>
+          <w:sz w:val="26"/>
+          <w:szCs w:val="26"/>
+        </w:rPr>
+        <w:t>,</w:t>
       </w:r>
       <w:r>
         <w:rPr>
@@ -5993,7 +7598,7 @@
           <w:sz w:val="26"/>
           <w:szCs w:val="26"/>
         </w:rPr>
-        <w:t xml:space="preserve"> hogy mikor és hogy pontosan ki kapta meg.</w:t>
+        <w:t xml:space="preserve"> hogy mikor és pontosan ki kapta meg.</w:t>
       </w:r>
     </w:p>
     <w:p>
@@ -6206,7 +7811,39 @@
           <w:sz w:val="26"/>
           <w:szCs w:val="26"/>
         </w:rPr>
-        <w:t>z achievementek (Teljesítmények) virtuális jutalmak, kitüntetések amit a felhasználó szerezhet meg különböző célok, teljesítmények elérése után (</w:t>
+        <w:t xml:space="preserve">z achievementek (Teljesítmények) virtuális jutalmak, </w:t>
+      </w:r>
+      <w:r>
+        <w:rPr>
+          <w:color w:val="156082" w:themeColor="accent1"/>
+          <w:sz w:val="26"/>
+          <w:szCs w:val="26"/>
+        </w:rPr>
+        <w:t>kitüntetések,</w:t>
+      </w:r>
+      <w:r>
+        <w:rPr>
+          <w:color w:val="156082" w:themeColor="accent1"/>
+          <w:sz w:val="26"/>
+          <w:szCs w:val="26"/>
+        </w:rPr>
+        <w:t xml:space="preserve"> amit a felhasználó különböző</w:t>
+      </w:r>
+      <w:r>
+        <w:rPr>
+          <w:color w:val="156082" w:themeColor="accent1"/>
+          <w:sz w:val="26"/>
+          <w:szCs w:val="26"/>
+        </w:rPr>
+        <w:t xml:space="preserve"> célok, teljesítmények után szerezhet meg</w:t>
+      </w:r>
+      <w:r>
+        <w:rPr>
+          <w:color w:val="156082" w:themeColor="accent1"/>
+          <w:sz w:val="26"/>
+          <w:szCs w:val="26"/>
+        </w:rPr>
+        <w:t xml:space="preserve"> (</w:t>
       </w:r>
       <w:r>
         <w:rPr>
@@ -6374,7 +8011,6 @@
           <w:sz w:val="26"/>
           <w:szCs w:val="26"/>
         </w:rPr>
-        <w:lastRenderedPageBreak/>
         <w:t>„</w:t>
       </w:r>
       <w:r>
@@ -6458,16 +8094,110 @@
       </w:pPr>
       <w:r>
         <w:rPr>
+          <w:rFonts w:cs="Times New Roman"/>
+          <w:color w:val="156082" w:themeColor="accent1"/>
+          <w:sz w:val="26"/>
+          <w:szCs w:val="26"/>
+        </w:rPr>
+        <w:lastRenderedPageBreak/>
+        <w:t>„</w:t>
+      </w:r>
+      <w:r>
+        <w:rPr>
+          <w:rFonts w:cs="Times New Roman"/>
+          <w:color w:val="156082" w:themeColor="accent1"/>
+          <w:sz w:val="26"/>
+          <w:szCs w:val="26"/>
+        </w:rPr>
+        <w:t>delete</w:t>
+      </w:r>
+      <w:r>
+        <w:rPr>
+          <w:rFonts w:cs="Times New Roman"/>
+          <w:color w:val="156082" w:themeColor="accent1"/>
+          <w:sz w:val="26"/>
+          <w:szCs w:val="26"/>
+        </w:rPr>
+        <w:t xml:space="preserve"> </w:t>
+      </w:r>
+      <w:r>
+        <w:rPr>
+          <w:rFonts w:cs="Times New Roman"/>
+          <w:color w:val="156082" w:themeColor="accent1"/>
+          <w:sz w:val="26"/>
+          <w:szCs w:val="26"/>
+        </w:rPr>
+        <w:t>id” Törli</w:t>
+      </w:r>
+      <w:r>
+        <w:rPr>
+          <w:rFonts w:cs="Times New Roman"/>
+          <w:color w:val="156082" w:themeColor="accent1"/>
+          <w:sz w:val="26"/>
+          <w:szCs w:val="26"/>
+        </w:rPr>
+        <w:t xml:space="preserve"> az elért achievementeket azonosító </w:t>
+      </w:r>
+      <w:r>
+        <w:rPr>
+          <w:rFonts w:cs="Times New Roman"/>
+          <w:color w:val="156082" w:themeColor="accent1"/>
+          <w:sz w:val="26"/>
+          <w:szCs w:val="26"/>
+        </w:rPr>
+        <w:t>alapján. (</w:t>
+      </w:r>
+      <w:r>
+        <w:rPr>
+          <w:rFonts w:cs="Times New Roman"/>
+          <w:color w:val="156082" w:themeColor="accent1"/>
+          <w:sz w:val="26"/>
+          <w:szCs w:val="26"/>
+        </w:rPr>
+        <w:t xml:space="preserve">Admin </w:t>
+      </w:r>
+      <w:r>
+        <w:rPr>
+          <w:rFonts w:cs="Times New Roman"/>
+          <w:color w:val="156082" w:themeColor="accent1"/>
+          <w:sz w:val="26"/>
+          <w:szCs w:val="26"/>
+        </w:rPr>
+        <w:t>jogosultság</w:t>
+      </w:r>
+      <w:r>
+        <w:rPr>
+          <w:rFonts w:cs="Times New Roman"/>
+          <w:color w:val="156082" w:themeColor="accent1"/>
+          <w:sz w:val="26"/>
+          <w:szCs w:val="26"/>
+        </w:rPr>
+        <w:t>)</w:t>
+      </w:r>
+    </w:p>
+    <w:p>
+      <w:pPr>
+        <w:pStyle w:val="Listaszerbekezds"/>
+        <w:spacing w:before="60" w:after="60"/>
+        <w:rPr>
+          <w:rFonts w:cs="Times New Roman"/>
+          <w:color w:val="156082" w:themeColor="accent1"/>
+          <w:sz w:val="26"/>
+          <w:szCs w:val="26"/>
+        </w:rPr>
+      </w:pPr>
+      <w:r>
+        <w:rPr>
           <w:noProof/>
         </w:rPr>
         <w:drawing>
-          <wp:anchor distT="0" distB="0" distL="114300" distR="114300" simplePos="0" relativeHeight="251665408" behindDoc="0" locked="0" layoutInCell="1" allowOverlap="1" wp14:anchorId="40F29F69" wp14:editId="089E5C93">
+          <wp:anchor distT="0" distB="0" distL="114300" distR="114300" simplePos="0" relativeHeight="251665408" behindDoc="1" locked="0" layoutInCell="1" allowOverlap="1" wp14:anchorId="40F29F69" wp14:editId="6F88C645">
             <wp:simplePos x="0" y="0"/>
             <wp:positionH relativeFrom="margin">
-              <wp:posOffset>-359410</wp:posOffset>
+              <wp:posOffset>-379730</wp:posOffset>
             </wp:positionH>
             <wp:positionV relativeFrom="paragraph">
-              <wp:posOffset>494030</wp:posOffset>
+              <wp:posOffset>196555</wp:posOffset>
             </wp:positionV>
             <wp:extent cx="6748145" cy="1638300"/>
             <wp:effectExtent l="0" t="0" r="0" b="0"/>
@@ -6523,109 +8253,6 @@
           </wp:anchor>
         </w:drawing>
       </w:r>
-      <w:r>
-        <w:rPr>
-          <w:rFonts w:cs="Times New Roman"/>
-          <w:color w:val="156082" w:themeColor="accent1"/>
-          <w:sz w:val="26"/>
-          <w:szCs w:val="26"/>
-        </w:rPr>
-        <w:t>„</w:t>
-      </w:r>
-      <w:r>
-        <w:rPr>
-          <w:rFonts w:cs="Times New Roman"/>
-          <w:color w:val="156082" w:themeColor="accent1"/>
-          <w:sz w:val="26"/>
-          <w:szCs w:val="26"/>
-        </w:rPr>
-        <w:t>delete</w:t>
-      </w:r>
-      <w:r>
-        <w:rPr>
-          <w:rFonts w:cs="Times New Roman"/>
-          <w:color w:val="156082" w:themeColor="accent1"/>
-          <w:sz w:val="26"/>
-          <w:szCs w:val="26"/>
-        </w:rPr>
-        <w:t xml:space="preserve"> </w:t>
-      </w:r>
-      <w:r>
-        <w:rPr>
-          <w:rFonts w:cs="Times New Roman"/>
-          <w:color w:val="156082" w:themeColor="accent1"/>
-          <w:sz w:val="26"/>
-          <w:szCs w:val="26"/>
-        </w:rPr>
-        <w:t>id” Törli</w:t>
-      </w:r>
-      <w:r>
-        <w:rPr>
-          <w:rFonts w:cs="Times New Roman"/>
-          <w:color w:val="156082" w:themeColor="accent1"/>
-          <w:sz w:val="26"/>
-          <w:szCs w:val="26"/>
-        </w:rPr>
-        <w:t xml:space="preserve"> az elért achievementeket azonosító </w:t>
-      </w:r>
-      <w:r>
-        <w:rPr>
-          <w:rFonts w:cs="Times New Roman"/>
-          <w:color w:val="156082" w:themeColor="accent1"/>
-          <w:sz w:val="26"/>
-          <w:szCs w:val="26"/>
-        </w:rPr>
-        <w:t>alapján. (</w:t>
-      </w:r>
-      <w:r>
-        <w:rPr>
-          <w:rFonts w:cs="Times New Roman"/>
-          <w:color w:val="156082" w:themeColor="accent1"/>
-          <w:sz w:val="26"/>
-          <w:szCs w:val="26"/>
-        </w:rPr>
-        <w:t xml:space="preserve">Admin </w:t>
-      </w:r>
-      <w:r>
-        <w:rPr>
-          <w:rFonts w:cs="Times New Roman"/>
-          <w:color w:val="156082" w:themeColor="accent1"/>
-          <w:sz w:val="26"/>
-          <w:szCs w:val="26"/>
-        </w:rPr>
-        <w:t>jogosultság</w:t>
-      </w:r>
-      <w:r>
-        <w:rPr>
-          <w:rFonts w:cs="Times New Roman"/>
-          <w:color w:val="156082" w:themeColor="accent1"/>
-          <w:sz w:val="26"/>
-          <w:szCs w:val="26"/>
-        </w:rPr>
-        <w:t>)</w:t>
-      </w:r>
-    </w:p>
-    <w:p>
-      <w:pPr>
-        <w:spacing w:before="60" w:after="60"/>
-        <w:rPr>
-          <w:rFonts w:cs="Times New Roman"/>
-          <w:color w:val="156082" w:themeColor="accent1"/>
-          <w:sz w:val="26"/>
-          <w:szCs w:val="26"/>
-        </w:rPr>
-      </w:pPr>
-    </w:p>
-    <w:p>
-      <w:pPr>
-        <w:spacing w:before="60" w:after="60"/>
-        <w:rPr>
-          <w:rFonts w:cs="Times New Roman"/>
-          <w:color w:val="156082" w:themeColor="accent1"/>
-          <w:sz w:val="26"/>
-          <w:szCs w:val="26"/>
-        </w:rPr>
-      </w:pPr>
     </w:p>
     <w:p>
       <w:pPr>
@@ -7372,7 +8999,6 @@
           <w:sz w:val="26"/>
           <w:szCs w:val="26"/>
         </w:rPr>
-        <w:lastRenderedPageBreak/>
         <w:t>„get id” Lekéri az adatokat azonosító alapján (Admin)</w:t>
       </w:r>
     </w:p>
@@ -7484,6 +9110,7 @@
           <w:sz w:val="26"/>
           <w:szCs w:val="26"/>
         </w:rPr>
+        <w:lastRenderedPageBreak/>
         <w:t>„</w:t>
       </w:r>
       <w:r>
@@ -8437,7 +10064,6 @@
           <w:sz w:val="26"/>
           <w:szCs w:val="26"/>
         </w:rPr>
-        <w:lastRenderedPageBreak/>
         <w:t>„</w:t>
       </w:r>
       <w:r>
@@ -8568,6 +10194,7 @@
           <w:sz w:val="26"/>
           <w:szCs w:val="26"/>
         </w:rPr>
+        <w:lastRenderedPageBreak/>
         <w:t>„</w:t>
       </w:r>
       <w:r>
@@ -9083,7 +10710,6 @@
         <w:pStyle w:val="Cmsor2"/>
       </w:pPr>
       <w:r>
-        <w:lastRenderedPageBreak/>
         <w:t>Tervek</w:t>
       </w:r>
     </w:p>
@@ -9228,6 +10854,7 @@
           <w:sz w:val="26"/>
           <w:szCs w:val="26"/>
         </w:rPr>
+        <w:lastRenderedPageBreak/>
         <w:t>„</w:t>
       </w:r>
       <w:r>
@@ -10120,17 +11747,7 @@
           <w:sz w:val="26"/>
           <w:szCs w:val="26"/>
         </w:rPr>
-        <w:t xml:space="preserve"> </w:t>
-      </w:r>
-      <w:r>
-        <w:rPr>
-          <w:rFonts w:cs="Times New Roman"/>
-          <w:color w:val="156082" w:themeColor="accent1"/>
-          <w:sz w:val="26"/>
-          <w:szCs w:val="26"/>
-        </w:rPr>
-        <w:lastRenderedPageBreak/>
-        <w:t>alkalmaz</w:t>
+        <w:t xml:space="preserve"> alkalmaz</w:t>
       </w:r>
       <w:r>
         <w:rPr>
@@ -10227,6 +11844,7 @@
           <w:sz w:val="26"/>
           <w:szCs w:val="26"/>
         </w:rPr>
+        <w:lastRenderedPageBreak/>
         <w:t>„</w:t>
       </w:r>
       <w:r>
@@ -11187,50 +12805,26 @@
     </w:p>
     <w:p>
       <w:pPr>
+        <w:pStyle w:val="Cmsor1"/>
+      </w:pPr>
+    </w:p>
+    <w:p/>
+    <w:p>
+      <w:pPr>
+        <w:pStyle w:val="Cmsor1"/>
+        <w:jc w:val="center"/>
+      </w:pPr>
+      <w:r>
+        <w:t>Felhasználói dokumentáció</w:t>
+      </w:r>
+    </w:p>
+    <w:p>
+      <w:pPr>
         <w:pStyle w:val="NormlWeb"/>
         <w:spacing w:before="60" w:beforeAutospacing="0" w:after="60" w:afterAutospacing="0"/>
         <w:rPr>
           <w:rFonts w:asciiTheme="minorHAnsi" w:hAnsiTheme="minorHAnsi"/>
           <w:color w:val="156082" w:themeColor="accent1"/>
-          <w:sz w:val="22"/>
-          <w:szCs w:val="22"/>
-        </w:rPr>
-      </w:pPr>
-    </w:p>
-    <w:p>
-      <w:pPr>
-        <w:pStyle w:val="NormlWeb"/>
-        <w:spacing w:before="60" w:beforeAutospacing="0" w:after="60" w:afterAutospacing="0"/>
-        <w:rPr>
-          <w:rFonts w:asciiTheme="minorHAnsi" w:hAnsiTheme="minorHAnsi"/>
-          <w:color w:val="156082" w:themeColor="accent1"/>
-          <w:sz w:val="22"/>
-          <w:szCs w:val="22"/>
-        </w:rPr>
-      </w:pPr>
-    </w:p>
-    <w:p>
-      <w:pPr>
-        <w:pStyle w:val="Cmsor1"/>
-        <w:jc w:val="center"/>
-      </w:pPr>
-    </w:p>
-    <w:p>
-      <w:pPr>
-        <w:pStyle w:val="Cmsor1"/>
-        <w:jc w:val="center"/>
-      </w:pPr>
-      <w:r>
-        <w:t>Felhasználói dokumentáció</w:t>
-      </w:r>
-    </w:p>
-    <w:p>
-      <w:pPr>
-        <w:pStyle w:val="NormlWeb"/>
-        <w:spacing w:before="60" w:beforeAutospacing="0" w:after="60" w:afterAutospacing="0"/>
-        <w:rPr>
-          <w:rFonts w:asciiTheme="minorHAnsi" w:hAnsiTheme="minorHAnsi"/>
-          <w:color w:val="156082" w:themeColor="accent1"/>
           <w:sz w:val="26"/>
           <w:szCs w:val="26"/>
         </w:rPr>
@@ -11241,6 +12835,7 @@
         <w:pStyle w:val="Cmsor2"/>
       </w:pPr>
       <w:r>
+        <w:lastRenderedPageBreak/>
         <w:t>Bejelentkezés és Regisztráció</w:t>
       </w:r>
     </w:p>
@@ -11700,7 +13295,7 @@
           <w:szCs w:val="22"/>
         </w:rPr>
         <w:drawing>
-          <wp:inline distT="0" distB="0" distL="0" distR="0" wp14:anchorId="236CFAA3" wp14:editId="337F9D2D">
+          <wp:inline distT="0" distB="0" distL="0" distR="0" wp14:anchorId="236CFAA3" wp14:editId="518BCFCB">
             <wp:extent cx="5756910" cy="3057525"/>
             <wp:effectExtent l="0" t="0" r="0" b="9525"/>
             <wp:docPr id="133685835" name="Kép 8"/>
@@ -11858,7 +13453,7 @@
         </w:rPr>
         <w:lastRenderedPageBreak/>
         <w:drawing>
-          <wp:inline distT="0" distB="0" distL="0" distR="0" wp14:anchorId="095C9FAE" wp14:editId="2968C5F9">
+          <wp:inline distT="0" distB="0" distL="0" distR="0" wp14:anchorId="095C9FAE" wp14:editId="5663E66D">
             <wp:extent cx="5828647" cy="3087015"/>
             <wp:effectExtent l="0" t="0" r="1270" b="0"/>
             <wp:docPr id="1755137554" name="Kép 7"/>
@@ -19662,7 +21257,6 @@
   <w:style w:type="character" w:default="1" w:styleId="Bekezdsalapbettpusa">
     <w:name w:val="Default Paragraph Font"/>
     <w:uiPriority w:val="1"/>
-    <w:semiHidden/>
     <w:unhideWhenUsed/>
   </w:style>
   <w:style w:type="table" w:default="1" w:styleId="Normltblzat">

</xml_diff>